<commit_message>
[Add] documentation -> code structure, process method
</commit_message>
<xml_diff>
--- a/documentation.docx
+++ b/documentation.docx
@@ -182,7 +182,7 @@
             </w:rPr>
             <w:fldChar w:fldCharType="separate"/>
           </w:r>
-          <w:hyperlink w:anchor="_Toc229664402" w:history="1">
+          <w:hyperlink w:anchor="_Toc229666680" w:history="1">
             <w:r>
               <w:rPr>
                 <w:rStyle w:val="Hiperhivatkozs"/>
@@ -229,7 +229,7 @@
                 <w:noProof/>
                 <w:webHidden/>
               </w:rPr>
-              <w:instrText xml:space="preserve"> PAGEREF _Toc229664402 \h </w:instrText>
+              <w:instrText xml:space="preserve"> PAGEREF _Toc229666680 \h </w:instrText>
             </w:r>
             <w:r>
               <w:rPr>
@@ -278,7 +278,7 @@
               <w:lang w:eastAsia="hu-HU"/>
             </w:rPr>
           </w:pPr>
-          <w:hyperlink w:anchor="_Toc229664403" w:history="1">
+          <w:hyperlink w:anchor="_Toc229666681" w:history="1">
             <w:r>
               <w:rPr>
                 <w:rStyle w:val="Hiperhivatkozs"/>
@@ -325,7 +325,7 @@
                 <w:noProof/>
                 <w:webHidden/>
               </w:rPr>
-              <w:instrText xml:space="preserve"> PAGEREF _Toc229664403 \h </w:instrText>
+              <w:instrText xml:space="preserve"> PAGEREF _Toc229666681 \h </w:instrText>
             </w:r>
             <w:r>
               <w:rPr>
@@ -374,7 +374,7 @@
               <w:lang w:eastAsia="hu-HU"/>
             </w:rPr>
           </w:pPr>
-          <w:hyperlink w:anchor="_Toc229664404" w:history="1">
+          <w:hyperlink w:anchor="_Toc229666682" w:history="1">
             <w:r>
               <w:rPr>
                 <w:rStyle w:val="Hiperhivatkozs"/>
@@ -421,7 +421,7 @@
                 <w:noProof/>
                 <w:webHidden/>
               </w:rPr>
-              <w:instrText xml:space="preserve"> PAGEREF _Toc229664404 \h </w:instrText>
+              <w:instrText xml:space="preserve"> PAGEREF _Toc229666682 \h </w:instrText>
             </w:r>
             <w:r>
               <w:rPr>
@@ -468,7 +468,7 @@
               <w:lang w:eastAsia="hu-HU"/>
             </w:rPr>
           </w:pPr>
-          <w:hyperlink w:anchor="_Toc229664405" w:history="1">
+          <w:hyperlink w:anchor="_Toc229666683" w:history="1">
             <w:r>
               <w:rPr>
                 <w:rStyle w:val="Hiperhivatkozs"/>
@@ -513,7 +513,7 @@
                 <w:noProof/>
                 <w:webHidden/>
               </w:rPr>
-              <w:instrText xml:space="preserve"> PAGEREF _Toc229664405 \h </w:instrText>
+              <w:instrText xml:space="preserve"> PAGEREF _Toc229666683 \h </w:instrText>
             </w:r>
             <w:r>
               <w:rPr>
@@ -560,7 +560,7 @@
               <w:lang w:eastAsia="hu-HU"/>
             </w:rPr>
           </w:pPr>
-          <w:hyperlink w:anchor="_Toc229664406" w:history="1">
+          <w:hyperlink w:anchor="_Toc229666684" w:history="1">
             <w:r>
               <w:rPr>
                 <w:rStyle w:val="Hiperhivatkozs"/>
@@ -605,7 +605,7 @@
                 <w:noProof/>
                 <w:webHidden/>
               </w:rPr>
-              <w:instrText xml:space="preserve"> PAGEREF _Toc229664406 \h </w:instrText>
+              <w:instrText xml:space="preserve"> PAGEREF _Toc229666684 \h </w:instrText>
             </w:r>
             <w:r>
               <w:rPr>
@@ -652,7 +652,7 @@
               <w:lang w:eastAsia="hu-HU"/>
             </w:rPr>
           </w:pPr>
-          <w:hyperlink w:anchor="_Toc229664407" w:history="1">
+          <w:hyperlink w:anchor="_Toc229666685" w:history="1">
             <w:r>
               <w:rPr>
                 <w:rStyle w:val="Hiperhivatkozs"/>
@@ -697,7 +697,7 @@
                 <w:noProof/>
                 <w:webHidden/>
               </w:rPr>
-              <w:instrText xml:space="preserve"> PAGEREF _Toc229664407 \h </w:instrText>
+              <w:instrText xml:space="preserve"> PAGEREF _Toc229666685 \h </w:instrText>
             </w:r>
             <w:r>
               <w:rPr>
@@ -744,7 +744,7 @@
               <w:lang w:eastAsia="hu-HU"/>
             </w:rPr>
           </w:pPr>
-          <w:hyperlink w:anchor="_Toc229664408" w:history="1">
+          <w:hyperlink w:anchor="_Toc229666686" w:history="1">
             <w:r>
               <w:rPr>
                 <w:rStyle w:val="Hiperhivatkozs"/>
@@ -789,7 +789,7 @@
                 <w:noProof/>
                 <w:webHidden/>
               </w:rPr>
-              <w:instrText xml:space="preserve"> PAGEREF _Toc229664408 \h </w:instrText>
+              <w:instrText xml:space="preserve"> PAGEREF _Toc229666686 \h </w:instrText>
             </w:r>
             <w:r>
               <w:rPr>
@@ -836,7 +836,7 @@
               <w:lang w:eastAsia="hu-HU"/>
             </w:rPr>
           </w:pPr>
-          <w:hyperlink w:anchor="_Toc229664409" w:history="1">
+          <w:hyperlink w:anchor="_Toc229666687" w:history="1">
             <w:r>
               <w:rPr>
                 <w:rStyle w:val="Hiperhivatkozs"/>
@@ -881,7 +881,7 @@
                 <w:noProof/>
                 <w:webHidden/>
               </w:rPr>
-              <w:instrText xml:space="preserve"> PAGEREF _Toc229664409 \h </w:instrText>
+              <w:instrText xml:space="preserve"> PAGEREF _Toc229666687 \h </w:instrText>
             </w:r>
             <w:r>
               <w:rPr>
@@ -928,7 +928,7 @@
               <w:lang w:eastAsia="hu-HU"/>
             </w:rPr>
           </w:pPr>
-          <w:hyperlink w:anchor="_Toc229664410" w:history="1">
+          <w:hyperlink w:anchor="_Toc229666688" w:history="1">
             <w:r>
               <w:rPr>
                 <w:rStyle w:val="Hiperhivatkozs"/>
@@ -973,7 +973,7 @@
                 <w:noProof/>
                 <w:webHidden/>
               </w:rPr>
-              <w:instrText xml:space="preserve"> PAGEREF _Toc229664410 \h </w:instrText>
+              <w:instrText xml:space="preserve"> PAGEREF _Toc229666688 \h </w:instrText>
             </w:r>
             <w:r>
               <w:rPr>
@@ -1022,7 +1022,7 @@
               <w:lang w:eastAsia="hu-HU"/>
             </w:rPr>
           </w:pPr>
-          <w:hyperlink w:anchor="_Toc229664411" w:history="1">
+          <w:hyperlink w:anchor="_Toc229666689" w:history="1">
             <w:r>
               <w:rPr>
                 <w:rStyle w:val="Hiperhivatkozs"/>
@@ -1069,7 +1069,7 @@
                 <w:noProof/>
                 <w:webHidden/>
               </w:rPr>
-              <w:instrText xml:space="preserve"> PAGEREF _Toc229664411 \h </w:instrText>
+              <w:instrText xml:space="preserve"> PAGEREF _Toc229666689 \h </w:instrText>
             </w:r>
             <w:r>
               <w:rPr>
@@ -1089,7 +1089,7 @@
                 <w:noProof/>
                 <w:webHidden/>
               </w:rPr>
-              <w:t>7</w:t>
+              <w:t>6</w:t>
             </w:r>
             <w:r>
               <w:rPr>
@@ -1116,7 +1116,7 @@
               <w:lang w:eastAsia="hu-HU"/>
             </w:rPr>
           </w:pPr>
-          <w:hyperlink w:anchor="_Toc229664412" w:history="1">
+          <w:hyperlink w:anchor="_Toc229666690" w:history="1">
             <w:r>
               <w:rPr>
                 <w:rStyle w:val="Hiperhivatkozs"/>
@@ -1161,7 +1161,7 @@
                 <w:noProof/>
                 <w:webHidden/>
               </w:rPr>
-              <w:instrText xml:space="preserve"> PAGEREF _Toc229664412 \h </w:instrText>
+              <w:instrText xml:space="preserve"> PAGEREF _Toc229666690 \h </w:instrText>
             </w:r>
             <w:r>
               <w:rPr>
@@ -1181,7 +1181,7 @@
                 <w:noProof/>
                 <w:webHidden/>
               </w:rPr>
-              <w:t>7</w:t>
+              <w:t>6</w:t>
             </w:r>
             <w:r>
               <w:rPr>
@@ -1208,7 +1208,7 @@
               <w:lang w:eastAsia="hu-HU"/>
             </w:rPr>
           </w:pPr>
-          <w:hyperlink w:anchor="_Toc229664413" w:history="1">
+          <w:hyperlink w:anchor="_Toc229666691" w:history="1">
             <w:r>
               <w:rPr>
                 <w:rStyle w:val="Hiperhivatkozs"/>
@@ -1253,7 +1253,7 @@
                 <w:noProof/>
                 <w:webHidden/>
               </w:rPr>
-              <w:instrText xml:space="preserve"> PAGEREF _Toc229664413 \h </w:instrText>
+              <w:instrText xml:space="preserve"> PAGEREF _Toc229666691 \h </w:instrText>
             </w:r>
             <w:r>
               <w:rPr>
@@ -1273,7 +1273,7 @@
                 <w:noProof/>
                 <w:webHidden/>
               </w:rPr>
-              <w:t>7</w:t>
+              <w:t>6</w:t>
             </w:r>
             <w:r>
               <w:rPr>
@@ -1300,7 +1300,7 @@
               <w:lang w:eastAsia="hu-HU"/>
             </w:rPr>
           </w:pPr>
-          <w:hyperlink w:anchor="_Toc229664414" w:history="1">
+          <w:hyperlink w:anchor="_Toc229666692" w:history="1">
             <w:r>
               <w:rPr>
                 <w:rStyle w:val="Hiperhivatkozs"/>
@@ -1345,7 +1345,7 @@
                 <w:noProof/>
                 <w:webHidden/>
               </w:rPr>
-              <w:instrText xml:space="preserve"> PAGEREF _Toc229664414 \h </w:instrText>
+              <w:instrText xml:space="preserve"> PAGEREF _Toc229666692 \h </w:instrText>
             </w:r>
             <w:r>
               <w:rPr>
@@ -1365,7 +1365,7 @@
                 <w:noProof/>
                 <w:webHidden/>
               </w:rPr>
-              <w:t>7</w:t>
+              <w:t>6</w:t>
             </w:r>
             <w:r>
               <w:rPr>
@@ -1392,7 +1392,7 @@
               <w:lang w:eastAsia="hu-HU"/>
             </w:rPr>
           </w:pPr>
-          <w:hyperlink w:anchor="_Toc229664415" w:history="1">
+          <w:hyperlink w:anchor="_Toc229666693" w:history="1">
             <w:r>
               <w:rPr>
                 <w:rStyle w:val="Hiperhivatkozs"/>
@@ -1437,7 +1437,7 @@
                 <w:noProof/>
                 <w:webHidden/>
               </w:rPr>
-              <w:instrText xml:space="preserve"> PAGEREF _Toc229664415 \h </w:instrText>
+              <w:instrText xml:space="preserve"> PAGEREF _Toc229666693 \h </w:instrText>
             </w:r>
             <w:r>
               <w:rPr>
@@ -1484,7 +1484,7 @@
               <w:lang w:eastAsia="hu-HU"/>
             </w:rPr>
           </w:pPr>
-          <w:hyperlink w:anchor="_Toc229664416" w:history="1">
+          <w:hyperlink w:anchor="_Toc229666694" w:history="1">
             <w:r>
               <w:rPr>
                 <w:rStyle w:val="Hiperhivatkozs"/>
@@ -1529,7 +1529,7 @@
                 <w:noProof/>
                 <w:webHidden/>
               </w:rPr>
-              <w:instrText xml:space="preserve"> PAGEREF _Toc229664416 \h </w:instrText>
+              <w:instrText xml:space="preserve"> PAGEREF _Toc229666694 \h </w:instrText>
             </w:r>
             <w:r>
               <w:rPr>
@@ -1576,7 +1576,7 @@
               <w:lang w:eastAsia="hu-HU"/>
             </w:rPr>
           </w:pPr>
-          <w:hyperlink w:anchor="_Toc229664417" w:history="1">
+          <w:hyperlink w:anchor="_Toc229666695" w:history="1">
             <w:r>
               <w:rPr>
                 <w:rStyle w:val="Hiperhivatkozs"/>
@@ -1621,7 +1621,7 @@
                 <w:noProof/>
                 <w:webHidden/>
               </w:rPr>
-              <w:instrText xml:space="preserve"> PAGEREF _Toc229664417 \h </w:instrText>
+              <w:instrText xml:space="preserve"> PAGEREF _Toc229666695 \h </w:instrText>
             </w:r>
             <w:r>
               <w:rPr>
@@ -1668,7 +1668,7 @@
               <w:lang w:eastAsia="hu-HU"/>
             </w:rPr>
           </w:pPr>
-          <w:hyperlink w:anchor="_Toc229664418" w:history="1">
+          <w:hyperlink w:anchor="_Toc229666696" w:history="1">
             <w:r>
               <w:rPr>
                 <w:rStyle w:val="Hiperhivatkozs"/>
@@ -1713,7 +1713,7 @@
                 <w:noProof/>
                 <w:webHidden/>
               </w:rPr>
-              <w:instrText xml:space="preserve"> PAGEREF _Toc229664418 \h </w:instrText>
+              <w:instrText xml:space="preserve"> PAGEREF _Toc229666696 \h </w:instrText>
             </w:r>
             <w:r>
               <w:rPr>
@@ -1760,7 +1760,7 @@
               <w:lang w:eastAsia="hu-HU"/>
             </w:rPr>
           </w:pPr>
-          <w:hyperlink w:anchor="_Toc229664419" w:history="1">
+          <w:hyperlink w:anchor="_Toc229666697" w:history="1">
             <w:r>
               <w:rPr>
                 <w:rStyle w:val="Hiperhivatkozs"/>
@@ -1805,7 +1805,7 @@
                 <w:noProof/>
                 <w:webHidden/>
               </w:rPr>
-              <w:instrText xml:space="preserve"> PAGEREF _Toc229664419 \h </w:instrText>
+              <w:instrText xml:space="preserve"> PAGEREF _Toc229666697 \h </w:instrText>
             </w:r>
             <w:r>
               <w:rPr>
@@ -1852,7 +1852,7 @@
               <w:lang w:eastAsia="hu-HU"/>
             </w:rPr>
           </w:pPr>
-          <w:hyperlink w:anchor="_Toc229664420" w:history="1">
+          <w:hyperlink w:anchor="_Toc229666698" w:history="1">
             <w:r>
               <w:rPr>
                 <w:rStyle w:val="Hiperhivatkozs"/>
@@ -1897,7 +1897,7 @@
                 <w:noProof/>
                 <w:webHidden/>
               </w:rPr>
-              <w:instrText xml:space="preserve"> PAGEREF _Toc229664420 \h </w:instrText>
+              <w:instrText xml:space="preserve"> PAGEREF _Toc229666698 \h </w:instrText>
             </w:r>
             <w:r>
               <w:rPr>
@@ -1946,7 +1946,7 @@
               <w:lang w:eastAsia="hu-HU"/>
             </w:rPr>
           </w:pPr>
-          <w:hyperlink w:anchor="_Toc229664421" w:history="1">
+          <w:hyperlink w:anchor="_Toc229666699" w:history="1">
             <w:r>
               <w:rPr>
                 <w:rStyle w:val="Hiperhivatkozs"/>
@@ -1993,7 +1993,7 @@
                 <w:noProof/>
                 <w:webHidden/>
               </w:rPr>
-              <w:instrText xml:space="preserve"> PAGEREF _Toc229664421 \h </w:instrText>
+              <w:instrText xml:space="preserve"> PAGEREF _Toc229666699 \h </w:instrText>
             </w:r>
             <w:r>
               <w:rPr>
@@ -2042,7 +2042,7 @@
               <w:lang w:eastAsia="hu-HU"/>
             </w:rPr>
           </w:pPr>
-          <w:hyperlink w:anchor="_Toc229664422" w:history="1">
+          <w:hyperlink w:anchor="_Toc229666700" w:history="1">
             <w:r>
               <w:rPr>
                 <w:rStyle w:val="Hiperhivatkozs"/>
@@ -2089,7 +2089,7 @@
                 <w:noProof/>
                 <w:webHidden/>
               </w:rPr>
-              <w:instrText xml:space="preserve"> PAGEREF _Toc229664422 \h </w:instrText>
+              <w:instrText xml:space="preserve"> PAGEREF _Toc229666700 \h </w:instrText>
             </w:r>
             <w:r>
               <w:rPr>
@@ -2109,7 +2109,7 @@
                 <w:noProof/>
                 <w:webHidden/>
               </w:rPr>
-              <w:t>7</w:t>
+              <w:t>8</w:t>
             </w:r>
             <w:r>
               <w:rPr>
@@ -2138,7 +2138,7 @@
               <w:lang w:eastAsia="hu-HU"/>
             </w:rPr>
           </w:pPr>
-          <w:hyperlink w:anchor="_Toc229664423" w:history="1">
+          <w:hyperlink w:anchor="_Toc229666701" w:history="1">
             <w:r>
               <w:rPr>
                 <w:rStyle w:val="Hiperhivatkozs"/>
@@ -2185,7 +2185,7 @@
                 <w:noProof/>
                 <w:webHidden/>
               </w:rPr>
-              <w:instrText xml:space="preserve"> PAGEREF _Toc229664423 \h </w:instrText>
+              <w:instrText xml:space="preserve"> PAGEREF _Toc229666701 \h </w:instrText>
             </w:r>
             <w:r>
               <w:rPr>
@@ -2205,7 +2205,7 @@
                 <w:noProof/>
                 <w:webHidden/>
               </w:rPr>
-              <w:t>7</w:t>
+              <w:t>8</w:t>
             </w:r>
             <w:r>
               <w:rPr>
@@ -2234,7 +2234,7 @@
               <w:lang w:eastAsia="hu-HU"/>
             </w:rPr>
           </w:pPr>
-          <w:hyperlink w:anchor="_Toc229664424" w:history="1">
+          <w:hyperlink w:anchor="_Toc229666702" w:history="1">
             <w:r>
               <w:rPr>
                 <w:rStyle w:val="Hiperhivatkozs"/>
@@ -2281,7 +2281,7 @@
                 <w:noProof/>
                 <w:webHidden/>
               </w:rPr>
-              <w:instrText xml:space="preserve"> PAGEREF _Toc229664424 \h </w:instrText>
+              <w:instrText xml:space="preserve"> PAGEREF _Toc229666702 \h </w:instrText>
             </w:r>
             <w:r>
               <w:rPr>
@@ -2301,7 +2301,7 @@
                 <w:noProof/>
                 <w:webHidden/>
               </w:rPr>
-              <w:t>7</w:t>
+              <w:t>8</w:t>
             </w:r>
             <w:r>
               <w:rPr>
@@ -2330,7 +2330,7 @@
               <w:lang w:eastAsia="hu-HU"/>
             </w:rPr>
           </w:pPr>
-          <w:hyperlink w:anchor="_Toc229664425" w:history="1">
+          <w:hyperlink w:anchor="_Toc229666703" w:history="1">
             <w:r>
               <w:rPr>
                 <w:rStyle w:val="Hiperhivatkozs"/>
@@ -2377,7 +2377,7 @@
                 <w:noProof/>
                 <w:webHidden/>
               </w:rPr>
-              <w:instrText xml:space="preserve"> PAGEREF _Toc229664425 \h </w:instrText>
+              <w:instrText xml:space="preserve"> PAGEREF _Toc229666703 \h </w:instrText>
             </w:r>
             <w:r>
               <w:rPr>
@@ -2397,7 +2397,7 @@
                 <w:noProof/>
                 <w:webHidden/>
               </w:rPr>
-              <w:t>7</w:t>
+              <w:t>9</w:t>
             </w:r>
             <w:r>
               <w:rPr>
@@ -2426,7 +2426,7 @@
               <w:lang w:eastAsia="hu-HU"/>
             </w:rPr>
           </w:pPr>
-          <w:hyperlink w:anchor="_Toc229664426" w:history="1">
+          <w:hyperlink w:anchor="_Toc229666704" w:history="1">
             <w:r>
               <w:rPr>
                 <w:rStyle w:val="Hiperhivatkozs"/>
@@ -2473,7 +2473,7 @@
                 <w:noProof/>
                 <w:webHidden/>
               </w:rPr>
-              <w:instrText xml:space="preserve"> PAGEREF _Toc229664426 \h </w:instrText>
+              <w:instrText xml:space="preserve"> PAGEREF _Toc229666704 \h </w:instrText>
             </w:r>
             <w:r>
               <w:rPr>
@@ -2493,7 +2493,7 @@
                 <w:noProof/>
                 <w:webHidden/>
               </w:rPr>
-              <w:t>7</w:t>
+              <w:t>9</w:t>
             </w:r>
             <w:r>
               <w:rPr>
@@ -2520,7 +2520,7 @@
               <w:lang w:eastAsia="hu-HU"/>
             </w:rPr>
           </w:pPr>
-          <w:hyperlink w:anchor="_Toc229664427" w:history="1">
+          <w:hyperlink w:anchor="_Toc229666705" w:history="1">
             <w:r>
               <w:rPr>
                 <w:rStyle w:val="Hiperhivatkozs"/>
@@ -2565,7 +2565,7 @@
                 <w:noProof/>
                 <w:webHidden/>
               </w:rPr>
-              <w:instrText xml:space="preserve"> PAGEREF _Toc229664427 \h </w:instrText>
+              <w:instrText xml:space="preserve"> PAGEREF _Toc229666705 \h </w:instrText>
             </w:r>
             <w:r>
               <w:rPr>
@@ -2585,7 +2585,7 @@
                 <w:noProof/>
                 <w:webHidden/>
               </w:rPr>
-              <w:t>7</w:t>
+              <w:t>9</w:t>
             </w:r>
             <w:r>
               <w:rPr>
@@ -2612,7 +2612,7 @@
               <w:lang w:eastAsia="hu-HU"/>
             </w:rPr>
           </w:pPr>
-          <w:hyperlink w:anchor="_Toc229664428" w:history="1">
+          <w:hyperlink w:anchor="_Toc229666706" w:history="1">
             <w:r>
               <w:rPr>
                 <w:rStyle w:val="Hiperhivatkozs"/>
@@ -2657,7 +2657,7 @@
                 <w:noProof/>
                 <w:webHidden/>
               </w:rPr>
-              <w:instrText xml:space="preserve"> PAGEREF _Toc229664428 \h </w:instrText>
+              <w:instrText xml:space="preserve"> PAGEREF _Toc229666706 \h </w:instrText>
             </w:r>
             <w:r>
               <w:rPr>
@@ -2677,7 +2677,7 @@
                 <w:noProof/>
                 <w:webHidden/>
               </w:rPr>
-              <w:t>7</w:t>
+              <w:t>9</w:t>
             </w:r>
             <w:r>
               <w:rPr>
@@ -2704,7 +2704,7 @@
               <w:lang w:eastAsia="hu-HU"/>
             </w:rPr>
           </w:pPr>
-          <w:hyperlink w:anchor="_Toc229664429" w:history="1">
+          <w:hyperlink w:anchor="_Toc229666707" w:history="1">
             <w:r>
               <w:rPr>
                 <w:rStyle w:val="Hiperhivatkozs"/>
@@ -2749,7 +2749,7 @@
                 <w:noProof/>
                 <w:webHidden/>
               </w:rPr>
-              <w:instrText xml:space="preserve"> PAGEREF _Toc229664429 \h </w:instrText>
+              <w:instrText xml:space="preserve"> PAGEREF _Toc229666707 \h </w:instrText>
             </w:r>
             <w:r>
               <w:rPr>
@@ -2769,7 +2769,7 @@
                 <w:noProof/>
                 <w:webHidden/>
               </w:rPr>
-              <w:t>7</w:t>
+              <w:t>9</w:t>
             </w:r>
             <w:r>
               <w:rPr>
@@ -2796,7 +2796,7 @@
               <w:lang w:eastAsia="hu-HU"/>
             </w:rPr>
           </w:pPr>
-          <w:hyperlink w:anchor="_Toc229664430" w:history="1">
+          <w:hyperlink w:anchor="_Toc229666708" w:history="1">
             <w:r>
               <w:rPr>
                 <w:rStyle w:val="Hiperhivatkozs"/>
@@ -2841,7 +2841,7 @@
                 <w:noProof/>
                 <w:webHidden/>
               </w:rPr>
-              <w:instrText xml:space="preserve"> PAGEREF _Toc229664430 \h </w:instrText>
+              <w:instrText xml:space="preserve"> PAGEREF _Toc229666708 \h </w:instrText>
             </w:r>
             <w:r>
               <w:rPr>
@@ -2861,7 +2861,7 @@
                 <w:noProof/>
                 <w:webHidden/>
               </w:rPr>
-              <w:t>8</w:t>
+              <w:t>9</w:t>
             </w:r>
             <w:r>
               <w:rPr>
@@ -2888,7 +2888,7 @@
               <w:lang w:eastAsia="hu-HU"/>
             </w:rPr>
           </w:pPr>
-          <w:hyperlink w:anchor="_Toc229664431" w:history="1">
+          <w:hyperlink w:anchor="_Toc229666709" w:history="1">
             <w:r>
               <w:rPr>
                 <w:rStyle w:val="Hiperhivatkozs"/>
@@ -2933,7 +2933,7 @@
                 <w:noProof/>
                 <w:webHidden/>
               </w:rPr>
-              <w:instrText xml:space="preserve"> PAGEREF _Toc229664431 \h </w:instrText>
+              <w:instrText xml:space="preserve"> PAGEREF _Toc229666709 \h </w:instrText>
             </w:r>
             <w:r>
               <w:rPr>
@@ -2953,7 +2953,7 @@
                 <w:noProof/>
                 <w:webHidden/>
               </w:rPr>
-              <w:t>8</w:t>
+              <w:t>9</w:t>
             </w:r>
             <w:r>
               <w:rPr>
@@ -2982,7 +2982,7 @@
               <w:lang w:eastAsia="hu-HU"/>
             </w:rPr>
           </w:pPr>
-          <w:hyperlink w:anchor="_Toc229664432" w:history="1">
+          <w:hyperlink w:anchor="_Toc229666710" w:history="1">
             <w:r>
               <w:rPr>
                 <w:rStyle w:val="Hiperhivatkozs"/>
@@ -3029,7 +3029,7 @@
                 <w:noProof/>
                 <w:webHidden/>
               </w:rPr>
-              <w:instrText xml:space="preserve"> PAGEREF _Toc229664432 \h </w:instrText>
+              <w:instrText xml:space="preserve"> PAGEREF _Toc229666710 \h </w:instrText>
             </w:r>
             <w:r>
               <w:rPr>
@@ -3049,7 +3049,7 @@
                 <w:noProof/>
                 <w:webHidden/>
               </w:rPr>
-              <w:t>8</w:t>
+              <w:t>9</w:t>
             </w:r>
             <w:r>
               <w:rPr>
@@ -3078,7 +3078,7 @@
               <w:lang w:eastAsia="hu-HU"/>
             </w:rPr>
           </w:pPr>
-          <w:hyperlink w:anchor="_Toc229664433" w:history="1">
+          <w:hyperlink w:anchor="_Toc229666711" w:history="1">
             <w:r>
               <w:rPr>
                 <w:rStyle w:val="Hiperhivatkozs"/>
@@ -3125,7 +3125,7 @@
                 <w:noProof/>
                 <w:webHidden/>
               </w:rPr>
-              <w:instrText xml:space="preserve"> PAGEREF _Toc229664433 \h </w:instrText>
+              <w:instrText xml:space="preserve"> PAGEREF _Toc229666711 \h </w:instrText>
             </w:r>
             <w:r>
               <w:rPr>
@@ -3145,7 +3145,7 @@
                 <w:noProof/>
                 <w:webHidden/>
               </w:rPr>
-              <w:t>8</w:t>
+              <w:t>9</w:t>
             </w:r>
             <w:r>
               <w:rPr>
@@ -3174,7 +3174,7 @@
               <w:lang w:eastAsia="hu-HU"/>
             </w:rPr>
           </w:pPr>
-          <w:hyperlink w:anchor="_Toc229664434" w:history="1">
+          <w:hyperlink w:anchor="_Toc229666712" w:history="1">
             <w:r>
               <w:rPr>
                 <w:rStyle w:val="Hiperhivatkozs"/>
@@ -3221,7 +3221,7 @@
                 <w:noProof/>
                 <w:webHidden/>
               </w:rPr>
-              <w:instrText xml:space="preserve"> PAGEREF _Toc229664434 \h </w:instrText>
+              <w:instrText xml:space="preserve"> PAGEREF _Toc229666712 \h </w:instrText>
             </w:r>
             <w:r>
               <w:rPr>
@@ -3241,7 +3241,7 @@
                 <w:noProof/>
                 <w:webHidden/>
               </w:rPr>
-              <w:t>8</w:t>
+              <w:t>9</w:t>
             </w:r>
             <w:r>
               <w:rPr>
@@ -3270,7 +3270,7 @@
               <w:lang w:eastAsia="hu-HU"/>
             </w:rPr>
           </w:pPr>
-          <w:hyperlink w:anchor="_Toc229664435" w:history="1">
+          <w:hyperlink w:anchor="_Toc229666713" w:history="1">
             <w:r>
               <w:rPr>
                 <w:rStyle w:val="Hiperhivatkozs"/>
@@ -3317,7 +3317,7 @@
                 <w:noProof/>
                 <w:webHidden/>
               </w:rPr>
-              <w:instrText xml:space="preserve"> PAGEREF _Toc229664435 \h </w:instrText>
+              <w:instrText xml:space="preserve"> PAGEREF _Toc229666713 \h </w:instrText>
             </w:r>
             <w:r>
               <w:rPr>
@@ -3337,7 +3337,7 @@
                 <w:noProof/>
                 <w:webHidden/>
               </w:rPr>
-              <w:t>8</w:t>
+              <w:t>9</w:t>
             </w:r>
             <w:r>
               <w:rPr>
@@ -3369,7 +3369,7 @@
       <w:pPr>
         <w:pStyle w:val="Cmsor1"/>
       </w:pPr>
-      <w:bookmarkStart w:id="0" w:name="_Toc229664402"/>
+      <w:bookmarkStart w:id="0" w:name="_Toc229666680"/>
       <w:r>
         <w:lastRenderedPageBreak/>
         <w:t>Bevezetés</w:t>
@@ -3390,12 +3390,28 @@
         <w:t xml:space="preserve"> [8]</w:t>
       </w:r>
       <w:r>
-        <w:t>. Az alkalmazás feladata, hogy a termékfotókon automatikusan megtalálja a vonalkód-gyanús területeket, ezeket előfeldolgozza, majd scanline-alapú dekódolással megpróbálja kiolvasni az EAN-13 kódot belőle.</w:t>
-      </w:r>
-    </w:p>
-    <w:p>
-      <w:r>
-        <w:t>A legnagyobb kihívást az jelenti, hogy a vonalkód képek nem laborkörülmények között készültek, így gyakran ferdék, részben elmosódottak, eltérő megvilágításúak, csomagolásgörbületen helye</w:t>
+        <w:t xml:space="preserve">. Az alkalmazás feladata, hogy a termékfotókon automatikusan megtalálja a vonalkód-gyanús területeket, ezeket előfeldolgozza, majd </w:t>
+      </w:r>
+      <w:proofErr w:type="spellStart"/>
+      <w:r>
+        <w:t>scanline</w:t>
+      </w:r>
+      <w:proofErr w:type="spellEnd"/>
+      <w:r>
+        <w:t>-alapú dekódolással megpróbálja kiolvasni az EAN-13 kódot belőle.</w:t>
+      </w:r>
+    </w:p>
+    <w:p>
+      <w:r>
+        <w:t xml:space="preserve">A legnagyobb kihívást az jelenti, hogy a vonalkód képek nem laborkörülmények között készültek, így gyakran ferdék, részben </w:t>
+      </w:r>
+      <w:proofErr w:type="spellStart"/>
+      <w:r>
+        <w:t>elmosódottak</w:t>
+      </w:r>
+      <w:proofErr w:type="spellEnd"/>
+      <w:r>
+        <w:t>, eltérő megvilágításúak, csomagolásgörbületen helye</w:t>
       </w:r>
       <w:r>
         <w:t>z</w:t>
@@ -3425,7 +3441,7 @@
       <w:pPr>
         <w:pStyle w:val="Cmsor1"/>
       </w:pPr>
-      <w:bookmarkStart w:id="1" w:name="_Toc229664403"/>
+      <w:bookmarkStart w:id="1" w:name="_Toc229666681"/>
       <w:r>
         <w:t>A</w:t>
       </w:r>
@@ -3436,7 +3452,15 @@
     </w:p>
     <w:p>
       <w:r>
-        <w:t>A megoldandó feladat egy olyan EAN-13 scanner elkészítése volt, amely képfájlokból képes automatikusan kiolvasni az azonosító számot.</w:t>
+        <w:t xml:space="preserve">A megoldandó feladat egy olyan EAN-13 </w:t>
+      </w:r>
+      <w:proofErr w:type="spellStart"/>
+      <w:r>
+        <w:t>scanner</w:t>
+      </w:r>
+      <w:proofErr w:type="spellEnd"/>
+      <w:r>
+        <w:t xml:space="preserve"> elkészítése volt, amely képfájlokból képes automatikusan kiolvasni az azonosító számot.</w:t>
       </w:r>
       <w:r>
         <w:t xml:space="preserve"> A bemeneti képek fájlneve tartalmazza az elvárt EAN-kódot, ezért a rendszer automatikusan össze tudja hasonlítani a dekódolt eredményt a várt értékekkel.</w:t>
@@ -3501,19 +3525,43 @@
         <w:t>ERROR / HIBA:</w:t>
       </w:r>
       <w:r>
-        <w:t xml:space="preserve"> a rendszer nem adott vissza kódot, mert nem talált megfelelő ROI-t, nem tudta stabilan dekódolni a scanline-okat, vagy bizonytalannak minősítette az eredményt.</w:t>
-      </w:r>
-    </w:p>
-    <w:p>
-      <w:r>
-        <w:t>A fejlesztés során a legfontosabb cél nem pusztán az olvasási arány növelése volt, hanem a hibás, de checksum-helyes hamis pozitív találatok csökkentése. Egy valós alkalmazásban a rossz vonalkód visszaadása súlyosabb probléma, mint az, ha a rendszer jelzi hogy nem biztos az olvasásban.</w:t>
+        <w:t xml:space="preserve"> a rendszer nem adott vissza kódot, mert nem talált megfelelő ROI-t, nem tudta stabilan dekódolni a </w:t>
+      </w:r>
+      <w:proofErr w:type="spellStart"/>
+      <w:r>
+        <w:t>scanline-okat</w:t>
+      </w:r>
+      <w:proofErr w:type="spellEnd"/>
+      <w:r>
+        <w:t>, vagy bizonytalannak minősítette az eredményt.</w:t>
+      </w:r>
+    </w:p>
+    <w:p>
+      <w:r>
+        <w:t xml:space="preserve">A fejlesztés során a legfontosabb cél nem pusztán az olvasási arány növelése volt, hanem a hibás, de </w:t>
+      </w:r>
+      <w:proofErr w:type="spellStart"/>
+      <w:r>
+        <w:t>checksum</w:t>
+      </w:r>
+      <w:proofErr w:type="spellEnd"/>
+      <w:r>
+        <w:t xml:space="preserve">-helyes hamis pozitív találatok csökkentése. Egy valós alkalmazásban a rossz vonalkód visszaadása súlyosabb probléma, mint az, ha a rendszer </w:t>
+      </w:r>
+      <w:proofErr w:type="gramStart"/>
+      <w:r>
+        <w:t>jelzi</w:t>
+      </w:r>
+      <w:proofErr w:type="gramEnd"/>
+      <w:r>
+        <w:t xml:space="preserve"> hogy nem biztos az olvasásban.</w:t>
       </w:r>
     </w:p>
     <w:p>
       <w:pPr>
         <w:pStyle w:val="Cmsor1"/>
       </w:pPr>
-      <w:bookmarkStart w:id="2" w:name="_Toc229664404"/>
+      <w:bookmarkStart w:id="2" w:name="_Toc229666682"/>
       <w:r>
         <w:t>Az EAN-13 kódrendszer áttekintése</w:t>
       </w:r>
@@ -3537,7 +3585,7 @@
       <w:pPr>
         <w:pStyle w:val="Cmsor2"/>
       </w:pPr>
-      <w:bookmarkStart w:id="3" w:name="_Toc229664405"/>
+      <w:bookmarkStart w:id="3" w:name="_Toc229666683"/>
       <w:r>
         <w:t>Az EAN-13 szerepe a termékazonosításban</w:t>
       </w:r>
@@ -3553,14 +3601,22 @@
     </w:p>
     <w:p>
       <w:r>
-        <w:t>A vonalkódolvasó alkalmazás számára ez azt jelenti, hogy a cél nem csupán egy tetszőleges 13 jegyű szám felismerése, hanem egy olyan számsor visszaadása, amely megfelel az EAN-13 formai és matematikai szabályainak. A dekódolás végén éppen ezért szükséges az ellenőrző számjegy vizsgálata. Ha a checksum nem egyezik, akkor a kapott kiolvasott számsor biztosan hibásnak tekinthető [2], [3].</w:t>
+        <w:t xml:space="preserve">A vonalkódolvasó alkalmazás számára ez azt jelenti, hogy a cél nem csupán egy tetszőleges 13 jegyű szám felismerése, hanem egy olyan számsor visszaadása, amely megfelel az EAN-13 formai és matematikai szabályainak. A dekódolás végén éppen ezért szükséges az ellenőrző számjegy vizsgálata. Ha a </w:t>
+      </w:r>
+      <w:proofErr w:type="spellStart"/>
+      <w:r>
+        <w:t>checksum</w:t>
+      </w:r>
+      <w:proofErr w:type="spellEnd"/>
+      <w:r>
+        <w:t xml:space="preserve"> nem egyezik, akkor a kapott kiolvasott számsor biztosan hibásnak tekinthető [2], [3].</w:t>
       </w:r>
     </w:p>
     <w:p>
       <w:pPr>
         <w:pStyle w:val="Cmsor2"/>
       </w:pPr>
-      <w:bookmarkStart w:id="4" w:name="_Toc229664406"/>
+      <w:bookmarkStart w:id="4" w:name="_Toc229666684"/>
       <w:r>
         <w:t>A 13 számjegy felépítése</w:t>
       </w:r>
@@ -3573,19 +3629,59 @@
     </w:p>
     <w:p>
       <w:r>
-        <w:t>A programban ez a logika azért fontos, mert a dekódolt számjegysor csak akkor fogadható el jelöltként, ha az utolsó számjegy megegyezik a számított checksum értékével [8]. Ez azonban csak egy alapvető hibaszűrés. A checksum képes sok elírás vagy dekódolási hiba kiszűrésére, de nem bizonyítja teljes biztonsággal, hogy a kód valóban a képen szereplő vonalkódból származik.</w:t>
-      </w:r>
-    </w:p>
-    <w:p>
-      <w:r>
-        <w:t>Ez gyakorlatban azért lényeges, mert zajos vagy rosszul kivágott képrészleten is előfordulhat, hogy a rendszer véletlenül olyan 13 számjegyű sorozatot talál, amely a checksum szempontból évvényes. Emiatt a projektben a checksum mellett további megbízhatósági feltételek is szerepelnek, például a score, a találatszám, a módszercsaládok közötti egyezés és az alternatív jelöletek vizsgálata [8], [9].</w:t>
+        <w:t xml:space="preserve">A programban ez a logika azért fontos, mert a dekódolt számjegysor csak akkor fogadható el jelöltként, ha az utolsó számjegy megegyezik a számított </w:t>
+      </w:r>
+      <w:proofErr w:type="spellStart"/>
+      <w:r>
+        <w:t>checksum</w:t>
+      </w:r>
+      <w:proofErr w:type="spellEnd"/>
+      <w:r>
+        <w:t xml:space="preserve"> értékével [8]. Ez azonban csak egy alapvető hibaszűrés. A </w:t>
+      </w:r>
+      <w:proofErr w:type="spellStart"/>
+      <w:r>
+        <w:t>checksum</w:t>
+      </w:r>
+      <w:proofErr w:type="spellEnd"/>
+      <w:r>
+        <w:t xml:space="preserve"> képes sok elírás vagy dekódolási hiba kiszűrésére, de nem bizonyítja teljes biztonsággal, hogy a kód valóban a képen szereplő vonalkódból származik.</w:t>
+      </w:r>
+    </w:p>
+    <w:p>
+      <w:r>
+        <w:t xml:space="preserve">Ez gyakorlatban azért lényeges, mert zajos vagy rosszul kivágott képrészleten is előfordulhat, hogy a rendszer véletlenül olyan 13 számjegyű sorozatot talál, amely a </w:t>
+      </w:r>
+      <w:proofErr w:type="spellStart"/>
+      <w:r>
+        <w:t>checksum</w:t>
+      </w:r>
+      <w:proofErr w:type="spellEnd"/>
+      <w:r>
+        <w:t xml:space="preserve"> szempontból évvényes. Emiatt a projektben a </w:t>
+      </w:r>
+      <w:proofErr w:type="spellStart"/>
+      <w:r>
+        <w:t>checksum</w:t>
+      </w:r>
+      <w:proofErr w:type="spellEnd"/>
+      <w:r>
+        <w:t xml:space="preserve"> mellett további megbízhatósági feltételek is szerepelnek, például a </w:t>
+      </w:r>
+      <w:proofErr w:type="spellStart"/>
+      <w:r>
+        <w:t>score</w:t>
+      </w:r>
+      <w:proofErr w:type="spellEnd"/>
+      <w:r>
+        <w:t>, a találatszám, a módszercsaládok közötti egyezés és az alternatív jelöletek vizsgálata [8], [9].</w:t>
       </w:r>
     </w:p>
     <w:p>
       <w:pPr>
         <w:pStyle w:val="Cmsor2"/>
       </w:pPr>
-      <w:bookmarkStart w:id="5" w:name="_Toc229664407"/>
+      <w:bookmarkStart w:id="5" w:name="_Toc229666685"/>
       <w:r>
         <w:lastRenderedPageBreak/>
         <w:t>A 95 modulból álló vonalkódszerkezet</w:t>
@@ -3611,7 +3707,15 @@
         </w:numPr>
       </w:pPr>
       <w:r>
-        <w:t>start guard: 3 modul</w:t>
+        <w:t xml:space="preserve">start </w:t>
+      </w:r>
+      <w:proofErr w:type="spellStart"/>
+      <w:r>
+        <w:t>guard</w:t>
+      </w:r>
+      <w:proofErr w:type="spellEnd"/>
+      <w:r>
+        <w:t>: 3 modul</w:t>
       </w:r>
     </w:p>
     <w:p>
@@ -3634,8 +3738,21 @@
           <w:numId w:val="3"/>
         </w:numPr>
       </w:pPr>
-      <w:r>
-        <w:t>middle guard: 5 modul</w:t>
+      <w:proofErr w:type="spellStart"/>
+      <w:r>
+        <w:t>middle</w:t>
+      </w:r>
+      <w:proofErr w:type="spellEnd"/>
+      <w:r>
+        <w:t xml:space="preserve"> </w:t>
+      </w:r>
+      <w:proofErr w:type="spellStart"/>
+      <w:r>
+        <w:t>guard</w:t>
+      </w:r>
+      <w:proofErr w:type="spellEnd"/>
+      <w:r>
+        <w:t>: 5 modul</w:t>
       </w:r>
     </w:p>
     <w:p>
@@ -3659,7 +3776,15 @@
         </w:numPr>
       </w:pPr>
       <w:r>
-        <w:t>end guard: 3 modul</w:t>
+        <w:t xml:space="preserve">end </w:t>
+      </w:r>
+      <w:proofErr w:type="spellStart"/>
+      <w:r>
+        <w:t>guard</w:t>
+      </w:r>
+      <w:proofErr w:type="spellEnd"/>
+      <w:r>
+        <w:t>: 3 modul</w:t>
       </w:r>
     </w:p>
     <w:p>
@@ -3667,14 +3792,38 @@
         <w:t>Ez összesen 3 + 42 + 5 + 42 + 3 = 95 modul.</w:t>
       </w:r>
       <w:r>
-        <w:t xml:space="preserve"> A guard minták segítenek a vonalkód elejének, középének és végének felismerésében. A start és end guard mintája fekete-fehér-fekete szerkezetű, a középső guard pedig elválasztja a bal és jobb oldali számjegycsoportot.</w:t>
+        <w:t xml:space="preserve"> A </w:t>
+      </w:r>
+      <w:proofErr w:type="spellStart"/>
+      <w:r>
+        <w:t>guard</w:t>
+      </w:r>
+      <w:proofErr w:type="spellEnd"/>
+      <w:r>
+        <w:t xml:space="preserve"> minták segítenek a vonalkód elejének, középének és végének felismerésében. A start és end </w:t>
+      </w:r>
+      <w:proofErr w:type="spellStart"/>
+      <w:r>
+        <w:t>guard</w:t>
+      </w:r>
+      <w:proofErr w:type="spellEnd"/>
+      <w:r>
+        <w:t xml:space="preserve"> mintája fekete-fehér-fekete szerkezetű, a középső </w:t>
+      </w:r>
+      <w:proofErr w:type="spellStart"/>
+      <w:r>
+        <w:t>guard</w:t>
+      </w:r>
+      <w:proofErr w:type="spellEnd"/>
+      <w:r>
+        <w:t xml:space="preserve"> pedig elválasztja a bal és jobb oldali számjegycsoportot.</w:t>
       </w:r>
     </w:p>
     <w:p>
       <w:pPr>
         <w:pStyle w:val="Cmsor2"/>
       </w:pPr>
-      <w:bookmarkStart w:id="6" w:name="_Toc229664408"/>
+      <w:bookmarkStart w:id="6" w:name="_Toc229666686"/>
       <w:r>
         <w:t>L, G, és R kódolási minták</w:t>
       </w:r>
@@ -3709,7 +3858,7 @@
       <w:pPr>
         <w:pStyle w:val="Cmsor2"/>
       </w:pPr>
-      <w:bookmarkStart w:id="7" w:name="_Toc229664409"/>
+      <w:bookmarkStart w:id="7" w:name="_Toc229666687"/>
       <w:r>
         <w:t>Ellenőrző számjegy és hibafelismerés</w:t>
       </w:r>
@@ -3722,35 +3871,117 @@
     </w:p>
     <w:p>
       <w:r>
-        <w:t>Az ellenőrző számjegy ugyanakkor nem azonos a teljes olvasási bizonyossággal. A checksum csak s számsor matematikai helyességét vizsgálja, de nem ellenőrzi a képi eredet megbízhatóságát. Emiatt előfordulhat, hogy egy hibásan felismert, de véletlenül checksum-helyes számsor átmenne ezen az ellenőrzésen.</w:t>
-      </w:r>
-    </w:p>
-    <w:p>
-      <w:r>
-        <w:t>Emiatt a fejlesztett alkalmazásban további ellenőrzéseket csinálunk. A végső döntés több scanline eredményének összesítésén alapul. Ha ugyanazt a kódot sok scanline, több ROI-</w:t>
+        <w:t xml:space="preserve">Az ellenőrző számjegy ugyanakkor nem azonos a teljes olvasási bizonyossággal. A </w:t>
+      </w:r>
+      <w:proofErr w:type="spellStart"/>
+      <w:r>
+        <w:t>checksum</w:t>
+      </w:r>
+      <w:proofErr w:type="spellEnd"/>
+      <w:r>
+        <w:t xml:space="preserve"> csak s számsor matematikai helyességét vizsgálja, de nem ellenőrzi a képi eredet megbízhatóságát. Emiatt előfordulhat, hogy egy hibásan felismert, de véletlenül </w:t>
+      </w:r>
+      <w:proofErr w:type="spellStart"/>
+      <w:r>
+        <w:t>checksum</w:t>
+      </w:r>
+      <w:proofErr w:type="spellEnd"/>
+      <w:r>
+        <w:t>-helyes számsor átmenne ezen az ellenőrzésen.</w:t>
+      </w:r>
+    </w:p>
+    <w:p>
+      <w:r>
+        <w:t xml:space="preserve">Emiatt a fejlesztett alkalmazásban további ellenőrzéseket csinálunk. A végső döntés több </w:t>
+      </w:r>
+      <w:proofErr w:type="spellStart"/>
+      <w:r>
+        <w:t>scanline</w:t>
+      </w:r>
+      <w:proofErr w:type="spellEnd"/>
+      <w:r>
+        <w:t xml:space="preserve"> eredményének összesítésén alapul. Ha ugyanazt a kódot sok </w:t>
+      </w:r>
+      <w:proofErr w:type="spellStart"/>
+      <w:r>
+        <w:t>scanline</w:t>
+      </w:r>
+      <w:proofErr w:type="spellEnd"/>
+      <w:r>
+        <w:t>, több ROI-</w:t>
       </w:r>
       <w:r>
         <w:lastRenderedPageBreak/>
-        <w:t>forgatás és több binarizálási módszer is támogatja, akkor az eredmény megbízhatónak tekinthető.</w:t>
-      </w:r>
-      <w:r>
-        <w:t xml:space="preserve"> Ha viszont csak kevés scanline ad azonos eredményt, vagy több checksum-helyes jelölt hasonló pontszámot kap, akkor a rendszer inkább bizonytalannak jelöli az olvasást [8], [9].</w:t>
+        <w:t xml:space="preserve">forgatás és több </w:t>
+      </w:r>
+      <w:proofErr w:type="spellStart"/>
+      <w:r>
+        <w:t>binarizálási</w:t>
+      </w:r>
+      <w:proofErr w:type="spellEnd"/>
+      <w:r>
+        <w:t xml:space="preserve"> módszer is támogatja, akkor az eredmény megbízhatónak tekinthető.</w:t>
+      </w:r>
+      <w:r>
+        <w:t xml:space="preserve"> Ha viszont csak kevés </w:t>
+      </w:r>
+      <w:proofErr w:type="spellStart"/>
+      <w:r>
+        <w:t>scanline</w:t>
+      </w:r>
+      <w:proofErr w:type="spellEnd"/>
+      <w:r>
+        <w:t xml:space="preserve"> ad azonos eredményt, vagy több </w:t>
+      </w:r>
+      <w:proofErr w:type="spellStart"/>
+      <w:r>
+        <w:t>checksum</w:t>
+      </w:r>
+      <w:proofErr w:type="spellEnd"/>
+      <w:r>
+        <w:t>-helyes jelölt hasonló pontszámot kap, akkor a rendszer inkább bizonytalannak jelöli az olvasást [8], [9].</w:t>
       </w:r>
     </w:p>
     <w:p>
       <w:pPr>
         <w:pStyle w:val="Cmsor2"/>
       </w:pPr>
-      <w:bookmarkStart w:id="8" w:name="_Toc229664410"/>
-      <w:r>
-        <w:t>Quiet zone és a vonalkód környezete</w:t>
+      <w:bookmarkStart w:id="8" w:name="_Toc229666688"/>
+      <w:proofErr w:type="spellStart"/>
+      <w:r>
+        <w:t>Quiet</w:t>
+      </w:r>
+      <w:proofErr w:type="spellEnd"/>
+      <w:r>
+        <w:t xml:space="preserve"> </w:t>
+      </w:r>
+      <w:proofErr w:type="spellStart"/>
+      <w:r>
+        <w:t>zone</w:t>
+      </w:r>
+      <w:proofErr w:type="spellEnd"/>
+      <w:r>
+        <w:t xml:space="preserve"> és a vonalkód környezete</w:t>
       </w:r>
       <w:bookmarkEnd w:id="8"/>
     </w:p>
     <w:p>
       <w:r>
-        <w:t>Az EAN típusú vonalkódok olvasásánál fontos szerepet játszik a quiet zone</w:t>
-      </w:r>
+        <w:t xml:space="preserve">Az EAN típusú vonalkódok olvasásánál fontos szerepet játszik a </w:t>
+      </w:r>
+      <w:proofErr w:type="spellStart"/>
+      <w:r>
+        <w:t>quiet</w:t>
+      </w:r>
+      <w:proofErr w:type="spellEnd"/>
+      <w:r>
+        <w:t xml:space="preserve"> </w:t>
+      </w:r>
+      <w:proofErr w:type="spellStart"/>
+      <w:r>
+        <w:t>zone</w:t>
+      </w:r>
+      <w:proofErr w:type="spellEnd"/>
       <w:r>
         <w:t>, vagyis a vonalkód két oldalán található üres, zavaró mintáktól mentes terület. Ez segíti az olvasót abban, hogy pontosan felismerje, hol kezdődik és hol végződik a vonalkód</w:t>
       </w:r>
@@ -3778,14 +4009,30 @@
         <w:t xml:space="preserve"> vagy más fekete-fehér elem helyezkedhet el.</w:t>
       </w:r>
       <w:r>
-        <w:t xml:space="preserve"> Ilyenkor a scanner egyszerűen tévesztheti össze a vonalkód sávjait a környező grafikai elemekkel, vagy a scanline nem tisztán a vonalkódon halad át.</w:t>
+        <w:t xml:space="preserve"> Ilyenkor a </w:t>
+      </w:r>
+      <w:proofErr w:type="spellStart"/>
+      <w:r>
+        <w:t>scanner</w:t>
+      </w:r>
+      <w:proofErr w:type="spellEnd"/>
+      <w:r>
+        <w:t xml:space="preserve"> egyszerűen tévesztheti össze a vonalkód sávjait a környező grafikai elemekkel, vagy a </w:t>
+      </w:r>
+      <w:proofErr w:type="spellStart"/>
+      <w:r>
+        <w:t>scanline</w:t>
+      </w:r>
+      <w:proofErr w:type="spellEnd"/>
+      <w:r>
+        <w:t xml:space="preserve"> nem tisztán a vonalkódon halad át.</w:t>
       </w:r>
     </w:p>
     <w:p>
       <w:pPr>
         <w:pStyle w:val="Cmsor1"/>
       </w:pPr>
-      <w:bookmarkStart w:id="9" w:name="_Toc229664411"/>
+      <w:bookmarkStart w:id="9" w:name="_Toc229666689"/>
       <w:r>
         <w:t>A program fő moduljai</w:t>
       </w:r>
@@ -3793,257 +4040,1067 @@
     </w:p>
     <w:p>
       <w:r>
-        <w:t>A program főbb, logikailag elkülönített modulból áll, a bemutatott moduláris felépítés a saját megvalósításom felépítését mutatja be [8]. Ez a felépítés átláthatóbbá teszi a fejlesztést és a dokumentálást, mert a képfeldolgozás, a ROI keresés, a scanline előállítás, a dekódolés és a statisztikai értékelés külön fájlokban található.</w:t>
+        <w:t xml:space="preserve">A program főbb, logikailag elkülönített modulból áll, a bemutatott moduláris felépítés a saját megvalósításom felépítését mutatja be [8]. Ez a felépítés átláthatóbbá teszi a fejlesztést és a dokumentálást, mert a képfeldolgozás, a ROI keresés, a </w:t>
+      </w:r>
+      <w:proofErr w:type="spellStart"/>
+      <w:r>
+        <w:t>scanline</w:t>
+      </w:r>
+      <w:proofErr w:type="spellEnd"/>
+      <w:r>
+        <w:t xml:space="preserve"> előállítás, a dekódol</w:t>
+      </w:r>
+      <w:r>
+        <w:t>á</w:t>
+      </w:r>
+      <w:r>
+        <w:t>s és a statisztikai értékelés külön fájlokban található.</w:t>
       </w:r>
     </w:p>
     <w:p>
       <w:pPr>
         <w:pStyle w:val="Cmsor2"/>
       </w:pPr>
-      <w:bookmarkStart w:id="10" w:name="_Toc229664412"/>
+      <w:bookmarkStart w:id="10" w:name="_Toc229666690"/>
+      <w:r>
+        <w:t>main.py</w:t>
+      </w:r>
+      <w:bookmarkEnd w:id="10"/>
+    </w:p>
+    <w:p>
+      <w:r>
+        <w:t xml:space="preserve">A fő belépési pont. Feladata a képek bejárása, az elvárt EAN-kód fájlnévből való kinyerése, a </w:t>
+      </w:r>
+      <w:proofErr w:type="spellStart"/>
+      <w:r>
+        <w:t>scanner</w:t>
+      </w:r>
+      <w:proofErr w:type="spellEnd"/>
+      <w:r>
+        <w:t xml:space="preserve"> meghívása, majd az eredmények kiírása</w:t>
+      </w:r>
+      <w:r>
+        <w:t>. A futás során a program OK, ROSSZ vagy HIBA státuszt jelenít meg.</w:t>
+      </w:r>
+    </w:p>
+    <w:p>
+      <w:pPr>
+        <w:pStyle w:val="Cmsor2"/>
+      </w:pPr>
+      <w:bookmarkStart w:id="11" w:name="_Toc229666691"/>
+      <w:r>
+        <w:t>barcode_detection.py</w:t>
+      </w:r>
+      <w:bookmarkEnd w:id="11"/>
+    </w:p>
+    <w:p>
+      <w:r>
+        <w:t xml:space="preserve">A vonalkód-gyanús területek kereséséért felel. A megoldás éldetektálást, morfológiai műveleteket, kontúrkeresést és forgatott téglalap alapú kivágást használ, amelynek az </w:t>
+      </w:r>
+      <w:proofErr w:type="spellStart"/>
+      <w:r>
+        <w:t>OpenCV</w:t>
+      </w:r>
+      <w:proofErr w:type="spellEnd"/>
+      <w:r>
+        <w:t xml:space="preserve"> képfeldolgozási könyvtárra épülnek [4], [6].</w:t>
+      </w:r>
+      <w:r>
+        <w:t xml:space="preserve"> A cél az, hogy a teljes képből olyan kisebb ROI-k készüljenek, amelyek nagy eséllyel tartalmazzák a vonalkódot.</w:t>
+      </w:r>
+    </w:p>
+    <w:p>
+      <w:pPr>
+        <w:pStyle w:val="Cmsor2"/>
+      </w:pPr>
+      <w:bookmarkStart w:id="12" w:name="_Toc229666692"/>
+      <w:r>
+        <w:t>image_processing.py</w:t>
+      </w:r>
+      <w:bookmarkEnd w:id="12"/>
+    </w:p>
+    <w:p>
+      <w:r>
+        <w:t xml:space="preserve">Az alapvető képfeldolgozási műveleteket tartalmazza: képbetöltés, szürkeárnyalatos konverzió, </w:t>
+      </w:r>
+      <w:proofErr w:type="spellStart"/>
+      <w:r>
+        <w:t>Otsu</w:t>
+      </w:r>
+      <w:proofErr w:type="spellEnd"/>
+      <w:r>
+        <w:t>-küszöbölés és adaptív küszöbölés [5]. Ezek a lépések a változó fényviszonyok miatt szükségesek.</w:t>
+      </w:r>
+    </w:p>
+    <w:p>
+      <w:pPr>
+        <w:pStyle w:val="Cmsor2"/>
+      </w:pPr>
+      <w:bookmarkStart w:id="13" w:name="_Toc229666693"/>
       <w:r>
         <w:lastRenderedPageBreak/>
-        <w:t>main.py</w:t>
-      </w:r>
-      <w:bookmarkEnd w:id="10"/>
+        <w:t>scanline.py</w:t>
+      </w:r>
+      <w:bookmarkEnd w:id="13"/>
+    </w:p>
+    <w:p>
+      <w:r>
+        <w:t xml:space="preserve">A </w:t>
+      </w:r>
+      <w:proofErr w:type="spellStart"/>
+      <w:r>
+        <w:t>binarizált</w:t>
+      </w:r>
+      <w:proofErr w:type="spellEnd"/>
+      <w:r>
+        <w:t xml:space="preserve"> képből vízszintes </w:t>
+      </w:r>
+      <w:proofErr w:type="spellStart"/>
+      <w:r>
+        <w:t>scanline-okat</w:t>
+      </w:r>
+      <w:proofErr w:type="spellEnd"/>
+      <w:r>
+        <w:t xml:space="preserve"> állít elő, majd ezekből fekete-fehér </w:t>
+      </w:r>
+      <w:proofErr w:type="spellStart"/>
+      <w:r>
+        <w:t>run</w:t>
+      </w:r>
+      <w:proofErr w:type="spellEnd"/>
+      <w:r>
+        <w:t xml:space="preserve"> </w:t>
+      </w:r>
+      <w:proofErr w:type="spellStart"/>
+      <w:r>
+        <w:t>sorozatokat</w:t>
+      </w:r>
+      <w:proofErr w:type="spellEnd"/>
+      <w:r>
+        <w:t xml:space="preserve"> készít. A </w:t>
+      </w:r>
+      <w:proofErr w:type="spellStart"/>
+      <w:r>
+        <w:t>run-length</w:t>
+      </w:r>
+      <w:proofErr w:type="spellEnd"/>
+      <w:r>
+        <w:t xml:space="preserve"> reprezentáció azért hasznos, mert az EAN-13 számjegyek valójában fekete és fehér sávok relatív szélességeiből állnak.</w:t>
+      </w:r>
     </w:p>
     <w:p>
       <w:pPr>
         <w:pStyle w:val="Cmsor2"/>
       </w:pPr>
-      <w:bookmarkStart w:id="11" w:name="_Toc229664413"/>
-      <w:r>
-        <w:t>barcode_detection.py</w:t>
-      </w:r>
-      <w:bookmarkEnd w:id="11"/>
+      <w:bookmarkStart w:id="14" w:name="_Toc229666694"/>
+      <w:r>
+        <w:t>pattern_decoder.py</w:t>
+      </w:r>
+      <w:bookmarkEnd w:id="14"/>
+    </w:p>
+    <w:p>
+      <w:r>
+        <w:t xml:space="preserve">A </w:t>
+      </w:r>
+      <w:proofErr w:type="spellStart"/>
+      <w:r>
+        <w:t>run-length</w:t>
+      </w:r>
+      <w:proofErr w:type="spellEnd"/>
+      <w:r>
+        <w:t xml:space="preserve"> alapú EAN-13 dekóder a bal oldali számjegyeket L/G, a jobb oldali számjegyeket R mintákkal hasonlítja össze. A dekódolás során távolságot számít a mért </w:t>
+      </w:r>
+      <w:proofErr w:type="spellStart"/>
+      <w:r>
+        <w:t>run</w:t>
+      </w:r>
+      <w:proofErr w:type="spellEnd"/>
+      <w:r>
+        <w:t>-arányok és az ismert EAN-13 minták között.</w:t>
+      </w:r>
     </w:p>
     <w:p>
       <w:pPr>
         <w:pStyle w:val="Cmsor2"/>
       </w:pPr>
-      <w:bookmarkStart w:id="12" w:name="_Toc229664414"/>
-      <w:r>
-        <w:t>image_processing.py</w:t>
-      </w:r>
-      <w:bookmarkEnd w:id="12"/>
+      <w:bookmarkStart w:id="15" w:name="_Toc229666695"/>
+      <w:r>
+        <w:t>decoder.py</w:t>
+      </w:r>
+      <w:bookmarkEnd w:id="15"/>
+    </w:p>
+    <w:p>
+      <w:r>
+        <w:t xml:space="preserve">A klasszikus 95 bites EAN-13 bitstruktúra dekódolásáért és a </w:t>
+      </w:r>
+      <w:proofErr w:type="spellStart"/>
+      <w:r>
+        <w:t>checksum</w:t>
+      </w:r>
+      <w:proofErr w:type="spellEnd"/>
+      <w:r>
+        <w:t xml:space="preserve"> ellenőrzésért felel [2]. Ez a modul tartalmazza az ellenőrző számjegy számítását is.</w:t>
+      </w:r>
     </w:p>
     <w:p>
       <w:pPr>
         <w:pStyle w:val="Cmsor2"/>
       </w:pPr>
-      <w:bookmarkStart w:id="13" w:name="_Toc229664415"/>
-      <w:r>
-        <w:t>scanline.py</w:t>
-      </w:r>
-      <w:bookmarkEnd w:id="13"/>
+      <w:bookmarkStart w:id="16" w:name="_Toc229666696"/>
+      <w:r>
+        <w:t>ean13_patterns.py</w:t>
+      </w:r>
+      <w:bookmarkEnd w:id="16"/>
+    </w:p>
+    <w:p>
+      <w:r>
+        <w:t>Az EAN-13 L, G és R bitmintáit, valamint az első számjegyhez tartozó paritásmintákat tartalmazza [2].</w:t>
+      </w:r>
     </w:p>
     <w:p>
       <w:pPr>
         <w:pStyle w:val="Cmsor2"/>
       </w:pPr>
-      <w:bookmarkStart w:id="14" w:name="_Toc229664416"/>
-      <w:r>
-        <w:t>pattern_decoder.py</w:t>
-      </w:r>
-      <w:bookmarkEnd w:id="14"/>
+      <w:bookmarkStart w:id="17" w:name="_Toc229666697"/>
+      <w:r>
+        <w:t>barcode_reader.py</w:t>
+      </w:r>
+      <w:bookmarkEnd w:id="17"/>
+    </w:p>
+    <w:p>
+      <w:r>
+        <w:t xml:space="preserve">A teljes olvasási folyamatot koordináló modul. Meghívja a ROI detektort, előállítja a bináris variánsokat, </w:t>
+      </w:r>
+      <w:proofErr w:type="spellStart"/>
+      <w:r>
+        <w:t>scanline-okat</w:t>
+      </w:r>
+      <w:proofErr w:type="spellEnd"/>
+      <w:r>
+        <w:t xml:space="preserve"> mintavételez, megpróbálja a </w:t>
+      </w:r>
+      <w:proofErr w:type="spellStart"/>
+      <w:r>
+        <w:t>run</w:t>
+      </w:r>
+      <w:proofErr w:type="spellEnd"/>
+      <w:r>
+        <w:t xml:space="preserve">-alapú dekódolást, szükség esetén bit-alapú </w:t>
+      </w:r>
+      <w:proofErr w:type="spellStart"/>
+      <w:r>
+        <w:t>fallback</w:t>
+      </w:r>
+      <w:proofErr w:type="spellEnd"/>
+      <w:r>
+        <w:t xml:space="preserve"> dekódolást használ, majd több találat alapján kiválasztja vagy elutasítja a végső eredményt.</w:t>
+      </w:r>
     </w:p>
     <w:p>
       <w:pPr>
         <w:pStyle w:val="Cmsor2"/>
       </w:pPr>
-      <w:bookmarkStart w:id="15" w:name="_Toc229664417"/>
-      <w:r>
-        <w:t>decoder.py</w:t>
-      </w:r>
-      <w:bookmarkEnd w:id="15"/>
+      <w:bookmarkStart w:id="18" w:name="_Toc229666698"/>
+      <w:r>
+        <w:t>stats_report.py</w:t>
+      </w:r>
+      <w:bookmarkEnd w:id="18"/>
+    </w:p>
+    <w:p>
+      <w:r>
+        <w:t xml:space="preserve">A statisztikai kiértékelést végző modul [9]. Nem módosítja a feldolgozási logikát, hanem a meglévő olvasófüggvényt hívja meg, majd az eredményeket státusz, hibakategória, </w:t>
+      </w:r>
+      <w:proofErr w:type="spellStart"/>
+      <w:r>
+        <w:t>score</w:t>
+      </w:r>
+      <w:proofErr w:type="spellEnd"/>
+      <w:r>
+        <w:t>, találatszám és módszerek szerint összesíti.</w:t>
+      </w:r>
+    </w:p>
+    <w:p>
+      <w:pPr>
+        <w:pStyle w:val="Cmsor1"/>
+      </w:pPr>
+      <w:bookmarkStart w:id="19" w:name="_Toc229666699"/>
+      <w:r>
+        <w:t>Feldolgozási folyamat</w:t>
+      </w:r>
+      <w:bookmarkEnd w:id="19"/>
+    </w:p>
+    <w:p>
+      <w:r>
+        <w:t>A feldolgozás fő lépései a sajá</w:t>
+      </w:r>
+      <w:r>
+        <w:t>t implementáció alapján a következők [8]:</w:t>
+      </w:r>
+    </w:p>
+    <w:p>
+      <w:pPr>
+        <w:pStyle w:val="Listaszerbekezds"/>
+        <w:numPr>
+          <w:ilvl w:val="0"/>
+          <w:numId w:val="4"/>
+        </w:numPr>
+      </w:pPr>
+      <w:r>
+        <w:t>Kép betöltése</w:t>
+      </w:r>
+    </w:p>
+    <w:p>
+      <w:pPr>
+        <w:pStyle w:val="Listaszerbekezds"/>
+        <w:numPr>
+          <w:ilvl w:val="0"/>
+          <w:numId w:val="4"/>
+        </w:numPr>
+      </w:pPr>
+      <w:r>
+        <w:t>Kép több forgatási variánsának előállítása</w:t>
+      </w:r>
+    </w:p>
+    <w:p>
+      <w:pPr>
+        <w:pStyle w:val="Listaszerbekezds"/>
+        <w:numPr>
+          <w:ilvl w:val="0"/>
+          <w:numId w:val="4"/>
+        </w:numPr>
+      </w:pPr>
+      <w:r>
+        <w:t>Vonalkód-gyanús ROI-k keresése</w:t>
+      </w:r>
+    </w:p>
+    <w:p>
+      <w:pPr>
+        <w:pStyle w:val="Listaszerbekezds"/>
+        <w:numPr>
+          <w:ilvl w:val="0"/>
+          <w:numId w:val="4"/>
+        </w:numPr>
+      </w:pPr>
+      <w:r>
+        <w:t>ROI-k előfeldolgozása szürkeárnyalatos és bináris képpé</w:t>
+      </w:r>
+    </w:p>
+    <w:p>
+      <w:pPr>
+        <w:pStyle w:val="Listaszerbekezds"/>
+        <w:numPr>
+          <w:ilvl w:val="0"/>
+          <w:numId w:val="4"/>
+        </w:numPr>
+      </w:pPr>
+      <w:r>
+        <w:t xml:space="preserve">Több </w:t>
+      </w:r>
+      <w:proofErr w:type="spellStart"/>
+      <w:r>
+        <w:t>binarizálási</w:t>
+      </w:r>
+      <w:proofErr w:type="spellEnd"/>
+      <w:r>
+        <w:t xml:space="preserve"> módszer kipróbálása</w:t>
+      </w:r>
+    </w:p>
+    <w:p>
+      <w:pPr>
+        <w:pStyle w:val="Listaszerbekezds"/>
+        <w:numPr>
+          <w:ilvl w:val="0"/>
+          <w:numId w:val="4"/>
+        </w:numPr>
+      </w:pPr>
+      <w:r>
+        <w:t xml:space="preserve">Több </w:t>
+      </w:r>
+      <w:proofErr w:type="spellStart"/>
+      <w:r>
+        <w:t>scanline</w:t>
+      </w:r>
+      <w:proofErr w:type="spellEnd"/>
+      <w:r>
+        <w:t xml:space="preserve"> mintavételezése a ROI középső tartományából</w:t>
+      </w:r>
+    </w:p>
+    <w:p>
+      <w:pPr>
+        <w:pStyle w:val="Listaszerbekezds"/>
+        <w:numPr>
+          <w:ilvl w:val="0"/>
+          <w:numId w:val="4"/>
+        </w:numPr>
+      </w:pPr>
+      <w:proofErr w:type="spellStart"/>
+      <w:r>
+        <w:t>Run-length</w:t>
+      </w:r>
+      <w:proofErr w:type="spellEnd"/>
+      <w:r>
+        <w:t xml:space="preserve"> sorozatok előállítása</w:t>
+      </w:r>
+    </w:p>
+    <w:p>
+      <w:pPr>
+        <w:pStyle w:val="Listaszerbekezds"/>
+        <w:numPr>
+          <w:ilvl w:val="0"/>
+          <w:numId w:val="4"/>
+        </w:numPr>
+      </w:pPr>
+      <w:proofErr w:type="spellStart"/>
+      <w:r>
+        <w:t>Run</w:t>
+      </w:r>
+      <w:proofErr w:type="spellEnd"/>
+      <w:r>
+        <w:t>-alapú EAN-13 dekódolás</w:t>
+      </w:r>
+    </w:p>
+    <w:p>
+      <w:pPr>
+        <w:pStyle w:val="Listaszerbekezds"/>
+        <w:numPr>
+          <w:ilvl w:val="0"/>
+          <w:numId w:val="4"/>
+        </w:numPr>
+      </w:pPr>
+      <w:r>
+        <w:lastRenderedPageBreak/>
+        <w:t xml:space="preserve">Sikertelenség esetén bit-alapú </w:t>
+      </w:r>
+      <w:proofErr w:type="spellStart"/>
+      <w:r>
+        <w:t>fallback</w:t>
+      </w:r>
+      <w:proofErr w:type="spellEnd"/>
+      <w:r>
+        <w:t xml:space="preserve"> dekódolás</w:t>
+      </w:r>
+    </w:p>
+    <w:p>
+      <w:pPr>
+        <w:pStyle w:val="Listaszerbekezds"/>
+        <w:numPr>
+          <w:ilvl w:val="0"/>
+          <w:numId w:val="4"/>
+        </w:numPr>
+      </w:pPr>
+      <w:proofErr w:type="spellStart"/>
+      <w:r>
+        <w:t>Checksum</w:t>
+      </w:r>
+      <w:proofErr w:type="spellEnd"/>
+      <w:r>
+        <w:t xml:space="preserve"> ellenőrzés</w:t>
+      </w:r>
+    </w:p>
+    <w:p>
+      <w:pPr>
+        <w:pStyle w:val="Listaszerbekezds"/>
+        <w:numPr>
+          <w:ilvl w:val="0"/>
+          <w:numId w:val="4"/>
+        </w:numPr>
+      </w:pPr>
+      <w:r>
+        <w:t xml:space="preserve">Több </w:t>
+      </w:r>
+      <w:proofErr w:type="spellStart"/>
+      <w:r>
+        <w:t>scanline</w:t>
+      </w:r>
+      <w:proofErr w:type="spellEnd"/>
+      <w:r>
+        <w:t>-találat összesítése</w:t>
+      </w:r>
+    </w:p>
+    <w:p>
+      <w:pPr>
+        <w:pStyle w:val="Listaszerbekezds"/>
+        <w:numPr>
+          <w:ilvl w:val="0"/>
+          <w:numId w:val="4"/>
+        </w:numPr>
+      </w:pPr>
+      <w:r>
+        <w:t>Bizonytalansági szabályok alkalmazása</w:t>
+      </w:r>
+    </w:p>
+    <w:p>
+      <w:pPr>
+        <w:pStyle w:val="Listaszerbekezds"/>
+        <w:numPr>
+          <w:ilvl w:val="0"/>
+          <w:numId w:val="4"/>
+        </w:numPr>
+      </w:pPr>
+      <w:r>
+        <w:t>OK, ROSSZ, HIBA státusz megállapítása</w:t>
+      </w:r>
+    </w:p>
+    <w:p>
+      <w:pPr>
+        <w:pStyle w:val="Cmsor1"/>
+      </w:pPr>
+      <w:bookmarkStart w:id="20" w:name="_Toc229666700"/>
+      <w:r>
+        <w:t>Előfeldolgozás és ROI detektálás</w:t>
+      </w:r>
+      <w:bookmarkEnd w:id="20"/>
+    </w:p>
+    <w:p>
+      <w:r>
+        <w:t>A ROI detektálás célja az, hogy a teljes képből a vonalkódot tartalmazó részeket kivágja [</w:t>
+      </w:r>
+      <w:r>
+        <w:t>8</w:t>
+      </w:r>
+      <w:r>
+        <w:t>].</w:t>
+      </w:r>
+      <w:r>
+        <w:t xml:space="preserve"> A program </w:t>
+      </w:r>
+      <w:proofErr w:type="spellStart"/>
+      <w:r>
+        <w:t>Sobel</w:t>
+      </w:r>
+      <w:proofErr w:type="spellEnd"/>
+      <w:r>
+        <w:t>-alapú vízszintes gradienskeresést használ, mert a vonalkód sok, egymáshoz közeli függőleges sávból áll, amelyek erős intenzitásváltozást okoznak vízszintes irányban [4], [8].</w:t>
+      </w:r>
+    </w:p>
+    <w:p>
+      <w:r>
+        <w:t xml:space="preserve">A gradiens képen Gaussian </w:t>
+      </w:r>
+      <w:proofErr w:type="spellStart"/>
+      <w:r>
+        <w:t>blur</w:t>
+      </w:r>
+      <w:proofErr w:type="spellEnd"/>
+      <w:r>
+        <w:t xml:space="preserve"> csökkenti a zajt, majd </w:t>
+      </w:r>
+      <w:proofErr w:type="spellStart"/>
+      <w:r>
+        <w:t>Otsu</w:t>
+      </w:r>
+      <w:proofErr w:type="spellEnd"/>
+      <w:r>
+        <w:t xml:space="preserve">-küszöbölés választja szét az erősebb éleket a háttértől [5], [8]. Ezután morfológiai zárás kapcsolja össze a vonalkód egymáshoz közeli sávjait egy nagyobb blokkszerű területté [6], [8]. A kontúrokból forgatott téglalapok készülnek, majd a program méret, oldalarány és terület alapján </w:t>
+      </w:r>
+      <w:proofErr w:type="spellStart"/>
+      <w:r>
+        <w:t xml:space="preserve">választja </w:t>
+      </w:r>
+      <w:proofErr w:type="spellEnd"/>
+      <w:r>
+        <w:t>ki a legerősebb jelölteket.</w:t>
+      </w:r>
+    </w:p>
+    <w:p>
+      <w:pPr>
+        <w:pStyle w:val="Cmsor1"/>
+      </w:pPr>
+      <w:bookmarkStart w:id="21" w:name="_Toc229666701"/>
+      <w:proofErr w:type="spellStart"/>
+      <w:r>
+        <w:t>Scanline</w:t>
+      </w:r>
+      <w:proofErr w:type="spellEnd"/>
+      <w:r>
+        <w:t>-alapú dekódolás</w:t>
+      </w:r>
+      <w:bookmarkEnd w:id="21"/>
+    </w:p>
+    <w:p>
+      <w:r>
+        <w:t xml:space="preserve">A program nem egyetlen sort próbál olvasni, hanem sok </w:t>
+      </w:r>
+      <w:proofErr w:type="spellStart"/>
+      <w:r>
+        <w:t>scanline</w:t>
+      </w:r>
+      <w:proofErr w:type="spellEnd"/>
+      <w:r>
+        <w:t xml:space="preserve">-t mintavételez a ROI középső tartományából [8]. Ennek az oka, hogy egy termékfotón a vonalkód gyakran ferde, görbült, részben homályos vagy lokálisan sérült. Több </w:t>
+      </w:r>
+      <w:proofErr w:type="spellStart"/>
+      <w:r>
+        <w:t>scanline</w:t>
+      </w:r>
+      <w:proofErr w:type="spellEnd"/>
+      <w:r>
+        <w:t xml:space="preserve"> használatával nő az esély arra, hogy legalább néhány sor stabilan átmenjen a vonalkód teljes szélességén.</w:t>
+      </w:r>
+    </w:p>
+    <w:p>
+      <w:r>
+        <w:t xml:space="preserve">A </w:t>
+      </w:r>
+      <w:proofErr w:type="spellStart"/>
+      <w:r>
+        <w:t>scanline</w:t>
+      </w:r>
+      <w:proofErr w:type="spellEnd"/>
+      <w:r>
+        <w:t xml:space="preserve">-okból </w:t>
+      </w:r>
+      <w:proofErr w:type="spellStart"/>
+      <w:r>
+        <w:t>run-length</w:t>
+      </w:r>
+      <w:proofErr w:type="spellEnd"/>
+      <w:r>
+        <w:t xml:space="preserve"> sorozat készül.</w:t>
+      </w:r>
+      <w:r>
+        <w:t xml:space="preserve"> Egy </w:t>
+      </w:r>
+      <w:proofErr w:type="spellStart"/>
+      <w:r>
+        <w:t>run</w:t>
+      </w:r>
+      <w:proofErr w:type="spellEnd"/>
+      <w:r>
+        <w:t xml:space="preserve"> azt jelenti, hogy egymás után hány azonos színű pixel következik. Az EAN-13 számjegyei sávszélesség-arányokkal írhatóak le, ezért a </w:t>
+      </w:r>
+      <w:proofErr w:type="spellStart"/>
+      <w:r>
+        <w:t>run</w:t>
+      </w:r>
+      <w:proofErr w:type="spellEnd"/>
+      <w:r>
+        <w:t>-alapú dekódolás közvetlenül illeszkedik a vonalkód természetéhez.</w:t>
+      </w:r>
+    </w:p>
+    <w:p>
+      <w:pPr>
+        <w:pStyle w:val="Cmsor1"/>
+      </w:pPr>
+      <w:bookmarkStart w:id="22" w:name="_Toc229666702"/>
+      <w:proofErr w:type="spellStart"/>
+      <w:r>
+        <w:t>Run</w:t>
+      </w:r>
+      <w:proofErr w:type="spellEnd"/>
+      <w:r>
+        <w:t>-alapú és bit-alapú dekódolás</w:t>
+      </w:r>
+      <w:bookmarkEnd w:id="22"/>
+    </w:p>
+    <w:p>
+      <w:r>
+        <w:t xml:space="preserve">Az elsődleges dekódolási módszer a </w:t>
+      </w:r>
+      <w:proofErr w:type="spellStart"/>
+      <w:r>
+        <w:t>run</w:t>
+      </w:r>
+      <w:proofErr w:type="spellEnd"/>
+      <w:r>
+        <w:t xml:space="preserve">-alapú mintaillesztés [8]. A program a mért </w:t>
+      </w:r>
+      <w:proofErr w:type="spellStart"/>
+      <w:r>
+        <w:t>run</w:t>
+      </w:r>
+      <w:proofErr w:type="spellEnd"/>
+      <w:r>
+        <w:t>-arányokat összehasonlítja az EAN-13 ismert L, G és R számjegymintáival. Minden számjegyhez egy távolságérték tartozik, minél kisebb ez az érték, annál jobban hasonlít a mért minta az adott számjegyre.</w:t>
+      </w:r>
+    </w:p>
+    <w:p>
+      <w:r>
+        <w:t xml:space="preserve">Ha a </w:t>
+      </w:r>
+      <w:proofErr w:type="spellStart"/>
+      <w:r>
+        <w:t>run</w:t>
+      </w:r>
+      <w:proofErr w:type="spellEnd"/>
+      <w:r>
+        <w:t xml:space="preserve">-alapú módszer sikertelen, a program </w:t>
+      </w:r>
+      <w:proofErr w:type="spellStart"/>
+      <w:r>
+        <w:t>fallback</w:t>
+      </w:r>
+      <w:proofErr w:type="spellEnd"/>
+      <w:r>
+        <w:t xml:space="preserve"> módszerként megpróbálja a </w:t>
+      </w:r>
+      <w:proofErr w:type="spellStart"/>
+      <w:r>
+        <w:t>run</w:t>
+      </w:r>
+      <w:proofErr w:type="spellEnd"/>
+      <w:r>
+        <w:t xml:space="preserve"> sorozatot 95 bites EAN struktúrává alakítani [2], [8]. Ezután ellenőrzi a start, </w:t>
+      </w:r>
+      <w:proofErr w:type="spellStart"/>
+      <w:r>
+        <w:t>middle</w:t>
+      </w:r>
+      <w:proofErr w:type="spellEnd"/>
+      <w:r>
+        <w:t xml:space="preserve"> és end </w:t>
+      </w:r>
+      <w:proofErr w:type="spellStart"/>
+      <w:r>
+        <w:t>guard</w:t>
+      </w:r>
+      <w:proofErr w:type="spellEnd"/>
+      <w:r>
+        <w:t xml:space="preserve"> biteket, majd a 7 bites számjegycsoportokat dekódolja. Ez a </w:t>
+      </w:r>
+      <w:proofErr w:type="spellStart"/>
+      <w:r>
+        <w:t>fallback</w:t>
+      </w:r>
+      <w:proofErr w:type="spellEnd"/>
+      <w:r>
+        <w:t xml:space="preserve"> bizonyos esetekben segít, de általában kevésbé stabil, mint a </w:t>
+      </w:r>
+      <w:proofErr w:type="spellStart"/>
+      <w:r>
+        <w:t>run</w:t>
+      </w:r>
+      <w:proofErr w:type="spellEnd"/>
+      <w:r>
+        <w:t>-alapú illesztés.</w:t>
+      </w:r>
+    </w:p>
+    <w:p>
+      <w:pPr>
+        <w:pStyle w:val="Cmsor1"/>
+      </w:pPr>
+      <w:bookmarkStart w:id="23" w:name="_Toc229666703"/>
+      <w:r>
+        <w:lastRenderedPageBreak/>
+        <w:t>Hibakezelés és bizonytalansági logika</w:t>
+      </w:r>
+      <w:bookmarkEnd w:id="23"/>
+    </w:p>
+    <w:p>
+      <w:r>
+        <w:t xml:space="preserve">A rendszer nem minden </w:t>
+      </w:r>
+      <w:proofErr w:type="spellStart"/>
+      <w:r>
+        <w:t>checksum</w:t>
+      </w:r>
+      <w:proofErr w:type="spellEnd"/>
+      <w:r>
+        <w:t xml:space="preserve">-helyes kódot fogad el automatikusan [8]. Ez fontos döntés, mert a véletlenül talált hamis </w:t>
+      </w:r>
+      <w:r>
+        <w:t>minták</w:t>
+      </w:r>
+      <w:r>
+        <w:t xml:space="preserve"> is eredményezhetnek </w:t>
+      </w:r>
+      <w:proofErr w:type="spellStart"/>
+      <w:r>
+        <w:t>checksum</w:t>
+      </w:r>
+      <w:proofErr w:type="spellEnd"/>
+      <w:r>
+        <w:t>-helyes EAN-13 számot.</w:t>
+      </w:r>
+      <w:r>
+        <w:t xml:space="preserve"> A program ezért </w:t>
+      </w:r>
+      <w:proofErr w:type="spellStart"/>
+      <w:r>
+        <w:t>score</w:t>
+      </w:r>
+      <w:proofErr w:type="spellEnd"/>
+      <w:r>
+        <w:t>, találatszám, módszercsalád és alternatív jelöltek alapján dönt.</w:t>
+      </w:r>
+    </w:p>
+    <w:p>
+      <w:r>
+        <w:t xml:space="preserve">A bizonytalansági logika célja, hogy a </w:t>
+      </w:r>
+      <w:proofErr w:type="spellStart"/>
+      <w:r>
+        <w:t>scanner</w:t>
+      </w:r>
+      <w:proofErr w:type="spellEnd"/>
+      <w:r>
+        <w:t xml:space="preserve"> inkább hibát jelezzen, mintsem rossz kódot adjon vissza. Ez különösen fontos olyan környezetben, ahol a visszaadott vonalkód alapján termékazonosítás, készletkezelés vagy további automatikus feldolgozás történik.</w:t>
+      </w:r>
+    </w:p>
+    <w:p>
+      <w:pPr>
+        <w:pStyle w:val="Cmsor1"/>
+      </w:pPr>
+      <w:bookmarkStart w:id="24" w:name="_Toc229666704"/>
+      <w:r>
+        <w:t>Statisztika értékelése</w:t>
+      </w:r>
+      <w:bookmarkEnd w:id="24"/>
     </w:p>
     <w:p>
       <w:pPr>
         <w:pStyle w:val="Cmsor2"/>
       </w:pPr>
-      <w:bookmarkStart w:id="16" w:name="_Toc229664418"/>
-      <w:r>
-        <w:t>ean13_patterns.py</w:t>
-      </w:r>
-      <w:bookmarkEnd w:id="16"/>
+      <w:bookmarkStart w:id="25" w:name="_Toc229666705"/>
+      <w:r>
+        <w:t>Hibakategóriák elemzése</w:t>
+      </w:r>
+      <w:bookmarkEnd w:id="25"/>
     </w:p>
     <w:p>
       <w:pPr>
         <w:pStyle w:val="Cmsor2"/>
       </w:pPr>
-      <w:bookmarkStart w:id="17" w:name="_Toc229664419"/>
-      <w:r>
-        <w:t>barcode_reader.py</w:t>
-      </w:r>
-      <w:bookmarkEnd w:id="17"/>
+      <w:bookmarkStart w:id="26" w:name="_Toc229666706"/>
+      <w:proofErr w:type="spellStart"/>
+      <w:r>
+        <w:t>Score</w:t>
+      </w:r>
+      <w:proofErr w:type="spellEnd"/>
+      <w:r>
+        <w:t xml:space="preserve"> és találatszám összehasonlítása</w:t>
+      </w:r>
+      <w:bookmarkEnd w:id="26"/>
     </w:p>
     <w:p>
       <w:pPr>
         <w:pStyle w:val="Cmsor2"/>
       </w:pPr>
-      <w:bookmarkStart w:id="18" w:name="_Toc229664420"/>
-      <w:r>
-        <w:t>stats_report.py</w:t>
-      </w:r>
-      <w:bookmarkEnd w:id="18"/>
+      <w:bookmarkStart w:id="27" w:name="_Toc229666707"/>
+      <w:r>
+        <w:t>A hibás olvasások jelentősége</w:t>
+      </w:r>
+      <w:bookmarkEnd w:id="27"/>
+    </w:p>
+    <w:p>
+      <w:pPr>
+        <w:pStyle w:val="Cmsor2"/>
+      </w:pPr>
+      <w:bookmarkStart w:id="28" w:name="_Toc229666708"/>
+      <w:r>
+        <w:t>Módszercsaládok szerepe</w:t>
+      </w:r>
+      <w:bookmarkEnd w:id="28"/>
+    </w:p>
+    <w:p>
+      <w:pPr>
+        <w:pStyle w:val="Cmsor2"/>
+      </w:pPr>
+      <w:bookmarkStart w:id="29" w:name="_Toc229666709"/>
+      <w:r>
+        <w:t>ROI detektálás értékelése</w:t>
+      </w:r>
+      <w:bookmarkEnd w:id="29"/>
     </w:p>
     <w:p>
       <w:pPr>
         <w:pStyle w:val="Cmsor1"/>
       </w:pPr>
-      <w:bookmarkStart w:id="19" w:name="_Toc229664421"/>
-      <w:r>
-        <w:t>Feldolgozási folyamat</w:t>
-      </w:r>
-      <w:bookmarkEnd w:id="19"/>
+      <w:bookmarkStart w:id="30" w:name="_Toc229666710"/>
+      <w:r>
+        <w:t>Eredmények értelmezése</w:t>
+      </w:r>
+      <w:bookmarkEnd w:id="30"/>
     </w:p>
     <w:p>
       <w:pPr>
         <w:pStyle w:val="Cmsor1"/>
       </w:pPr>
-      <w:bookmarkStart w:id="20" w:name="_Toc229664422"/>
-      <w:r>
-        <w:t>Előfeldolgozás és ROI detektálás</w:t>
-      </w:r>
-      <w:bookmarkEnd w:id="20"/>
+      <w:bookmarkStart w:id="31" w:name="_Toc229666711"/>
+      <w:r>
+        <w:t>Fejlesztési lehetőségek</w:t>
+      </w:r>
+      <w:bookmarkEnd w:id="31"/>
     </w:p>
     <w:p>
       <w:pPr>
         <w:pStyle w:val="Cmsor1"/>
       </w:pPr>
-      <w:bookmarkStart w:id="21" w:name="_Toc229664423"/>
-      <w:r>
-        <w:t>Scanline-alapú dekódolás</w:t>
-      </w:r>
-      <w:bookmarkEnd w:id="21"/>
+      <w:bookmarkStart w:id="32" w:name="_Toc229666712"/>
+      <w:r>
+        <w:t>Összegzés</w:t>
+      </w:r>
+      <w:bookmarkEnd w:id="32"/>
     </w:p>
     <w:p>
       <w:pPr>
         <w:pStyle w:val="Cmsor1"/>
       </w:pPr>
-      <w:bookmarkStart w:id="22" w:name="_Toc229664424"/>
-      <w:r>
-        <w:t>Run-alapú és bit-alapú dekódolás</w:t>
-      </w:r>
-      <w:bookmarkEnd w:id="22"/>
-    </w:p>
-    <w:p>
-      <w:pPr>
-        <w:pStyle w:val="Cmsor1"/>
-      </w:pPr>
-      <w:bookmarkStart w:id="23" w:name="_Toc229664425"/>
-      <w:r>
-        <w:t>Hibakezelés és bizonytalansági logika</w:t>
-      </w:r>
-      <w:bookmarkEnd w:id="23"/>
-    </w:p>
-    <w:p>
-      <w:pPr>
-        <w:pStyle w:val="Cmsor1"/>
-      </w:pPr>
-      <w:bookmarkStart w:id="24" w:name="_Toc229664426"/>
-      <w:r>
-        <w:t>Statisztika értékelése</w:t>
-      </w:r>
-      <w:bookmarkEnd w:id="24"/>
-    </w:p>
-    <w:p>
-      <w:pPr>
-        <w:pStyle w:val="Cmsor2"/>
-      </w:pPr>
-      <w:bookmarkStart w:id="25" w:name="_Toc229664427"/>
-      <w:r>
-        <w:t>Hibakategóriák elemzése</w:t>
-      </w:r>
-      <w:bookmarkEnd w:id="25"/>
-    </w:p>
-    <w:p>
-      <w:pPr>
-        <w:pStyle w:val="Cmsor2"/>
-      </w:pPr>
-      <w:bookmarkStart w:id="26" w:name="_Toc229664428"/>
-      <w:r>
-        <w:t>Score és találatszám összehasonlítása</w:t>
-      </w:r>
-      <w:bookmarkEnd w:id="26"/>
-    </w:p>
-    <w:p>
-      <w:pPr>
-        <w:pStyle w:val="Cmsor2"/>
-      </w:pPr>
-      <w:bookmarkStart w:id="27" w:name="_Toc229664429"/>
-      <w:r>
-        <w:t>A hibás olvasások jelentősége</w:t>
-      </w:r>
-      <w:bookmarkEnd w:id="27"/>
-    </w:p>
-    <w:p>
-      <w:pPr>
-        <w:pStyle w:val="Cmsor2"/>
-      </w:pPr>
-      <w:bookmarkStart w:id="28" w:name="_Toc229664430"/>
-      <w:r>
-        <w:t>Módszercsaládok szerepe</w:t>
-      </w:r>
-      <w:bookmarkEnd w:id="28"/>
-    </w:p>
-    <w:p>
-      <w:pPr>
-        <w:pStyle w:val="Cmsor2"/>
-      </w:pPr>
-      <w:bookmarkStart w:id="29" w:name="_Toc229664431"/>
-      <w:r>
-        <w:t>ROI detektálás értékelése</w:t>
-      </w:r>
-      <w:bookmarkEnd w:id="29"/>
-    </w:p>
-    <w:p>
-      <w:pPr>
-        <w:pStyle w:val="Cmsor1"/>
-      </w:pPr>
-      <w:bookmarkStart w:id="30" w:name="_Toc229664432"/>
+      <w:bookmarkStart w:id="33" w:name="_Toc229666713"/>
+      <w:r>
+        <w:t>Források</w:t>
+      </w:r>
+      <w:bookmarkEnd w:id="33"/>
+    </w:p>
+    <w:p>
+      <w:pPr>
+        <w:jc w:val="left"/>
+      </w:pPr>
+      <w:r>
+        <w:t>[1] GS1, „</w:t>
+      </w:r>
+      <w:proofErr w:type="spellStart"/>
+      <w:r>
+        <w:t>Barcodes</w:t>
+      </w:r>
+      <w:proofErr w:type="spellEnd"/>
+      <w:r>
+        <w:t>,” GS1. [Online]. Elérhető: https://www.gs1.org/standards/barcodes. [Hozzáférés: 2026. május 14.]</w:t>
+      </w:r>
+    </w:p>
+    <w:p>
+      <w:pPr>
+        <w:jc w:val="left"/>
+      </w:pPr>
+      <w:r>
+        <w:t xml:space="preserve">[2] GS1, „EAN/UPC </w:t>
+      </w:r>
+      <w:proofErr w:type="spellStart"/>
+      <w:r>
+        <w:t>barcodes</w:t>
+      </w:r>
+      <w:proofErr w:type="spellEnd"/>
+      <w:r>
+        <w:t>,” GS1. [Online]. Elérhető: https://www.gs1.org/standards/barcodes/ean-upc. [Hozzáférés: 2026. május 14.]</w:t>
+      </w:r>
+    </w:p>
+    <w:p>
+      <w:pPr>
+        <w:jc w:val="left"/>
+      </w:pPr>
+      <w:r>
+        <w:t>[3] GS1 US, „</w:t>
+      </w:r>
+      <w:proofErr w:type="spellStart"/>
+      <w:r>
+        <w:t>What</w:t>
+      </w:r>
+      <w:proofErr w:type="spellEnd"/>
+      <w:r>
+        <w:t xml:space="preserve"> is a </w:t>
+      </w:r>
+      <w:proofErr w:type="gramStart"/>
+      <w:r>
+        <w:t>GTIN?,</w:t>
+      </w:r>
+      <w:proofErr w:type="gramEnd"/>
+      <w:r>
+        <w:t>” GS1 US. [Online]. Elérhető: https://www.gs1us.org/upcs-barcodes-prefixes/what-is-a-gtin. [Hozzáférés: 2026. május 14.]</w:t>
+      </w:r>
+    </w:p>
+    <w:p>
+      <w:pPr>
+        <w:jc w:val="left"/>
+      </w:pPr>
       <w:r>
         <w:lastRenderedPageBreak/>
-        <w:t>Eredmények értelmezése</w:t>
-      </w:r>
-      <w:bookmarkEnd w:id="30"/>
-    </w:p>
-    <w:p>
-      <w:pPr>
-        <w:pStyle w:val="Cmsor1"/>
-      </w:pPr>
-      <w:bookmarkStart w:id="31" w:name="_Toc229664433"/>
-      <w:r>
-        <w:t>Fejlesztési lehetőségek</w:t>
-      </w:r>
-      <w:bookmarkEnd w:id="31"/>
-    </w:p>
-    <w:p>
-      <w:pPr>
-        <w:pStyle w:val="Cmsor1"/>
-      </w:pPr>
-      <w:bookmarkStart w:id="32" w:name="_Toc229664434"/>
-      <w:r>
-        <w:t>Összegzés</w:t>
-      </w:r>
-      <w:bookmarkEnd w:id="32"/>
-    </w:p>
-    <w:p>
-      <w:pPr>
-        <w:pStyle w:val="Cmsor1"/>
-      </w:pPr>
-      <w:bookmarkStart w:id="33" w:name="_Toc229664435"/>
-      <w:r>
-        <w:t>Források</w:t>
-      </w:r>
-      <w:bookmarkEnd w:id="33"/>
+        <w:t xml:space="preserve">[4] </w:t>
+      </w:r>
+      <w:proofErr w:type="spellStart"/>
+      <w:r>
+        <w:t>OpenCV</w:t>
+      </w:r>
+      <w:proofErr w:type="spellEnd"/>
+      <w:r>
+        <w:t xml:space="preserve">, „Image </w:t>
+      </w:r>
+      <w:proofErr w:type="spellStart"/>
+      <w:r>
+        <w:t>Processing</w:t>
+      </w:r>
+      <w:proofErr w:type="spellEnd"/>
+      <w:r>
+        <w:t xml:space="preserve"> (</w:t>
+      </w:r>
+      <w:proofErr w:type="spellStart"/>
+      <w:r>
+        <w:t>imgproc</w:t>
+      </w:r>
+      <w:proofErr w:type="spellEnd"/>
+      <w:r>
+        <w:t xml:space="preserve"> </w:t>
+      </w:r>
+      <w:proofErr w:type="spellStart"/>
+      <w:r>
+        <w:t>module</w:t>
+      </w:r>
+      <w:proofErr w:type="spellEnd"/>
+      <w:r>
+        <w:t xml:space="preserve">),” </w:t>
+      </w:r>
+      <w:proofErr w:type="spellStart"/>
+      <w:r>
+        <w:t>OpenCV</w:t>
+      </w:r>
+      <w:proofErr w:type="spellEnd"/>
+      <w:r>
+        <w:t xml:space="preserve"> </w:t>
+      </w:r>
+      <w:proofErr w:type="spellStart"/>
+      <w:r>
+        <w:t>Documentation</w:t>
+      </w:r>
+      <w:proofErr w:type="spellEnd"/>
+      <w:r>
+        <w:t>. [Online]. Elérhető: https://docs.opencv.org/3.4/d7/da8/tutorial_table_of_content_imgproc.html. [Hozzáférés: 2026. május 14.]</w:t>
+      </w:r>
     </w:p>
     <w:p>
       <w:pPr>
         <w:jc w:val="left"/>
       </w:pPr>
       <w:r>
-        <w:t>[1] GS1, „Barcodes,” GS1. [Online]. Elérhető: https://www.gs1.org/standards/barcodes. [Hozzáférés: 2026. május 14.]</w:t>
+        <w:t xml:space="preserve">[5] </w:t>
+      </w:r>
+      <w:proofErr w:type="spellStart"/>
+      <w:r>
+        <w:t>OpenCV</w:t>
+      </w:r>
+      <w:proofErr w:type="spellEnd"/>
+      <w:r>
+        <w:t xml:space="preserve">-Python </w:t>
+      </w:r>
+      <w:proofErr w:type="spellStart"/>
+      <w:r>
+        <w:t>Tutorials</w:t>
+      </w:r>
+      <w:proofErr w:type="spellEnd"/>
+      <w:r>
+        <w:t xml:space="preserve">, „Image </w:t>
+      </w:r>
+      <w:proofErr w:type="spellStart"/>
+      <w:r>
+        <w:t>Thresholding</w:t>
+      </w:r>
+      <w:proofErr w:type="spellEnd"/>
+      <w:r>
+        <w:t xml:space="preserve">,” </w:t>
+      </w:r>
+      <w:proofErr w:type="spellStart"/>
+      <w:r>
+        <w:t>OpenCV</w:t>
+      </w:r>
+      <w:proofErr w:type="spellEnd"/>
+      <w:r>
+        <w:t xml:space="preserve">-Python </w:t>
+      </w:r>
+      <w:proofErr w:type="spellStart"/>
+      <w:r>
+        <w:t>Tutorials</w:t>
+      </w:r>
+      <w:proofErr w:type="spellEnd"/>
+      <w:r>
+        <w:t>. [Online]. Elérhető: https://opencv24-python-tutorials.readthedocs.io/en/latest/py_tutorials/py_imgproc/py_thresholding/py_thresholding.html. [Hozzáférés: 2026. május 14.]</w:t>
       </w:r>
     </w:p>
     <w:p>
@@ -4051,7 +5108,55 @@
         <w:jc w:val="left"/>
       </w:pPr>
       <w:r>
-        <w:t>[2] GS1, „EAN/UPC barcodes,” GS1. [Online]. Elérhető: https://www.gs1.org/standards/barcodes/ean-upc. [Hozzáférés: 2026. május 14.]</w:t>
+        <w:t xml:space="preserve">[6] </w:t>
+      </w:r>
+      <w:proofErr w:type="spellStart"/>
+      <w:r>
+        <w:t>OpenCV</w:t>
+      </w:r>
+      <w:proofErr w:type="spellEnd"/>
+      <w:r>
+        <w:t xml:space="preserve">-Python </w:t>
+      </w:r>
+      <w:proofErr w:type="spellStart"/>
+      <w:r>
+        <w:t>Tutorials</w:t>
+      </w:r>
+      <w:proofErr w:type="spellEnd"/>
+      <w:r>
+        <w:t>, „</w:t>
+      </w:r>
+      <w:proofErr w:type="spellStart"/>
+      <w:r>
+        <w:t>Morphological</w:t>
+      </w:r>
+      <w:proofErr w:type="spellEnd"/>
+      <w:r>
+        <w:t xml:space="preserve"> </w:t>
+      </w:r>
+      <w:proofErr w:type="spellStart"/>
+      <w:r>
+        <w:t>Transformations</w:t>
+      </w:r>
+      <w:proofErr w:type="spellEnd"/>
+      <w:r>
+        <w:t xml:space="preserve">,” </w:t>
+      </w:r>
+      <w:proofErr w:type="spellStart"/>
+      <w:r>
+        <w:t>OpenCV</w:t>
+      </w:r>
+      <w:proofErr w:type="spellEnd"/>
+      <w:r>
+        <w:t xml:space="preserve">-Python </w:t>
+      </w:r>
+      <w:proofErr w:type="spellStart"/>
+      <w:r>
+        <w:t>Tutorials</w:t>
+      </w:r>
+      <w:proofErr w:type="spellEnd"/>
+      <w:r>
+        <w:t>. [Online]. Elérhető: https://opencv24-python-tutorials.readthedocs.io/en/latest/py_tutorials/py_imgproc/py_morphological_ops/py_morphological_ops.html. [Hozzáférés: 2026. május 14.]</w:t>
       </w:r>
     </w:p>
     <w:p>
@@ -4059,39 +5164,31 @@
         <w:jc w:val="left"/>
       </w:pPr>
       <w:r>
-        <w:t>[3] GS1 US, „What is a GTIN?,” GS1 US. [Online]. Elérhető: https://www.gs1us.org/upcs-barcodes-prefixes/what-is-a-gtin. [Hozzáférés: 2026. május 14.]</w:t>
-      </w:r>
-    </w:p>
-    <w:p>
-      <w:pPr>
-        <w:jc w:val="left"/>
-      </w:pPr>
-      <w:r>
-        <w:t>[4] OpenCV, „Image Processing (imgproc module),” OpenCV Documentation. [Online]. Elérhető: https://docs.opencv.org/3.4/d7/da8/tutorial_table_of_content_imgproc.html. [Hozzáférés: 2026. május 14.]</w:t>
-      </w:r>
-    </w:p>
-    <w:p>
-      <w:pPr>
-        <w:jc w:val="left"/>
-      </w:pPr>
-      <w:r>
-        <w:t>[5] OpenCV-Python Tutorials, „Image Thresholding,” OpenCV-Python Tutorials. [Online]. Elérhető: https://opencv24-python-tutorials.readthedocs.io/en/latest/py_tutorials/py_imgproc/py_thresholding/py_thresholding.html. [Hozzáférés: 2026. május 14.]</w:t>
-      </w:r>
-    </w:p>
-    <w:p>
-      <w:pPr>
-        <w:jc w:val="left"/>
-      </w:pPr>
-      <w:r>
-        <w:t>[6] OpenCV-Python Tutorials, „Morphological Transformations,” OpenCV-Python Tutorials. [Online]. Elérhető: https://opencv24-python-tutorials.readthedocs.io/en/latest/py_tutorials/py_imgproc/py_morphological_ops/py_morphological_ops.html. [Hozzáférés: 2026. május 14.]</w:t>
-      </w:r>
-    </w:p>
-    <w:p>
-      <w:pPr>
-        <w:jc w:val="left"/>
-      </w:pPr>
-      <w:r>
-        <w:t>[7] S0dium, „DEAL KAIST Lab Barcode Main,” Kaggle. [Online]. Elérhető: https://www.kaggle.com/datasets/s0dium/deal-kaist-lab-barcode-main/data. [Hozzáférés: 2026. május 14.]</w:t>
+        <w:t xml:space="preserve">[7] S0dium, „DEAL KAIST </w:t>
+      </w:r>
+      <w:proofErr w:type="spellStart"/>
+      <w:r>
+        <w:t>Lab</w:t>
+      </w:r>
+      <w:proofErr w:type="spellEnd"/>
+      <w:r>
+        <w:t xml:space="preserve"> </w:t>
+      </w:r>
+      <w:proofErr w:type="spellStart"/>
+      <w:r>
+        <w:t>Barcode</w:t>
+      </w:r>
+      <w:proofErr w:type="spellEnd"/>
+      <w:r>
+        <w:t xml:space="preserve"> Main,” </w:t>
+      </w:r>
+      <w:proofErr w:type="spellStart"/>
+      <w:r>
+        <w:t>Kaggle</w:t>
+      </w:r>
+      <w:proofErr w:type="spellEnd"/>
+      <w:r>
+        <w:t>. [Online]. Elérhető: https://www.kaggle.com/datasets/s0dium/deal-kaist-lab-barcode-main/data. [Hozzáférés: 2026. május 14.]</w:t>
       </w:r>
     </w:p>
     <w:p>
@@ -4406,6 +5503,95 @@
     </w:lvl>
   </w:abstractNum>
   <w:abstractNum w:abstractNumId="1" w15:restartNumberingAfterBreak="0">
+    <w:nsid w:val="2B2E2EA2"/>
+    <w:multiLevelType w:val="hybridMultilevel"/>
+    <w:tmpl w:val="430A59F8"/>
+    <w:lvl w:ilvl="0" w:tplc="040E000F">
+      <w:start w:val="1"/>
+      <w:numFmt w:val="decimal"/>
+      <w:lvlText w:val="%1."/>
+      <w:lvlJc w:val="left"/>
+      <w:pPr>
+        <w:ind w:left="720" w:hanging="360"/>
+      </w:pPr>
+      <w:rPr>
+        <w:rFonts w:hint="default"/>
+      </w:rPr>
+    </w:lvl>
+    <w:lvl w:ilvl="1" w:tplc="040E0019" w:tentative="1">
+      <w:start w:val="1"/>
+      <w:numFmt w:val="lowerLetter"/>
+      <w:lvlText w:val="%2."/>
+      <w:lvlJc w:val="left"/>
+      <w:pPr>
+        <w:ind w:left="1440" w:hanging="360"/>
+      </w:pPr>
+    </w:lvl>
+    <w:lvl w:ilvl="2" w:tplc="040E001B" w:tentative="1">
+      <w:start w:val="1"/>
+      <w:numFmt w:val="lowerRoman"/>
+      <w:lvlText w:val="%3."/>
+      <w:lvlJc w:val="right"/>
+      <w:pPr>
+        <w:ind w:left="2160" w:hanging="180"/>
+      </w:pPr>
+    </w:lvl>
+    <w:lvl w:ilvl="3" w:tplc="040E000F" w:tentative="1">
+      <w:start w:val="1"/>
+      <w:numFmt w:val="decimal"/>
+      <w:lvlText w:val="%4."/>
+      <w:lvlJc w:val="left"/>
+      <w:pPr>
+        <w:ind w:left="2880" w:hanging="360"/>
+      </w:pPr>
+    </w:lvl>
+    <w:lvl w:ilvl="4" w:tplc="040E0019" w:tentative="1">
+      <w:start w:val="1"/>
+      <w:numFmt w:val="lowerLetter"/>
+      <w:lvlText w:val="%5."/>
+      <w:lvlJc w:val="left"/>
+      <w:pPr>
+        <w:ind w:left="3600" w:hanging="360"/>
+      </w:pPr>
+    </w:lvl>
+    <w:lvl w:ilvl="5" w:tplc="040E001B" w:tentative="1">
+      <w:start w:val="1"/>
+      <w:numFmt w:val="lowerRoman"/>
+      <w:lvlText w:val="%6."/>
+      <w:lvlJc w:val="right"/>
+      <w:pPr>
+        <w:ind w:left="4320" w:hanging="180"/>
+      </w:pPr>
+    </w:lvl>
+    <w:lvl w:ilvl="6" w:tplc="040E000F" w:tentative="1">
+      <w:start w:val="1"/>
+      <w:numFmt w:val="decimal"/>
+      <w:lvlText w:val="%7."/>
+      <w:lvlJc w:val="left"/>
+      <w:pPr>
+        <w:ind w:left="5040" w:hanging="360"/>
+      </w:pPr>
+    </w:lvl>
+    <w:lvl w:ilvl="7" w:tplc="040E0019" w:tentative="1">
+      <w:start w:val="1"/>
+      <w:numFmt w:val="lowerLetter"/>
+      <w:lvlText w:val="%8."/>
+      <w:lvlJc w:val="left"/>
+      <w:pPr>
+        <w:ind w:left="5760" w:hanging="360"/>
+      </w:pPr>
+    </w:lvl>
+    <w:lvl w:ilvl="8" w:tplc="040E001B" w:tentative="1">
+      <w:start w:val="1"/>
+      <w:numFmt w:val="lowerRoman"/>
+      <w:lvlText w:val="%9."/>
+      <w:lvlJc w:val="right"/>
+      <w:pPr>
+        <w:ind w:left="6480" w:hanging="180"/>
+      </w:pPr>
+    </w:lvl>
+  </w:abstractNum>
+  <w:abstractNum w:abstractNumId="2" w15:restartNumberingAfterBreak="0">
     <w:nsid w:val="2B4108A3"/>
     <w:multiLevelType w:val="hybridMultilevel"/>
     <w:tmpl w:val="BBB0FC3E"/>
@@ -4517,7 +5703,7 @@
       </w:rPr>
     </w:lvl>
   </w:abstractNum>
-  <w:abstractNum w:abstractNumId="2" w15:restartNumberingAfterBreak="0">
+  <w:abstractNum w:abstractNumId="3" w15:restartNumberingAfterBreak="0">
     <w:nsid w:val="52EF643F"/>
     <w:multiLevelType w:val="multilevel"/>
     <w:tmpl w:val="040E001D"/>
@@ -4608,9 +5794,12 @@
     <w:abstractNumId w:val="0"/>
   </w:num>
   <w:num w:numId="2" w16cid:durableId="623315349">
+    <w:abstractNumId w:val="3"/>
+  </w:num>
+  <w:num w:numId="3" w16cid:durableId="522669631">
     <w:abstractNumId w:val="2"/>
   </w:num>
-  <w:num w:numId="3" w16cid:durableId="522669631">
+  <w:num w:numId="4" w16cid:durableId="517891229">
     <w:abstractNumId w:val="1"/>
   </w:num>
 </w:numbering>
@@ -6116,7 +7305,7 @@
 </file>
 
 <file path=customXml/itemProps1.xml><?xml version="1.0" encoding="utf-8"?>
-<ds:datastoreItem xmlns:ds="http://schemas.openxmlformats.org/officeDocument/2006/customXml" ds:itemID="{83B8B7A3-5A47-3E4C-8EF1-B260E1BD376E}">
+<ds:datastoreItem xmlns:ds="http://schemas.openxmlformats.org/officeDocument/2006/customXml" ds:itemID="{155132B8-8294-5547-B7B1-29C13398C11B}">
   <ds:schemaRefs>
     <ds:schemaRef ds:uri="http://schemas.openxmlformats.org/officeDocument/2006/bibliography"/>
   </ds:schemaRefs>

</xml_diff>

<commit_message>
[Add] documentation -> usage
</commit_message>
<xml_diff>
--- a/documentation.docx
+++ b/documentation.docx
@@ -182,7 +182,7 @@
             </w:rPr>
             <w:fldChar w:fldCharType="separate"/>
           </w:r>
-          <w:hyperlink w:anchor="_Toc229666680" w:history="1">
+          <w:hyperlink w:anchor="_Toc229670063" w:history="1">
             <w:r>
               <w:rPr>
                 <w:rStyle w:val="Hiperhivatkozs"/>
@@ -229,7 +229,7 @@
                 <w:noProof/>
                 <w:webHidden/>
               </w:rPr>
-              <w:instrText xml:space="preserve"> PAGEREF _Toc229666680 \h </w:instrText>
+              <w:instrText xml:space="preserve"> PAGEREF _Toc229670063 \h </w:instrText>
             </w:r>
             <w:r>
               <w:rPr>
@@ -278,7 +278,7 @@
               <w:lang w:eastAsia="hu-HU"/>
             </w:rPr>
           </w:pPr>
-          <w:hyperlink w:anchor="_Toc229666681" w:history="1">
+          <w:hyperlink w:anchor="_Toc229670064" w:history="1">
             <w:r>
               <w:rPr>
                 <w:rStyle w:val="Hiperhivatkozs"/>
@@ -325,7 +325,7 @@
                 <w:noProof/>
                 <w:webHidden/>
               </w:rPr>
-              <w:instrText xml:space="preserve"> PAGEREF _Toc229666681 \h </w:instrText>
+              <w:instrText xml:space="preserve"> PAGEREF _Toc229670064 \h </w:instrText>
             </w:r>
             <w:r>
               <w:rPr>
@@ -374,7 +374,7 @@
               <w:lang w:eastAsia="hu-HU"/>
             </w:rPr>
           </w:pPr>
-          <w:hyperlink w:anchor="_Toc229666682" w:history="1">
+          <w:hyperlink w:anchor="_Toc229670065" w:history="1">
             <w:r>
               <w:rPr>
                 <w:rStyle w:val="Hiperhivatkozs"/>
@@ -421,7 +421,7 @@
                 <w:noProof/>
                 <w:webHidden/>
               </w:rPr>
-              <w:instrText xml:space="preserve"> PAGEREF _Toc229666682 \h </w:instrText>
+              <w:instrText xml:space="preserve"> PAGEREF _Toc229670065 \h </w:instrText>
             </w:r>
             <w:r>
               <w:rPr>
@@ -468,7 +468,7 @@
               <w:lang w:eastAsia="hu-HU"/>
             </w:rPr>
           </w:pPr>
-          <w:hyperlink w:anchor="_Toc229666683" w:history="1">
+          <w:hyperlink w:anchor="_Toc229670066" w:history="1">
             <w:r>
               <w:rPr>
                 <w:rStyle w:val="Hiperhivatkozs"/>
@@ -513,7 +513,7 @@
                 <w:noProof/>
                 <w:webHidden/>
               </w:rPr>
-              <w:instrText xml:space="preserve"> PAGEREF _Toc229666683 \h </w:instrText>
+              <w:instrText xml:space="preserve"> PAGEREF _Toc229670066 \h </w:instrText>
             </w:r>
             <w:r>
               <w:rPr>
@@ -560,7 +560,7 @@
               <w:lang w:eastAsia="hu-HU"/>
             </w:rPr>
           </w:pPr>
-          <w:hyperlink w:anchor="_Toc229666684" w:history="1">
+          <w:hyperlink w:anchor="_Toc229670067" w:history="1">
             <w:r>
               <w:rPr>
                 <w:rStyle w:val="Hiperhivatkozs"/>
@@ -605,7 +605,7 @@
                 <w:noProof/>
                 <w:webHidden/>
               </w:rPr>
-              <w:instrText xml:space="preserve"> PAGEREF _Toc229666684 \h </w:instrText>
+              <w:instrText xml:space="preserve"> PAGEREF _Toc229670067 \h </w:instrText>
             </w:r>
             <w:r>
               <w:rPr>
@@ -652,7 +652,7 @@
               <w:lang w:eastAsia="hu-HU"/>
             </w:rPr>
           </w:pPr>
-          <w:hyperlink w:anchor="_Toc229666685" w:history="1">
+          <w:hyperlink w:anchor="_Toc229670068" w:history="1">
             <w:r>
               <w:rPr>
                 <w:rStyle w:val="Hiperhivatkozs"/>
@@ -697,7 +697,7 @@
                 <w:noProof/>
                 <w:webHidden/>
               </w:rPr>
-              <w:instrText xml:space="preserve"> PAGEREF _Toc229666685 \h </w:instrText>
+              <w:instrText xml:space="preserve"> PAGEREF _Toc229670068 \h </w:instrText>
             </w:r>
             <w:r>
               <w:rPr>
@@ -744,7 +744,7 @@
               <w:lang w:eastAsia="hu-HU"/>
             </w:rPr>
           </w:pPr>
-          <w:hyperlink w:anchor="_Toc229666686" w:history="1">
+          <w:hyperlink w:anchor="_Toc229670069" w:history="1">
             <w:r>
               <w:rPr>
                 <w:rStyle w:val="Hiperhivatkozs"/>
@@ -789,7 +789,7 @@
                 <w:noProof/>
                 <w:webHidden/>
               </w:rPr>
-              <w:instrText xml:space="preserve"> PAGEREF _Toc229666686 \h </w:instrText>
+              <w:instrText xml:space="preserve"> PAGEREF _Toc229670069 \h </w:instrText>
             </w:r>
             <w:r>
               <w:rPr>
@@ -836,7 +836,7 @@
               <w:lang w:eastAsia="hu-HU"/>
             </w:rPr>
           </w:pPr>
-          <w:hyperlink w:anchor="_Toc229666687" w:history="1">
+          <w:hyperlink w:anchor="_Toc229670070" w:history="1">
             <w:r>
               <w:rPr>
                 <w:rStyle w:val="Hiperhivatkozs"/>
@@ -881,7 +881,7 @@
                 <w:noProof/>
                 <w:webHidden/>
               </w:rPr>
-              <w:instrText xml:space="preserve"> PAGEREF _Toc229666687 \h </w:instrText>
+              <w:instrText xml:space="preserve"> PAGEREF _Toc229670070 \h </w:instrText>
             </w:r>
             <w:r>
               <w:rPr>
@@ -928,7 +928,7 @@
               <w:lang w:eastAsia="hu-HU"/>
             </w:rPr>
           </w:pPr>
-          <w:hyperlink w:anchor="_Toc229666688" w:history="1">
+          <w:hyperlink w:anchor="_Toc229670071" w:history="1">
             <w:r>
               <w:rPr>
                 <w:rStyle w:val="Hiperhivatkozs"/>
@@ -973,7 +973,7 @@
                 <w:noProof/>
                 <w:webHidden/>
               </w:rPr>
-              <w:instrText xml:space="preserve"> PAGEREF _Toc229666688 \h </w:instrText>
+              <w:instrText xml:space="preserve"> PAGEREF _Toc229670071 \h </w:instrText>
             </w:r>
             <w:r>
               <w:rPr>
@@ -1022,7 +1022,7 @@
               <w:lang w:eastAsia="hu-HU"/>
             </w:rPr>
           </w:pPr>
-          <w:hyperlink w:anchor="_Toc229666689" w:history="1">
+          <w:hyperlink w:anchor="_Toc229670072" w:history="1">
             <w:r>
               <w:rPr>
                 <w:rStyle w:val="Hiperhivatkozs"/>
@@ -1069,7 +1069,7 @@
                 <w:noProof/>
                 <w:webHidden/>
               </w:rPr>
-              <w:instrText xml:space="preserve"> PAGEREF _Toc229666689 \h </w:instrText>
+              <w:instrText xml:space="preserve"> PAGEREF _Toc229670072 \h </w:instrText>
             </w:r>
             <w:r>
               <w:rPr>
@@ -1116,7 +1116,7 @@
               <w:lang w:eastAsia="hu-HU"/>
             </w:rPr>
           </w:pPr>
-          <w:hyperlink w:anchor="_Toc229666690" w:history="1">
+          <w:hyperlink w:anchor="_Toc229670073" w:history="1">
             <w:r>
               <w:rPr>
                 <w:rStyle w:val="Hiperhivatkozs"/>
@@ -1161,7 +1161,7 @@
                 <w:noProof/>
                 <w:webHidden/>
               </w:rPr>
-              <w:instrText xml:space="preserve"> PAGEREF _Toc229666690 \h </w:instrText>
+              <w:instrText xml:space="preserve"> PAGEREF _Toc229670073 \h </w:instrText>
             </w:r>
             <w:r>
               <w:rPr>
@@ -1208,7 +1208,7 @@
               <w:lang w:eastAsia="hu-HU"/>
             </w:rPr>
           </w:pPr>
-          <w:hyperlink w:anchor="_Toc229666691" w:history="1">
+          <w:hyperlink w:anchor="_Toc229670074" w:history="1">
             <w:r>
               <w:rPr>
                 <w:rStyle w:val="Hiperhivatkozs"/>
@@ -1253,7 +1253,7 @@
                 <w:noProof/>
                 <w:webHidden/>
               </w:rPr>
-              <w:instrText xml:space="preserve"> PAGEREF _Toc229666691 \h </w:instrText>
+              <w:instrText xml:space="preserve"> PAGEREF _Toc229670074 \h </w:instrText>
             </w:r>
             <w:r>
               <w:rPr>
@@ -1300,7 +1300,7 @@
               <w:lang w:eastAsia="hu-HU"/>
             </w:rPr>
           </w:pPr>
-          <w:hyperlink w:anchor="_Toc229666692" w:history="1">
+          <w:hyperlink w:anchor="_Toc229670075" w:history="1">
             <w:r>
               <w:rPr>
                 <w:rStyle w:val="Hiperhivatkozs"/>
@@ -1345,7 +1345,7 @@
                 <w:noProof/>
                 <w:webHidden/>
               </w:rPr>
-              <w:instrText xml:space="preserve"> PAGEREF _Toc229666692 \h </w:instrText>
+              <w:instrText xml:space="preserve"> PAGEREF _Toc229670075 \h </w:instrText>
             </w:r>
             <w:r>
               <w:rPr>
@@ -1392,7 +1392,7 @@
               <w:lang w:eastAsia="hu-HU"/>
             </w:rPr>
           </w:pPr>
-          <w:hyperlink w:anchor="_Toc229666693" w:history="1">
+          <w:hyperlink w:anchor="_Toc229670076" w:history="1">
             <w:r>
               <w:rPr>
                 <w:rStyle w:val="Hiperhivatkozs"/>
@@ -1437,7 +1437,7 @@
                 <w:noProof/>
                 <w:webHidden/>
               </w:rPr>
-              <w:instrText xml:space="preserve"> PAGEREF _Toc229666693 \h </w:instrText>
+              <w:instrText xml:space="preserve"> PAGEREF _Toc229670076 \h </w:instrText>
             </w:r>
             <w:r>
               <w:rPr>
@@ -1484,7 +1484,7 @@
               <w:lang w:eastAsia="hu-HU"/>
             </w:rPr>
           </w:pPr>
-          <w:hyperlink w:anchor="_Toc229666694" w:history="1">
+          <w:hyperlink w:anchor="_Toc229670077" w:history="1">
             <w:r>
               <w:rPr>
                 <w:rStyle w:val="Hiperhivatkozs"/>
@@ -1529,7 +1529,7 @@
                 <w:noProof/>
                 <w:webHidden/>
               </w:rPr>
-              <w:instrText xml:space="preserve"> PAGEREF _Toc229666694 \h </w:instrText>
+              <w:instrText xml:space="preserve"> PAGEREF _Toc229670077 \h </w:instrText>
             </w:r>
             <w:r>
               <w:rPr>
@@ -1576,7 +1576,7 @@
               <w:lang w:eastAsia="hu-HU"/>
             </w:rPr>
           </w:pPr>
-          <w:hyperlink w:anchor="_Toc229666695" w:history="1">
+          <w:hyperlink w:anchor="_Toc229670078" w:history="1">
             <w:r>
               <w:rPr>
                 <w:rStyle w:val="Hiperhivatkozs"/>
@@ -1621,7 +1621,7 @@
                 <w:noProof/>
                 <w:webHidden/>
               </w:rPr>
-              <w:instrText xml:space="preserve"> PAGEREF _Toc229666695 \h </w:instrText>
+              <w:instrText xml:space="preserve"> PAGEREF _Toc229670078 \h </w:instrText>
             </w:r>
             <w:r>
               <w:rPr>
@@ -1668,7 +1668,7 @@
               <w:lang w:eastAsia="hu-HU"/>
             </w:rPr>
           </w:pPr>
-          <w:hyperlink w:anchor="_Toc229666696" w:history="1">
+          <w:hyperlink w:anchor="_Toc229670079" w:history="1">
             <w:r>
               <w:rPr>
                 <w:rStyle w:val="Hiperhivatkozs"/>
@@ -1713,7 +1713,7 @@
                 <w:noProof/>
                 <w:webHidden/>
               </w:rPr>
-              <w:instrText xml:space="preserve"> PAGEREF _Toc229666696 \h </w:instrText>
+              <w:instrText xml:space="preserve"> PAGEREF _Toc229670079 \h </w:instrText>
             </w:r>
             <w:r>
               <w:rPr>
@@ -1760,7 +1760,7 @@
               <w:lang w:eastAsia="hu-HU"/>
             </w:rPr>
           </w:pPr>
-          <w:hyperlink w:anchor="_Toc229666697" w:history="1">
+          <w:hyperlink w:anchor="_Toc229670080" w:history="1">
             <w:r>
               <w:rPr>
                 <w:rStyle w:val="Hiperhivatkozs"/>
@@ -1805,7 +1805,7 @@
                 <w:noProof/>
                 <w:webHidden/>
               </w:rPr>
-              <w:instrText xml:space="preserve"> PAGEREF _Toc229666697 \h </w:instrText>
+              <w:instrText xml:space="preserve"> PAGEREF _Toc229670080 \h </w:instrText>
             </w:r>
             <w:r>
               <w:rPr>
@@ -1852,7 +1852,7 @@
               <w:lang w:eastAsia="hu-HU"/>
             </w:rPr>
           </w:pPr>
-          <w:hyperlink w:anchor="_Toc229666698" w:history="1">
+          <w:hyperlink w:anchor="_Toc229670081" w:history="1">
             <w:r>
               <w:rPr>
                 <w:rStyle w:val="Hiperhivatkozs"/>
@@ -1897,7 +1897,7 @@
                 <w:noProof/>
                 <w:webHidden/>
               </w:rPr>
-              <w:instrText xml:space="preserve"> PAGEREF _Toc229666698 \h </w:instrText>
+              <w:instrText xml:space="preserve"> PAGEREF _Toc229670081 \h </w:instrText>
             </w:r>
             <w:r>
               <w:rPr>
@@ -1946,7 +1946,7 @@
               <w:lang w:eastAsia="hu-HU"/>
             </w:rPr>
           </w:pPr>
-          <w:hyperlink w:anchor="_Toc229666699" w:history="1">
+          <w:hyperlink w:anchor="_Toc229670082" w:history="1">
             <w:r>
               <w:rPr>
                 <w:rStyle w:val="Hiperhivatkozs"/>
@@ -1993,7 +1993,7 @@
                 <w:noProof/>
                 <w:webHidden/>
               </w:rPr>
-              <w:instrText xml:space="preserve"> PAGEREF _Toc229666699 \h </w:instrText>
+              <w:instrText xml:space="preserve"> PAGEREF _Toc229670082 \h </w:instrText>
             </w:r>
             <w:r>
               <w:rPr>
@@ -2042,7 +2042,7 @@
               <w:lang w:eastAsia="hu-HU"/>
             </w:rPr>
           </w:pPr>
-          <w:hyperlink w:anchor="_Toc229666700" w:history="1">
+          <w:hyperlink w:anchor="_Toc229670083" w:history="1">
             <w:r>
               <w:rPr>
                 <w:rStyle w:val="Hiperhivatkozs"/>
@@ -2089,7 +2089,7 @@
                 <w:noProof/>
                 <w:webHidden/>
               </w:rPr>
-              <w:instrText xml:space="preserve"> PAGEREF _Toc229666700 \h </w:instrText>
+              <w:instrText xml:space="preserve"> PAGEREF _Toc229670083 \h </w:instrText>
             </w:r>
             <w:r>
               <w:rPr>
@@ -2138,7 +2138,7 @@
               <w:lang w:eastAsia="hu-HU"/>
             </w:rPr>
           </w:pPr>
-          <w:hyperlink w:anchor="_Toc229666701" w:history="1">
+          <w:hyperlink w:anchor="_Toc229670084" w:history="1">
             <w:r>
               <w:rPr>
                 <w:rStyle w:val="Hiperhivatkozs"/>
@@ -2185,7 +2185,7 @@
                 <w:noProof/>
                 <w:webHidden/>
               </w:rPr>
-              <w:instrText xml:space="preserve"> PAGEREF _Toc229666701 \h </w:instrText>
+              <w:instrText xml:space="preserve"> PAGEREF _Toc229670084 \h </w:instrText>
             </w:r>
             <w:r>
               <w:rPr>
@@ -2234,7 +2234,7 @@
               <w:lang w:eastAsia="hu-HU"/>
             </w:rPr>
           </w:pPr>
-          <w:hyperlink w:anchor="_Toc229666702" w:history="1">
+          <w:hyperlink w:anchor="_Toc229670085" w:history="1">
             <w:r>
               <w:rPr>
                 <w:rStyle w:val="Hiperhivatkozs"/>
@@ -2281,7 +2281,7 @@
                 <w:noProof/>
                 <w:webHidden/>
               </w:rPr>
-              <w:instrText xml:space="preserve"> PAGEREF _Toc229666702 \h </w:instrText>
+              <w:instrText xml:space="preserve"> PAGEREF _Toc229670085 \h </w:instrText>
             </w:r>
             <w:r>
               <w:rPr>
@@ -2330,7 +2330,7 @@
               <w:lang w:eastAsia="hu-HU"/>
             </w:rPr>
           </w:pPr>
-          <w:hyperlink w:anchor="_Toc229666703" w:history="1">
+          <w:hyperlink w:anchor="_Toc229670086" w:history="1">
             <w:r>
               <w:rPr>
                 <w:rStyle w:val="Hiperhivatkozs"/>
@@ -2377,7 +2377,7 @@
                 <w:noProof/>
                 <w:webHidden/>
               </w:rPr>
-              <w:instrText xml:space="preserve"> PAGEREF _Toc229666703 \h </w:instrText>
+              <w:instrText xml:space="preserve"> PAGEREF _Toc229670086 \h </w:instrText>
             </w:r>
             <w:r>
               <w:rPr>
@@ -2426,7 +2426,7 @@
               <w:lang w:eastAsia="hu-HU"/>
             </w:rPr>
           </w:pPr>
-          <w:hyperlink w:anchor="_Toc229666704" w:history="1">
+          <w:hyperlink w:anchor="_Toc229670087" w:history="1">
             <w:r>
               <w:rPr>
                 <w:rStyle w:val="Hiperhivatkozs"/>
@@ -2473,7 +2473,7 @@
                 <w:noProof/>
                 <w:webHidden/>
               </w:rPr>
-              <w:instrText xml:space="preserve"> PAGEREF _Toc229666704 \h </w:instrText>
+              <w:instrText xml:space="preserve"> PAGEREF _Toc229670087 \h </w:instrText>
             </w:r>
             <w:r>
               <w:rPr>
@@ -2520,7 +2520,7 @@
               <w:lang w:eastAsia="hu-HU"/>
             </w:rPr>
           </w:pPr>
-          <w:hyperlink w:anchor="_Toc229666705" w:history="1">
+          <w:hyperlink w:anchor="_Toc229670088" w:history="1">
             <w:r>
               <w:rPr>
                 <w:rStyle w:val="Hiperhivatkozs"/>
@@ -2565,7 +2565,7 @@
                 <w:noProof/>
                 <w:webHidden/>
               </w:rPr>
-              <w:instrText xml:space="preserve"> PAGEREF _Toc229666705 \h </w:instrText>
+              <w:instrText xml:space="preserve"> PAGEREF _Toc229670088 \h </w:instrText>
             </w:r>
             <w:r>
               <w:rPr>
@@ -2612,7 +2612,7 @@
               <w:lang w:eastAsia="hu-HU"/>
             </w:rPr>
           </w:pPr>
-          <w:hyperlink w:anchor="_Toc229666706" w:history="1">
+          <w:hyperlink w:anchor="_Toc229670089" w:history="1">
             <w:r>
               <w:rPr>
                 <w:rStyle w:val="Hiperhivatkozs"/>
@@ -2657,7 +2657,7 @@
                 <w:noProof/>
                 <w:webHidden/>
               </w:rPr>
-              <w:instrText xml:space="preserve"> PAGEREF _Toc229666706 \h </w:instrText>
+              <w:instrText xml:space="preserve"> PAGEREF _Toc229670089 \h </w:instrText>
             </w:r>
             <w:r>
               <w:rPr>
@@ -2704,7 +2704,7 @@
               <w:lang w:eastAsia="hu-HU"/>
             </w:rPr>
           </w:pPr>
-          <w:hyperlink w:anchor="_Toc229666707" w:history="1">
+          <w:hyperlink w:anchor="_Toc229670090" w:history="1">
             <w:r>
               <w:rPr>
                 <w:rStyle w:val="Hiperhivatkozs"/>
@@ -2749,7 +2749,7 @@
                 <w:noProof/>
                 <w:webHidden/>
               </w:rPr>
-              <w:instrText xml:space="preserve"> PAGEREF _Toc229666707 \h </w:instrText>
+              <w:instrText xml:space="preserve"> PAGEREF _Toc229670090 \h </w:instrText>
             </w:r>
             <w:r>
               <w:rPr>
@@ -2796,7 +2796,7 @@
               <w:lang w:eastAsia="hu-HU"/>
             </w:rPr>
           </w:pPr>
-          <w:hyperlink w:anchor="_Toc229666708" w:history="1">
+          <w:hyperlink w:anchor="_Toc229670091" w:history="1">
             <w:r>
               <w:rPr>
                 <w:rStyle w:val="Hiperhivatkozs"/>
@@ -2841,7 +2841,7 @@
                 <w:noProof/>
                 <w:webHidden/>
               </w:rPr>
-              <w:instrText xml:space="preserve"> PAGEREF _Toc229666708 \h </w:instrText>
+              <w:instrText xml:space="preserve"> PAGEREF _Toc229670091 \h </w:instrText>
             </w:r>
             <w:r>
               <w:rPr>
@@ -2888,7 +2888,7 @@
               <w:lang w:eastAsia="hu-HU"/>
             </w:rPr>
           </w:pPr>
-          <w:hyperlink w:anchor="_Toc229666709" w:history="1">
+          <w:hyperlink w:anchor="_Toc229670092" w:history="1">
             <w:r>
               <w:rPr>
                 <w:rStyle w:val="Hiperhivatkozs"/>
@@ -2933,7 +2933,7 @@
                 <w:noProof/>
                 <w:webHidden/>
               </w:rPr>
-              <w:instrText xml:space="preserve"> PAGEREF _Toc229666709 \h </w:instrText>
+              <w:instrText xml:space="preserve"> PAGEREF _Toc229670092 \h </w:instrText>
             </w:r>
             <w:r>
               <w:rPr>
@@ -2982,7 +2982,7 @@
               <w:lang w:eastAsia="hu-HU"/>
             </w:rPr>
           </w:pPr>
-          <w:hyperlink w:anchor="_Toc229666710" w:history="1">
+          <w:hyperlink w:anchor="_Toc229670093" w:history="1">
             <w:r>
               <w:rPr>
                 <w:rStyle w:val="Hiperhivatkozs"/>
@@ -3029,7 +3029,7 @@
                 <w:noProof/>
                 <w:webHidden/>
               </w:rPr>
-              <w:instrText xml:space="preserve"> PAGEREF _Toc229666710 \h </w:instrText>
+              <w:instrText xml:space="preserve"> PAGEREF _Toc229670093 \h </w:instrText>
             </w:r>
             <w:r>
               <w:rPr>
@@ -3078,7 +3078,7 @@
               <w:lang w:eastAsia="hu-HU"/>
             </w:rPr>
           </w:pPr>
-          <w:hyperlink w:anchor="_Toc229666711" w:history="1">
+          <w:hyperlink w:anchor="_Toc229670094" w:history="1">
             <w:r>
               <w:rPr>
                 <w:rStyle w:val="Hiperhivatkozs"/>
@@ -3125,7 +3125,7 @@
                 <w:noProof/>
                 <w:webHidden/>
               </w:rPr>
-              <w:instrText xml:space="preserve"> PAGEREF _Toc229666711 \h </w:instrText>
+              <w:instrText xml:space="preserve"> PAGEREF _Toc229670094 \h </w:instrText>
             </w:r>
             <w:r>
               <w:rPr>
@@ -3174,7 +3174,7 @@
               <w:lang w:eastAsia="hu-HU"/>
             </w:rPr>
           </w:pPr>
-          <w:hyperlink w:anchor="_Toc229666712" w:history="1">
+          <w:hyperlink w:anchor="_Toc229670095" w:history="1">
             <w:r>
               <w:rPr>
                 <w:rStyle w:val="Hiperhivatkozs"/>
@@ -3200,7 +3200,7 @@
                 <w:rStyle w:val="Hiperhivatkozs"/>
                 <w:noProof/>
               </w:rPr>
-              <w:t>Összegzés</w:t>
+              <w:t>Használati leírás</w:t>
             </w:r>
             <w:r>
               <w:rPr>
@@ -3221,7 +3221,7 @@
                 <w:noProof/>
                 <w:webHidden/>
               </w:rPr>
-              <w:instrText xml:space="preserve"> PAGEREF _Toc229666712 \h </w:instrText>
+              <w:instrText xml:space="preserve"> PAGEREF _Toc229670095 \h </w:instrText>
             </w:r>
             <w:r>
               <w:rPr>
@@ -3270,7 +3270,7 @@
               <w:lang w:eastAsia="hu-HU"/>
             </w:rPr>
           </w:pPr>
-          <w:hyperlink w:anchor="_Toc229666713" w:history="1">
+          <w:hyperlink w:anchor="_Toc229670096" w:history="1">
             <w:r>
               <w:rPr>
                 <w:rStyle w:val="Hiperhivatkozs"/>
@@ -3296,6 +3296,102 @@
                 <w:rStyle w:val="Hiperhivatkozs"/>
                 <w:noProof/>
               </w:rPr>
+              <w:t>Összegzés</w:t>
+            </w:r>
+            <w:r>
+              <w:rPr>
+                <w:noProof/>
+                <w:webHidden/>
+              </w:rPr>
+              <w:tab/>
+            </w:r>
+            <w:r>
+              <w:rPr>
+                <w:noProof/>
+                <w:webHidden/>
+              </w:rPr>
+              <w:fldChar w:fldCharType="begin"/>
+            </w:r>
+            <w:r>
+              <w:rPr>
+                <w:noProof/>
+                <w:webHidden/>
+              </w:rPr>
+              <w:instrText xml:space="preserve"> PAGEREF _Toc229670096 \h </w:instrText>
+            </w:r>
+            <w:r>
+              <w:rPr>
+                <w:noProof/>
+                <w:webHidden/>
+              </w:rPr>
+            </w:r>
+            <w:r>
+              <w:rPr>
+                <w:noProof/>
+                <w:webHidden/>
+              </w:rPr>
+              <w:fldChar w:fldCharType="separate"/>
+            </w:r>
+            <w:r>
+              <w:rPr>
+                <w:noProof/>
+                <w:webHidden/>
+              </w:rPr>
+              <w:t>10</w:t>
+            </w:r>
+            <w:r>
+              <w:rPr>
+                <w:noProof/>
+                <w:webHidden/>
+              </w:rPr>
+              <w:fldChar w:fldCharType="end"/>
+            </w:r>
+          </w:hyperlink>
+        </w:p>
+        <w:p>
+          <w:pPr>
+            <w:pStyle w:val="TJ1"/>
+            <w:tabs>
+              <w:tab w:val="left" w:pos="480"/>
+              <w:tab w:val="right" w:leader="dot" w:pos="9062"/>
+            </w:tabs>
+            <w:rPr>
+              <w:rFonts w:eastAsiaTheme="minorEastAsia"/>
+              <w:b w:val="0"/>
+              <w:bCs w:val="0"/>
+              <w:caps w:val="0"/>
+              <w:noProof/>
+              <w:sz w:val="24"/>
+              <w:szCs w:val="24"/>
+              <w:lang w:eastAsia="hu-HU"/>
+            </w:rPr>
+          </w:pPr>
+          <w:hyperlink w:anchor="_Toc229670097" w:history="1">
+            <w:r>
+              <w:rPr>
+                <w:rStyle w:val="Hiperhivatkozs"/>
+                <w:noProof/>
+              </w:rPr>
+              <w:t>15</w:t>
+            </w:r>
+            <w:r>
+              <w:rPr>
+                <w:rFonts w:eastAsiaTheme="minorEastAsia"/>
+                <w:b w:val="0"/>
+                <w:bCs w:val="0"/>
+                <w:caps w:val="0"/>
+                <w:noProof/>
+                <w:sz w:val="24"/>
+                <w:szCs w:val="24"/>
+                <w:lang w:eastAsia="hu-HU"/>
+              </w:rPr>
+              <w:tab/>
+            </w:r>
+            <w:r>
+              <w:rPr>
+                <w:rStyle w:val="Hiperhivatkozs"/>
+                <w:noProof/>
+              </w:rPr>
               <w:t>Források</w:t>
             </w:r>
             <w:r>
@@ -3317,7 +3413,7 @@
                 <w:noProof/>
                 <w:webHidden/>
               </w:rPr>
-              <w:instrText xml:space="preserve"> PAGEREF _Toc229666713 \h </w:instrText>
+              <w:instrText xml:space="preserve"> PAGEREF _Toc229670097 \h </w:instrText>
             </w:r>
             <w:r>
               <w:rPr>
@@ -3337,7 +3433,7 @@
                 <w:noProof/>
                 <w:webHidden/>
               </w:rPr>
-              <w:t>9</w:t>
+              <w:t>10</w:t>
             </w:r>
             <w:r>
               <w:rPr>
@@ -3369,7 +3465,7 @@
       <w:pPr>
         <w:pStyle w:val="Cmsor1"/>
       </w:pPr>
-      <w:bookmarkStart w:id="0" w:name="_Toc229666680"/>
+      <w:bookmarkStart w:id="0" w:name="_Toc229670063"/>
       <w:r>
         <w:lastRenderedPageBreak/>
         <w:t>Bevezetés</w:t>
@@ -3441,7 +3537,7 @@
       <w:pPr>
         <w:pStyle w:val="Cmsor1"/>
       </w:pPr>
-      <w:bookmarkStart w:id="1" w:name="_Toc229666681"/>
+      <w:bookmarkStart w:id="1" w:name="_Toc229670064"/>
       <w:r>
         <w:t>A</w:t>
       </w:r>
@@ -3561,7 +3657,7 @@
       <w:pPr>
         <w:pStyle w:val="Cmsor1"/>
       </w:pPr>
-      <w:bookmarkStart w:id="2" w:name="_Toc229666682"/>
+      <w:bookmarkStart w:id="2" w:name="_Toc229670065"/>
       <w:r>
         <w:t>Az EAN-13 kódrendszer áttekintése</w:t>
       </w:r>
@@ -3585,7 +3681,7 @@
       <w:pPr>
         <w:pStyle w:val="Cmsor2"/>
       </w:pPr>
-      <w:bookmarkStart w:id="3" w:name="_Toc229666683"/>
+      <w:bookmarkStart w:id="3" w:name="_Toc229670066"/>
       <w:r>
         <w:t>Az EAN-13 szerepe a termékazonosításban</w:t>
       </w:r>
@@ -3616,7 +3712,7 @@
       <w:pPr>
         <w:pStyle w:val="Cmsor2"/>
       </w:pPr>
-      <w:bookmarkStart w:id="4" w:name="_Toc229666684"/>
+      <w:bookmarkStart w:id="4" w:name="_Toc229670067"/>
       <w:r>
         <w:t>A 13 számjegy felépítése</w:t>
       </w:r>
@@ -3681,7 +3777,7 @@
       <w:pPr>
         <w:pStyle w:val="Cmsor2"/>
       </w:pPr>
-      <w:bookmarkStart w:id="5" w:name="_Toc229666685"/>
+      <w:bookmarkStart w:id="5" w:name="_Toc229670068"/>
       <w:r>
         <w:lastRenderedPageBreak/>
         <w:t>A 95 modulból álló vonalkódszerkezet</w:t>
@@ -3823,7 +3919,7 @@
       <w:pPr>
         <w:pStyle w:val="Cmsor2"/>
       </w:pPr>
-      <w:bookmarkStart w:id="6" w:name="_Toc229666686"/>
+      <w:bookmarkStart w:id="6" w:name="_Toc229670069"/>
       <w:r>
         <w:t>L, G, és R kódolási minták</w:t>
       </w:r>
@@ -3858,7 +3954,7 @@
       <w:pPr>
         <w:pStyle w:val="Cmsor2"/>
       </w:pPr>
-      <w:bookmarkStart w:id="7" w:name="_Toc229666687"/>
+      <w:bookmarkStart w:id="7" w:name="_Toc229670070"/>
       <w:r>
         <w:t>Ellenőrző számjegy és hibafelismerés</w:t>
       </w:r>
@@ -3946,7 +4042,7 @@
       <w:pPr>
         <w:pStyle w:val="Cmsor2"/>
       </w:pPr>
-      <w:bookmarkStart w:id="8" w:name="_Toc229666688"/>
+      <w:bookmarkStart w:id="8" w:name="_Toc229670071"/>
       <w:proofErr w:type="spellStart"/>
       <w:r>
         <w:t>Quiet</w:t>
@@ -4032,7 +4128,7 @@
       <w:pPr>
         <w:pStyle w:val="Cmsor1"/>
       </w:pPr>
-      <w:bookmarkStart w:id="9" w:name="_Toc229666689"/>
+      <w:bookmarkStart w:id="9" w:name="_Toc229670072"/>
       <w:r>
         <w:t>A program fő moduljai</w:t>
       </w:r>
@@ -4061,7 +4157,7 @@
       <w:pPr>
         <w:pStyle w:val="Cmsor2"/>
       </w:pPr>
-      <w:bookmarkStart w:id="10" w:name="_Toc229666690"/>
+      <w:bookmarkStart w:id="10" w:name="_Toc229670073"/>
       <w:r>
         <w:t>main.py</w:t>
       </w:r>
@@ -4087,7 +4183,7 @@
       <w:pPr>
         <w:pStyle w:val="Cmsor2"/>
       </w:pPr>
-      <w:bookmarkStart w:id="11" w:name="_Toc229666691"/>
+      <w:bookmarkStart w:id="11" w:name="_Toc229670074"/>
       <w:r>
         <w:t>barcode_detection.py</w:t>
       </w:r>
@@ -4113,7 +4209,7 @@
       <w:pPr>
         <w:pStyle w:val="Cmsor2"/>
       </w:pPr>
-      <w:bookmarkStart w:id="12" w:name="_Toc229666692"/>
+      <w:bookmarkStart w:id="12" w:name="_Toc229670075"/>
       <w:r>
         <w:t>image_processing.py</w:t>
       </w:r>
@@ -4136,7 +4232,7 @@
       <w:pPr>
         <w:pStyle w:val="Cmsor2"/>
       </w:pPr>
-      <w:bookmarkStart w:id="13" w:name="_Toc229666693"/>
+      <w:bookmarkStart w:id="13" w:name="_Toc229670076"/>
       <w:r>
         <w:lastRenderedPageBreak/>
         <w:t>scanline.py</w:t>
@@ -4192,7 +4288,7 @@
       <w:pPr>
         <w:pStyle w:val="Cmsor2"/>
       </w:pPr>
-      <w:bookmarkStart w:id="14" w:name="_Toc229666694"/>
+      <w:bookmarkStart w:id="14" w:name="_Toc229670077"/>
       <w:r>
         <w:t>pattern_decoder.py</w:t>
       </w:r>
@@ -4223,7 +4319,7 @@
       <w:pPr>
         <w:pStyle w:val="Cmsor2"/>
       </w:pPr>
-      <w:bookmarkStart w:id="15" w:name="_Toc229666695"/>
+      <w:bookmarkStart w:id="15" w:name="_Toc229670078"/>
       <w:r>
         <w:t>decoder.py</w:t>
       </w:r>
@@ -4246,7 +4342,7 @@
       <w:pPr>
         <w:pStyle w:val="Cmsor2"/>
       </w:pPr>
-      <w:bookmarkStart w:id="16" w:name="_Toc229666696"/>
+      <w:bookmarkStart w:id="16" w:name="_Toc229670079"/>
       <w:r>
         <w:t>ean13_patterns.py</w:t>
       </w:r>
@@ -4261,7 +4357,7 @@
       <w:pPr>
         <w:pStyle w:val="Cmsor2"/>
       </w:pPr>
-      <w:bookmarkStart w:id="17" w:name="_Toc229666697"/>
+      <w:bookmarkStart w:id="17" w:name="_Toc229670080"/>
       <w:r>
         <w:t>barcode_reader.py</w:t>
       </w:r>
@@ -4300,7 +4396,7 @@
       <w:pPr>
         <w:pStyle w:val="Cmsor2"/>
       </w:pPr>
-      <w:bookmarkStart w:id="18" w:name="_Toc229666698"/>
+      <w:bookmarkStart w:id="18" w:name="_Toc229670081"/>
       <w:r>
         <w:t>stats_report.py</w:t>
       </w:r>
@@ -4323,7 +4419,7 @@
       <w:pPr>
         <w:pStyle w:val="Cmsor1"/>
       </w:pPr>
-      <w:bookmarkStart w:id="19" w:name="_Toc229666699"/>
+      <w:bookmarkStart w:id="19" w:name="_Toc229670082"/>
       <w:r>
         <w:t>Feldolgozási folyamat</w:t>
       </w:r>
@@ -4545,7 +4641,7 @@
       <w:pPr>
         <w:pStyle w:val="Cmsor1"/>
       </w:pPr>
-      <w:bookmarkStart w:id="20" w:name="_Toc229666700"/>
+      <w:bookmarkStart w:id="20" w:name="_Toc229670083"/>
       <w:r>
         <w:t>Előfeldolgozás és ROI detektálás</w:t>
       </w:r>
@@ -4606,7 +4702,7 @@
       <w:pPr>
         <w:pStyle w:val="Cmsor1"/>
       </w:pPr>
-      <w:bookmarkStart w:id="21" w:name="_Toc229666701"/>
+      <w:bookmarkStart w:id="21" w:name="_Toc229670084"/>
       <w:proofErr w:type="spellStart"/>
       <w:r>
         <w:t>Scanline</w:t>
@@ -4682,7 +4778,7 @@
       <w:pPr>
         <w:pStyle w:val="Cmsor1"/>
       </w:pPr>
-      <w:bookmarkStart w:id="22" w:name="_Toc229666702"/>
+      <w:bookmarkStart w:id="22" w:name="_Toc229670085"/>
       <w:proofErr w:type="spellStart"/>
       <w:r>
         <w:t>Run</w:t>
@@ -4779,7 +4875,7 @@
       <w:pPr>
         <w:pStyle w:val="Cmsor1"/>
       </w:pPr>
-      <w:bookmarkStart w:id="23" w:name="_Toc229666703"/>
+      <w:bookmarkStart w:id="23" w:name="_Toc229670086"/>
       <w:r>
         <w:lastRenderedPageBreak/>
         <w:t>Hibakezelés és bizonytalansági logika</w:t>
@@ -4841,7 +4937,7 @@
       <w:pPr>
         <w:pStyle w:val="Cmsor1"/>
       </w:pPr>
-      <w:bookmarkStart w:id="24" w:name="_Toc229666704"/>
+      <w:bookmarkStart w:id="24" w:name="_Toc229670087"/>
       <w:r>
         <w:t>Statisztika értékelése</w:t>
       </w:r>
@@ -4851,7 +4947,7 @@
       <w:pPr>
         <w:pStyle w:val="Cmsor2"/>
       </w:pPr>
-      <w:bookmarkStart w:id="25" w:name="_Toc229666705"/>
+      <w:bookmarkStart w:id="25" w:name="_Toc229670088"/>
       <w:r>
         <w:t>Hibakategóriák elemzése</w:t>
       </w:r>
@@ -4861,7 +4957,7 @@
       <w:pPr>
         <w:pStyle w:val="Cmsor2"/>
       </w:pPr>
-      <w:bookmarkStart w:id="26" w:name="_Toc229666706"/>
+      <w:bookmarkStart w:id="26" w:name="_Toc229670089"/>
       <w:proofErr w:type="spellStart"/>
       <w:r>
         <w:t>Score</w:t>
@@ -4876,7 +4972,7 @@
       <w:pPr>
         <w:pStyle w:val="Cmsor2"/>
       </w:pPr>
-      <w:bookmarkStart w:id="27" w:name="_Toc229666707"/>
+      <w:bookmarkStart w:id="27" w:name="_Toc229670090"/>
       <w:r>
         <w:t>A hibás olvasások jelentősége</w:t>
       </w:r>
@@ -4886,7 +4982,7 @@
       <w:pPr>
         <w:pStyle w:val="Cmsor2"/>
       </w:pPr>
-      <w:bookmarkStart w:id="28" w:name="_Toc229666708"/>
+      <w:bookmarkStart w:id="28" w:name="_Toc229670091"/>
       <w:r>
         <w:t>Módszercsaládok szerepe</w:t>
       </w:r>
@@ -4896,7 +4992,7 @@
       <w:pPr>
         <w:pStyle w:val="Cmsor2"/>
       </w:pPr>
-      <w:bookmarkStart w:id="29" w:name="_Toc229666709"/>
+      <w:bookmarkStart w:id="29" w:name="_Toc229670092"/>
       <w:r>
         <w:t>ROI detektálás értékelése</w:t>
       </w:r>
@@ -4906,7 +5002,7 @@
       <w:pPr>
         <w:pStyle w:val="Cmsor1"/>
       </w:pPr>
-      <w:bookmarkStart w:id="30" w:name="_Toc229666710"/>
+      <w:bookmarkStart w:id="30" w:name="_Toc229670093"/>
       <w:r>
         <w:t>Eredmények értelmezése</w:t>
       </w:r>
@@ -4916,7 +5012,7 @@
       <w:pPr>
         <w:pStyle w:val="Cmsor1"/>
       </w:pPr>
-      <w:bookmarkStart w:id="31" w:name="_Toc229666711"/>
+      <w:bookmarkStart w:id="31" w:name="_Toc229670094"/>
       <w:r>
         <w:t>Fejlesztési lehetőségek</w:t>
       </w:r>
@@ -4926,21 +5022,1907 @@
       <w:pPr>
         <w:pStyle w:val="Cmsor1"/>
       </w:pPr>
-      <w:bookmarkStart w:id="32" w:name="_Toc229666712"/>
+      <w:bookmarkStart w:id="32" w:name="_Toc229670095"/>
+      <w:r>
+        <w:t>Használati leírás</w:t>
+      </w:r>
+      <w:bookmarkEnd w:id="32"/>
+    </w:p>
+    <w:p>
+      <w:r>
+        <w:t>A program parancssorból futtatható Python alkalma</w:t>
+      </w:r>
+      <w:r>
+        <w:t>z</w:t>
+      </w:r>
+      <w:r>
+        <w:t>ásként használható.</w:t>
+      </w:r>
+      <w:r>
+        <w:t xml:space="preserve"> A futtatás előtt aktiválni kell a virtuális környezetet, majd a main.py fájlnak kell átadni egy kép vagy egy teljes mappa helyét.</w:t>
+      </w:r>
+      <w:r>
+        <w:t xml:space="preserve"> Egyetlen kép feldolgozásakor a program az adott képre próbál EAN-13 kódot olvasni, mappa megadásakor pedig a mappában található képeket dolgozza fel egymás után [8].</w:t>
+      </w:r>
+    </w:p>
+    <w:p>
+      <w:r>
+        <w:t>Általános futtatás:</w:t>
+      </w:r>
+    </w:p>
+    <w:p>
+      <w:r>
+        <w:rPr>
+          <w:noProof/>
+        </w:rPr>
+        <mc:AlternateContent>
+          <mc:Choice Requires="wps">
+            <w:drawing>
+              <wp:anchor distT="0" distB="0" distL="114300" distR="114300" simplePos="0" relativeHeight="251659264" behindDoc="0" locked="0" layoutInCell="1" allowOverlap="1" wp14:anchorId="0EDD91AC" wp14:editId="19B4AACA">
+                <wp:simplePos x="0" y="0"/>
+                <wp:positionH relativeFrom="column">
+                  <wp:posOffset>-14578</wp:posOffset>
+                </wp:positionH>
+                <wp:positionV relativeFrom="paragraph">
+                  <wp:posOffset>17564</wp:posOffset>
+                </wp:positionV>
+                <wp:extent cx="5787957" cy="535021"/>
+                <wp:effectExtent l="0" t="0" r="16510" b="11430"/>
+                <wp:wrapNone/>
+                <wp:docPr id="501979047" name="Szövegdoboz 1"/>
+                <wp:cNvGraphicFramePr/>
+                <a:graphic xmlns:a="http://schemas.openxmlformats.org/drawingml/2006/main">
+                  <a:graphicData uri="http://schemas.microsoft.com/office/word/2010/wordprocessingShape">
+                    <wps:wsp>
+                      <wps:cNvSpPr txBox="1"/>
+                      <wps:spPr>
+                        <a:xfrm>
+                          <a:off x="0" y="0"/>
+                          <a:ext cx="5787957" cy="535021"/>
+                        </a:xfrm>
+                        <a:prstGeom prst="rect">
+                          <a:avLst/>
+                        </a:prstGeom>
+                        <a:solidFill>
+                          <a:schemeClr val="tx1">
+                            <a:lumMod val="50000"/>
+                            <a:lumOff val="50000"/>
+                          </a:schemeClr>
+                        </a:solidFill>
+                        <a:ln w="6350">
+                          <a:solidFill>
+                            <a:prstClr val="black"/>
+                          </a:solidFill>
+                        </a:ln>
+                      </wps:spPr>
+                      <wps:txbx>
+                        <w:txbxContent>
+                          <w:p>
+                            <w:pPr>
+                              <w:jc w:val="left"/>
+                              <w:rPr>
+                                <w:rFonts w:ascii="Consolas" w:hAnsi="Consolas" w:cs="Consolas"/>
+                                <w:color w:val="FFFFFF" w:themeColor="background1"/>
+                                <w14:shadow w14:blurRad="38100" w14:dist="19050" w14:dir="2700000" w14:sx="100000" w14:sy="100000" w14:kx="0" w14:ky="0" w14:algn="tl">
+                                  <w14:schemeClr w14:val="dk1">
+                                    <w14:alpha w14:val="60000"/>
+                                  </w14:schemeClr>
+                                </w14:shadow>
+                                <w14:textOutline w14:w="9525" w14:cap="flat" w14:cmpd="sng" w14:algn="ctr">
+                                  <w14:noFill/>
+                                  <w14:prstDash w14:val="solid"/>
+                                  <w14:round/>
+                                </w14:textOutline>
+                              </w:rPr>
+                            </w:pPr>
+                            <w:proofErr w:type="spellStart"/>
+                            <w:proofErr w:type="gramStart"/>
+                            <w:r>
+                              <w:rPr>
+                                <w:rFonts w:ascii="Consolas" w:hAnsi="Consolas" w:cs="Consolas"/>
+                                <w:color w:val="FFFFFF" w:themeColor="background1"/>
+                                <w14:shadow w14:blurRad="38100" w14:dist="19050" w14:dir="2700000" w14:sx="100000" w14:sy="100000" w14:kx="0" w14:ky="0" w14:algn="tl">
+                                  <w14:schemeClr w14:val="dk1">
+                                    <w14:alpha w14:val="60000"/>
+                                  </w14:schemeClr>
+                                </w14:shadow>
+                                <w14:textOutline w14:w="9525" w14:cap="flat" w14:cmpd="sng" w14:algn="ctr">
+                                  <w14:noFill/>
+                                  <w14:prstDash w14:val="solid"/>
+                                  <w14:round/>
+                                </w14:textOutline>
+                              </w:rPr>
+                              <w:t>source</w:t>
+                            </w:r>
+                            <w:proofErr w:type="spellEnd"/>
+                            <w:r>
+                              <w:rPr>
+                                <w:rFonts w:ascii="Consolas" w:hAnsi="Consolas" w:cs="Consolas"/>
+                                <w:color w:val="FFFFFF" w:themeColor="background1"/>
+                                <w14:shadow w14:blurRad="38100" w14:dist="19050" w14:dir="2700000" w14:sx="100000" w14:sy="100000" w14:kx="0" w14:ky="0" w14:algn="tl">
+                                  <w14:schemeClr w14:val="dk1">
+                                    <w14:alpha w14:val="60000"/>
+                                  </w14:schemeClr>
+                                </w14:shadow>
+                                <w14:textOutline w14:w="9525" w14:cap="flat" w14:cmpd="sng" w14:algn="ctr">
+                                  <w14:noFill/>
+                                  <w14:prstDash w14:val="solid"/>
+                                  <w14:round/>
+                                </w14:textOutline>
+                              </w:rPr>
+                              <w:t xml:space="preserve"> .</w:t>
+                            </w:r>
+                            <w:proofErr w:type="spellStart"/>
+                            <w:r>
+                              <w:rPr>
+                                <w:rFonts w:ascii="Consolas" w:hAnsi="Consolas" w:cs="Consolas"/>
+                                <w:color w:val="FFFFFF" w:themeColor="background1"/>
+                                <w14:shadow w14:blurRad="38100" w14:dist="19050" w14:dir="2700000" w14:sx="100000" w14:sy="100000" w14:kx="0" w14:ky="0" w14:algn="tl">
+                                  <w14:schemeClr w14:val="dk1">
+                                    <w14:alpha w14:val="60000"/>
+                                  </w14:schemeClr>
+                                </w14:shadow>
+                                <w14:textOutline w14:w="9525" w14:cap="flat" w14:cmpd="sng" w14:algn="ctr">
+                                  <w14:noFill/>
+                                  <w14:prstDash w14:val="solid"/>
+                                  <w14:round/>
+                                </w14:textOutline>
+                              </w:rPr>
+                              <w:t>venv</w:t>
+                            </w:r>
+                            <w:proofErr w:type="spellEnd"/>
+                            <w:proofErr w:type="gramEnd"/>
+                            <w:r>
+                              <w:rPr>
+                                <w:rFonts w:ascii="Consolas" w:hAnsi="Consolas" w:cs="Consolas"/>
+                                <w:color w:val="FFFFFF" w:themeColor="background1"/>
+                                <w14:shadow w14:blurRad="38100" w14:dist="19050" w14:dir="2700000" w14:sx="100000" w14:sy="100000" w14:kx="0" w14:ky="0" w14:algn="tl">
+                                  <w14:schemeClr w14:val="dk1">
+                                    <w14:alpha w14:val="60000"/>
+                                  </w14:schemeClr>
+                                </w14:shadow>
+                                <w14:textOutline w14:w="9525" w14:cap="flat" w14:cmpd="sng" w14:algn="ctr">
+                                  <w14:noFill/>
+                                  <w14:prstDash w14:val="solid"/>
+                                  <w14:round/>
+                                </w14:textOutline>
+                              </w:rPr>
+                              <w:t>/</w:t>
+                            </w:r>
+                            <w:proofErr w:type="spellStart"/>
+                            <w:r>
+                              <w:rPr>
+                                <w:rFonts w:ascii="Consolas" w:hAnsi="Consolas" w:cs="Consolas"/>
+                                <w:color w:val="FFFFFF" w:themeColor="background1"/>
+                                <w14:shadow w14:blurRad="38100" w14:dist="19050" w14:dir="2700000" w14:sx="100000" w14:sy="100000" w14:kx="0" w14:ky="0" w14:algn="tl">
+                                  <w14:schemeClr w14:val="dk1">
+                                    <w14:alpha w14:val="60000"/>
+                                  </w14:schemeClr>
+                                </w14:shadow>
+                                <w14:textOutline w14:w="9525" w14:cap="flat" w14:cmpd="sng" w14:algn="ctr">
+                                  <w14:noFill/>
+                                  <w14:prstDash w14:val="solid"/>
+                                  <w14:round/>
+                                </w14:textOutline>
+                              </w:rPr>
+                              <w:t>bin</w:t>
+                            </w:r>
+                            <w:proofErr w:type="spellEnd"/>
+                            <w:r>
+                              <w:rPr>
+                                <w:rFonts w:ascii="Consolas" w:hAnsi="Consolas" w:cs="Consolas"/>
+                                <w:color w:val="FFFFFF" w:themeColor="background1"/>
+                                <w14:shadow w14:blurRad="38100" w14:dist="19050" w14:dir="2700000" w14:sx="100000" w14:sy="100000" w14:kx="0" w14:ky="0" w14:algn="tl">
+                                  <w14:schemeClr w14:val="dk1">
+                                    <w14:alpha w14:val="60000"/>
+                                  </w14:schemeClr>
+                                </w14:shadow>
+                                <w14:textOutline w14:w="9525" w14:cap="flat" w14:cmpd="sng" w14:algn="ctr">
+                                  <w14:noFill/>
+                                  <w14:prstDash w14:val="solid"/>
+                                  <w14:round/>
+                                </w14:textOutline>
+                              </w:rPr>
+                              <w:t>/</w:t>
+                            </w:r>
+                            <w:proofErr w:type="spellStart"/>
+                            <w:r>
+                              <w:rPr>
+                                <w:rFonts w:ascii="Consolas" w:hAnsi="Consolas" w:cs="Consolas"/>
+                                <w:color w:val="FFFFFF" w:themeColor="background1"/>
+                                <w14:shadow w14:blurRad="38100" w14:dist="19050" w14:dir="2700000" w14:sx="100000" w14:sy="100000" w14:kx="0" w14:ky="0" w14:algn="tl">
+                                  <w14:schemeClr w14:val="dk1">
+                                    <w14:alpha w14:val="60000"/>
+                                  </w14:schemeClr>
+                                </w14:shadow>
+                                <w14:textOutline w14:w="9525" w14:cap="flat" w14:cmpd="sng" w14:algn="ctr">
+                                  <w14:noFill/>
+                                  <w14:prstDash w14:val="solid"/>
+                                  <w14:round/>
+                                </w14:textOutline>
+                              </w:rPr>
+                              <w:t>activate</w:t>
+                            </w:r>
+                            <w:proofErr w:type="spellEnd"/>
+                            <w:r>
+                              <w:rPr>
+                                <w:rFonts w:ascii="Consolas" w:hAnsi="Consolas" w:cs="Consolas"/>
+                                <w:color w:val="FFFFFF" w:themeColor="background1"/>
+                                <w14:shadow w14:blurRad="38100" w14:dist="19050" w14:dir="2700000" w14:sx="100000" w14:sy="100000" w14:kx="0" w14:ky="0" w14:algn="tl">
+                                  <w14:schemeClr w14:val="dk1">
+                                    <w14:alpha w14:val="60000"/>
+                                  </w14:schemeClr>
+                                </w14:shadow>
+                                <w14:textOutline w14:w="9525" w14:cap="flat" w14:cmpd="sng" w14:algn="ctr">
+                                  <w14:noFill/>
+                                  <w14:prstDash w14:val="solid"/>
+                                  <w14:round/>
+                                </w14:textOutline>
+                              </w:rPr>
+                              <w:br/>
+                            </w:r>
+                            <w:proofErr w:type="spellStart"/>
+                            <w:r>
+                              <w:rPr>
+                                <w:rFonts w:ascii="Consolas" w:hAnsi="Consolas" w:cs="Consolas"/>
+                                <w:color w:val="FFFFFF" w:themeColor="background1"/>
+                                <w14:shadow w14:blurRad="38100" w14:dist="19050" w14:dir="2700000" w14:sx="100000" w14:sy="100000" w14:kx="0" w14:ky="0" w14:algn="tl">
+                                  <w14:schemeClr w14:val="dk1">
+                                    <w14:alpha w14:val="60000"/>
+                                  </w14:schemeClr>
+                                </w14:shadow>
+                                <w14:textOutline w14:w="9525" w14:cap="flat" w14:cmpd="sng" w14:algn="ctr">
+                                  <w14:noFill/>
+                                  <w14:prstDash w14:val="solid"/>
+                                  <w14:round/>
+                                </w14:textOutline>
+                              </w:rPr>
+                              <w:t>pyrthon</w:t>
+                            </w:r>
+                            <w:proofErr w:type="spellEnd"/>
+                            <w:r>
+                              <w:rPr>
+                                <w:rFonts w:ascii="Consolas" w:hAnsi="Consolas" w:cs="Consolas"/>
+                                <w:color w:val="FFFFFF" w:themeColor="background1"/>
+                                <w14:shadow w14:blurRad="38100" w14:dist="19050" w14:dir="2700000" w14:sx="100000" w14:sy="100000" w14:kx="0" w14:ky="0" w14:algn="tl">
+                                  <w14:schemeClr w14:val="dk1">
+                                    <w14:alpha w14:val="60000"/>
+                                  </w14:schemeClr>
+                                </w14:shadow>
+                                <w14:textOutline w14:w="9525" w14:cap="flat" w14:cmpd="sng" w14:algn="ctr">
+                                  <w14:noFill/>
+                                  <w14:prstDash w14:val="solid"/>
+                                  <w14:round/>
+                                </w14:textOutline>
+                              </w:rPr>
+                              <w:t xml:space="preserve"> main.py [kép / </w:t>
+                            </w:r>
+                            <w:proofErr w:type="spellStart"/>
+                            <w:r>
+                              <w:rPr>
+                                <w:rFonts w:ascii="Consolas" w:hAnsi="Consolas" w:cs="Consolas"/>
+                                <w:color w:val="FFFFFF" w:themeColor="background1"/>
+                                <w14:shadow w14:blurRad="38100" w14:dist="19050" w14:dir="2700000" w14:sx="100000" w14:sy="100000" w14:kx="0" w14:ky="0" w14:algn="tl">
+                                  <w14:schemeClr w14:val="dk1">
+                                    <w14:alpha w14:val="60000"/>
+                                  </w14:schemeClr>
+                                </w14:shadow>
+                                <w14:textOutline w14:w="9525" w14:cap="flat" w14:cmpd="sng" w14:algn="ctr">
+                                  <w14:noFill/>
+                                  <w14:prstDash w14:val="solid"/>
+                                  <w14:round/>
+                                </w14:textOutline>
+                              </w:rPr>
+                              <w:t>mapp</w:t>
+                            </w:r>
+                            <w:proofErr w:type="spellEnd"/>
+                            <w:r>
+                              <w:rPr>
+                                <w:rFonts w:ascii="Consolas" w:hAnsi="Consolas" w:cs="Consolas"/>
+                                <w:color w:val="FFFFFF" w:themeColor="background1"/>
+                                <w14:shadow w14:blurRad="38100" w14:dist="19050" w14:dir="2700000" w14:sx="100000" w14:sy="100000" w14:kx="0" w14:ky="0" w14:algn="tl">
+                                  <w14:schemeClr w14:val="dk1">
+                                    <w14:alpha w14:val="60000"/>
+                                  </w14:schemeClr>
+                                </w14:shadow>
+                                <w14:textOutline w14:w="9525" w14:cap="flat" w14:cmpd="sng" w14:algn="ctr">
+                                  <w14:noFill/>
+                                  <w14:prstDash w14:val="solid"/>
+                                  <w14:round/>
+                                </w14:textOutline>
+                              </w:rPr>
+                              <w:t>]</w:t>
+                            </w:r>
+                          </w:p>
+                          <w:p>
+                            <w:pPr>
+                              <w:jc w:val="left"/>
+                              <w:rPr>
+                                <w:rFonts w:ascii="Consolas" w:hAnsi="Consolas" w:cs="Consolas"/>
+                                <w:color w:val="FFFFFF" w:themeColor="background1"/>
+                                <w14:shadow w14:blurRad="38100" w14:dist="19050" w14:dir="2700000" w14:sx="100000" w14:sy="100000" w14:kx="0" w14:ky="0" w14:algn="tl">
+                                  <w14:schemeClr w14:val="dk1">
+                                    <w14:alpha w14:val="60000"/>
+                                  </w14:schemeClr>
+                                </w14:shadow>
+                                <w14:textOutline w14:w="9525" w14:cap="flat" w14:cmpd="sng" w14:algn="ctr">
+                                  <w14:noFill/>
+                                  <w14:prstDash w14:val="solid"/>
+                                  <w14:round/>
+                                </w14:textOutline>
+                              </w:rPr>
+                            </w:pPr>
+                          </w:p>
+                          <w:p>
+                            <w:pPr>
+                              <w:jc w:val="left"/>
+                              <w:rPr>
+                                <w:rFonts w:ascii="Consolas" w:hAnsi="Consolas" w:cs="Consolas"/>
+                                <w:color w:val="FFFFFF" w:themeColor="background1"/>
+                                <w14:shadow w14:blurRad="38100" w14:dist="19050" w14:dir="2700000" w14:sx="100000" w14:sy="100000" w14:kx="0" w14:ky="0" w14:algn="tl">
+                                  <w14:schemeClr w14:val="dk1">
+                                    <w14:alpha w14:val="60000"/>
+                                  </w14:schemeClr>
+                                </w14:shadow>
+                                <w14:textOutline w14:w="9525" w14:cap="flat" w14:cmpd="sng" w14:algn="ctr">
+                                  <w14:noFill/>
+                                  <w14:prstDash w14:val="solid"/>
+                                  <w14:round/>
+                                </w14:textOutline>
+                              </w:rPr>
+                            </w:pPr>
+                          </w:p>
+                        </w:txbxContent>
+                      </wps:txbx>
+                      <wps:bodyPr rot="0" spcFirstLastPara="0" vertOverflow="overflow" horzOverflow="overflow" vert="horz" wrap="square" lIns="91440" tIns="45720" rIns="91440" bIns="45720" numCol="1" spcCol="0" rtlCol="0" fromWordArt="0" anchor="t" anchorCtr="0" forceAA="0" compatLnSpc="1">
+                        <a:prstTxWarp prst="textNoShape">
+                          <a:avLst/>
+                        </a:prstTxWarp>
+                        <a:noAutofit/>
+                      </wps:bodyPr>
+                    </wps:wsp>
+                  </a:graphicData>
+                </a:graphic>
+                <wp14:sizeRelV relativeFrom="margin">
+                  <wp14:pctHeight>0</wp14:pctHeight>
+                </wp14:sizeRelV>
+              </wp:anchor>
+            </w:drawing>
+          </mc:Choice>
+          <mc:Fallback>
+            <w:pict>
+              <v:shapetype w14:anchorId="0EDD91AC" id="_x0000_t202" coordsize="21600,21600" o:spt="202" path="m,l,21600r21600,l21600,xe">
+                <v:stroke joinstyle="miter"/>
+                <v:path gradientshapeok="t" o:connecttype="rect"/>
+              </v:shapetype>
+              <v:shape id="Szövegdoboz 1" o:spid="_x0000_s1026" type="#_x0000_t202" style="position:absolute;left:0;text-align:left;margin-left:-1.15pt;margin-top:1.4pt;width:455.75pt;height:42.15pt;z-index:251659264;visibility:visible;mso-wrap-style:square;mso-height-percent:0;mso-wrap-distance-left:9pt;mso-wrap-distance-top:0;mso-wrap-distance-right:9pt;mso-wrap-distance-bottom:0;mso-position-horizontal:absolute;mso-position-horizontal-relative:text;mso-position-vertical:absolute;mso-position-vertical-relative:text;mso-height-percent:0;mso-height-relative:margin;v-text-anchor:top" o:gfxdata="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" fillcolor="gray [1629]" strokeweight=".5pt">
+                <v:textbox>
+                  <w:txbxContent>
+                    <w:p>
+                      <w:pPr>
+                        <w:jc w:val="left"/>
+                        <w:rPr>
+                          <w:rFonts w:ascii="Consolas" w:hAnsi="Consolas" w:cs="Consolas"/>
+                          <w:color w:val="FFFFFF" w:themeColor="background1"/>
+                          <w14:shadow w14:blurRad="38100" w14:dist="19050" w14:dir="2700000" w14:sx="100000" w14:sy="100000" w14:kx="0" w14:ky="0" w14:algn="tl">
+                            <w14:schemeClr w14:val="dk1">
+                              <w14:alpha w14:val="60000"/>
+                            </w14:schemeClr>
+                          </w14:shadow>
+                          <w14:textOutline w14:w="9525" w14:cap="flat" w14:cmpd="sng" w14:algn="ctr">
+                            <w14:noFill/>
+                            <w14:prstDash w14:val="solid"/>
+                            <w14:round/>
+                          </w14:textOutline>
+                        </w:rPr>
+                      </w:pPr>
+                      <w:proofErr w:type="spellStart"/>
+                      <w:proofErr w:type="gramStart"/>
+                      <w:r>
+                        <w:rPr>
+                          <w:rFonts w:ascii="Consolas" w:hAnsi="Consolas" w:cs="Consolas"/>
+                          <w:color w:val="FFFFFF" w:themeColor="background1"/>
+                          <w14:shadow w14:blurRad="38100" w14:dist="19050" w14:dir="2700000" w14:sx="100000" w14:sy="100000" w14:kx="0" w14:ky="0" w14:algn="tl">
+                            <w14:schemeClr w14:val="dk1">
+                              <w14:alpha w14:val="60000"/>
+                            </w14:schemeClr>
+                          </w14:shadow>
+                          <w14:textOutline w14:w="9525" w14:cap="flat" w14:cmpd="sng" w14:algn="ctr">
+                            <w14:noFill/>
+                            <w14:prstDash w14:val="solid"/>
+                            <w14:round/>
+                          </w14:textOutline>
+                        </w:rPr>
+                        <w:t>source</w:t>
+                      </w:r>
+                      <w:proofErr w:type="spellEnd"/>
+                      <w:r>
+                        <w:rPr>
+                          <w:rFonts w:ascii="Consolas" w:hAnsi="Consolas" w:cs="Consolas"/>
+                          <w:color w:val="FFFFFF" w:themeColor="background1"/>
+                          <w14:shadow w14:blurRad="38100" w14:dist="19050" w14:dir="2700000" w14:sx="100000" w14:sy="100000" w14:kx="0" w14:ky="0" w14:algn="tl">
+                            <w14:schemeClr w14:val="dk1">
+                              <w14:alpha w14:val="60000"/>
+                            </w14:schemeClr>
+                          </w14:shadow>
+                          <w14:textOutline w14:w="9525" w14:cap="flat" w14:cmpd="sng" w14:algn="ctr">
+                            <w14:noFill/>
+                            <w14:prstDash w14:val="solid"/>
+                            <w14:round/>
+                          </w14:textOutline>
+                        </w:rPr>
+                        <w:t xml:space="preserve"> .</w:t>
+                      </w:r>
+                      <w:proofErr w:type="spellStart"/>
+                      <w:r>
+                        <w:rPr>
+                          <w:rFonts w:ascii="Consolas" w:hAnsi="Consolas" w:cs="Consolas"/>
+                          <w:color w:val="FFFFFF" w:themeColor="background1"/>
+                          <w14:shadow w14:blurRad="38100" w14:dist="19050" w14:dir="2700000" w14:sx="100000" w14:sy="100000" w14:kx="0" w14:ky="0" w14:algn="tl">
+                            <w14:schemeClr w14:val="dk1">
+                              <w14:alpha w14:val="60000"/>
+                            </w14:schemeClr>
+                          </w14:shadow>
+                          <w14:textOutline w14:w="9525" w14:cap="flat" w14:cmpd="sng" w14:algn="ctr">
+                            <w14:noFill/>
+                            <w14:prstDash w14:val="solid"/>
+                            <w14:round/>
+                          </w14:textOutline>
+                        </w:rPr>
+                        <w:t>venv</w:t>
+                      </w:r>
+                      <w:proofErr w:type="spellEnd"/>
+                      <w:proofErr w:type="gramEnd"/>
+                      <w:r>
+                        <w:rPr>
+                          <w:rFonts w:ascii="Consolas" w:hAnsi="Consolas" w:cs="Consolas"/>
+                          <w:color w:val="FFFFFF" w:themeColor="background1"/>
+                          <w14:shadow w14:blurRad="38100" w14:dist="19050" w14:dir="2700000" w14:sx="100000" w14:sy="100000" w14:kx="0" w14:ky="0" w14:algn="tl">
+                            <w14:schemeClr w14:val="dk1">
+                              <w14:alpha w14:val="60000"/>
+                            </w14:schemeClr>
+                          </w14:shadow>
+                          <w14:textOutline w14:w="9525" w14:cap="flat" w14:cmpd="sng" w14:algn="ctr">
+                            <w14:noFill/>
+                            <w14:prstDash w14:val="solid"/>
+                            <w14:round/>
+                          </w14:textOutline>
+                        </w:rPr>
+                        <w:t>/</w:t>
+                      </w:r>
+                      <w:proofErr w:type="spellStart"/>
+                      <w:r>
+                        <w:rPr>
+                          <w:rFonts w:ascii="Consolas" w:hAnsi="Consolas" w:cs="Consolas"/>
+                          <w:color w:val="FFFFFF" w:themeColor="background1"/>
+                          <w14:shadow w14:blurRad="38100" w14:dist="19050" w14:dir="2700000" w14:sx="100000" w14:sy="100000" w14:kx="0" w14:ky="0" w14:algn="tl">
+                            <w14:schemeClr w14:val="dk1">
+                              <w14:alpha w14:val="60000"/>
+                            </w14:schemeClr>
+                          </w14:shadow>
+                          <w14:textOutline w14:w="9525" w14:cap="flat" w14:cmpd="sng" w14:algn="ctr">
+                            <w14:noFill/>
+                            <w14:prstDash w14:val="solid"/>
+                            <w14:round/>
+                          </w14:textOutline>
+                        </w:rPr>
+                        <w:t>bin</w:t>
+                      </w:r>
+                      <w:proofErr w:type="spellEnd"/>
+                      <w:r>
+                        <w:rPr>
+                          <w:rFonts w:ascii="Consolas" w:hAnsi="Consolas" w:cs="Consolas"/>
+                          <w:color w:val="FFFFFF" w:themeColor="background1"/>
+                          <w14:shadow w14:blurRad="38100" w14:dist="19050" w14:dir="2700000" w14:sx="100000" w14:sy="100000" w14:kx="0" w14:ky="0" w14:algn="tl">
+                            <w14:schemeClr w14:val="dk1">
+                              <w14:alpha w14:val="60000"/>
+                            </w14:schemeClr>
+                          </w14:shadow>
+                          <w14:textOutline w14:w="9525" w14:cap="flat" w14:cmpd="sng" w14:algn="ctr">
+                            <w14:noFill/>
+                            <w14:prstDash w14:val="solid"/>
+                            <w14:round/>
+                          </w14:textOutline>
+                        </w:rPr>
+                        <w:t>/</w:t>
+                      </w:r>
+                      <w:proofErr w:type="spellStart"/>
+                      <w:r>
+                        <w:rPr>
+                          <w:rFonts w:ascii="Consolas" w:hAnsi="Consolas" w:cs="Consolas"/>
+                          <w:color w:val="FFFFFF" w:themeColor="background1"/>
+                          <w14:shadow w14:blurRad="38100" w14:dist="19050" w14:dir="2700000" w14:sx="100000" w14:sy="100000" w14:kx="0" w14:ky="0" w14:algn="tl">
+                            <w14:schemeClr w14:val="dk1">
+                              <w14:alpha w14:val="60000"/>
+                            </w14:schemeClr>
+                          </w14:shadow>
+                          <w14:textOutline w14:w="9525" w14:cap="flat" w14:cmpd="sng" w14:algn="ctr">
+                            <w14:noFill/>
+                            <w14:prstDash w14:val="solid"/>
+                            <w14:round/>
+                          </w14:textOutline>
+                        </w:rPr>
+                        <w:t>activate</w:t>
+                      </w:r>
+                      <w:proofErr w:type="spellEnd"/>
+                      <w:r>
+                        <w:rPr>
+                          <w:rFonts w:ascii="Consolas" w:hAnsi="Consolas" w:cs="Consolas"/>
+                          <w:color w:val="FFFFFF" w:themeColor="background1"/>
+                          <w14:shadow w14:blurRad="38100" w14:dist="19050" w14:dir="2700000" w14:sx="100000" w14:sy="100000" w14:kx="0" w14:ky="0" w14:algn="tl">
+                            <w14:schemeClr w14:val="dk1">
+                              <w14:alpha w14:val="60000"/>
+                            </w14:schemeClr>
+                          </w14:shadow>
+                          <w14:textOutline w14:w="9525" w14:cap="flat" w14:cmpd="sng" w14:algn="ctr">
+                            <w14:noFill/>
+                            <w14:prstDash w14:val="solid"/>
+                            <w14:round/>
+                          </w14:textOutline>
+                        </w:rPr>
+                        <w:br/>
+                      </w:r>
+                      <w:proofErr w:type="spellStart"/>
+                      <w:r>
+                        <w:rPr>
+                          <w:rFonts w:ascii="Consolas" w:hAnsi="Consolas" w:cs="Consolas"/>
+                          <w:color w:val="FFFFFF" w:themeColor="background1"/>
+                          <w14:shadow w14:blurRad="38100" w14:dist="19050" w14:dir="2700000" w14:sx="100000" w14:sy="100000" w14:kx="0" w14:ky="0" w14:algn="tl">
+                            <w14:schemeClr w14:val="dk1">
+                              <w14:alpha w14:val="60000"/>
+                            </w14:schemeClr>
+                          </w14:shadow>
+                          <w14:textOutline w14:w="9525" w14:cap="flat" w14:cmpd="sng" w14:algn="ctr">
+                            <w14:noFill/>
+                            <w14:prstDash w14:val="solid"/>
+                            <w14:round/>
+                          </w14:textOutline>
+                        </w:rPr>
+                        <w:t>pyrthon</w:t>
+                      </w:r>
+                      <w:proofErr w:type="spellEnd"/>
+                      <w:r>
+                        <w:rPr>
+                          <w:rFonts w:ascii="Consolas" w:hAnsi="Consolas" w:cs="Consolas"/>
+                          <w:color w:val="FFFFFF" w:themeColor="background1"/>
+                          <w14:shadow w14:blurRad="38100" w14:dist="19050" w14:dir="2700000" w14:sx="100000" w14:sy="100000" w14:kx="0" w14:ky="0" w14:algn="tl">
+                            <w14:schemeClr w14:val="dk1">
+                              <w14:alpha w14:val="60000"/>
+                            </w14:schemeClr>
+                          </w14:shadow>
+                          <w14:textOutline w14:w="9525" w14:cap="flat" w14:cmpd="sng" w14:algn="ctr">
+                            <w14:noFill/>
+                            <w14:prstDash w14:val="solid"/>
+                            <w14:round/>
+                          </w14:textOutline>
+                        </w:rPr>
+                        <w:t xml:space="preserve"> main.py [kép / </w:t>
+                      </w:r>
+                      <w:proofErr w:type="spellStart"/>
+                      <w:r>
+                        <w:rPr>
+                          <w:rFonts w:ascii="Consolas" w:hAnsi="Consolas" w:cs="Consolas"/>
+                          <w:color w:val="FFFFFF" w:themeColor="background1"/>
+                          <w14:shadow w14:blurRad="38100" w14:dist="19050" w14:dir="2700000" w14:sx="100000" w14:sy="100000" w14:kx="0" w14:ky="0" w14:algn="tl">
+                            <w14:schemeClr w14:val="dk1">
+                              <w14:alpha w14:val="60000"/>
+                            </w14:schemeClr>
+                          </w14:shadow>
+                          <w14:textOutline w14:w="9525" w14:cap="flat" w14:cmpd="sng" w14:algn="ctr">
+                            <w14:noFill/>
+                            <w14:prstDash w14:val="solid"/>
+                            <w14:round/>
+                          </w14:textOutline>
+                        </w:rPr>
+                        <w:t>mapp</w:t>
+                      </w:r>
+                      <w:proofErr w:type="spellEnd"/>
+                      <w:r>
+                        <w:rPr>
+                          <w:rFonts w:ascii="Consolas" w:hAnsi="Consolas" w:cs="Consolas"/>
+                          <w:color w:val="FFFFFF" w:themeColor="background1"/>
+                          <w14:shadow w14:blurRad="38100" w14:dist="19050" w14:dir="2700000" w14:sx="100000" w14:sy="100000" w14:kx="0" w14:ky="0" w14:algn="tl">
+                            <w14:schemeClr w14:val="dk1">
+                              <w14:alpha w14:val="60000"/>
+                            </w14:schemeClr>
+                          </w14:shadow>
+                          <w14:textOutline w14:w="9525" w14:cap="flat" w14:cmpd="sng" w14:algn="ctr">
+                            <w14:noFill/>
+                            <w14:prstDash w14:val="solid"/>
+                            <w14:round/>
+                          </w14:textOutline>
+                        </w:rPr>
+                        <w:t>]</w:t>
+                      </w:r>
+                    </w:p>
+                    <w:p>
+                      <w:pPr>
+                        <w:jc w:val="left"/>
+                        <w:rPr>
+                          <w:rFonts w:ascii="Consolas" w:hAnsi="Consolas" w:cs="Consolas"/>
+                          <w:color w:val="FFFFFF" w:themeColor="background1"/>
+                          <w14:shadow w14:blurRad="38100" w14:dist="19050" w14:dir="2700000" w14:sx="100000" w14:sy="100000" w14:kx="0" w14:ky="0" w14:algn="tl">
+                            <w14:schemeClr w14:val="dk1">
+                              <w14:alpha w14:val="60000"/>
+                            </w14:schemeClr>
+                          </w14:shadow>
+                          <w14:textOutline w14:w="9525" w14:cap="flat" w14:cmpd="sng" w14:algn="ctr">
+                            <w14:noFill/>
+                            <w14:prstDash w14:val="solid"/>
+                            <w14:round/>
+                          </w14:textOutline>
+                        </w:rPr>
+                      </w:pPr>
+                    </w:p>
+                    <w:p>
+                      <w:pPr>
+                        <w:jc w:val="left"/>
+                        <w:rPr>
+                          <w:rFonts w:ascii="Consolas" w:hAnsi="Consolas" w:cs="Consolas"/>
+                          <w:color w:val="FFFFFF" w:themeColor="background1"/>
+                          <w14:shadow w14:blurRad="38100" w14:dist="19050" w14:dir="2700000" w14:sx="100000" w14:sy="100000" w14:kx="0" w14:ky="0" w14:algn="tl">
+                            <w14:schemeClr w14:val="dk1">
+                              <w14:alpha w14:val="60000"/>
+                            </w14:schemeClr>
+                          </w14:shadow>
+                          <w14:textOutline w14:w="9525" w14:cap="flat" w14:cmpd="sng" w14:algn="ctr">
+                            <w14:noFill/>
+                            <w14:prstDash w14:val="solid"/>
+                            <w14:round/>
+                          </w14:textOutline>
+                        </w:rPr>
+                      </w:pPr>
+                    </w:p>
+                  </w:txbxContent>
+                </v:textbox>
+              </v:shape>
+            </w:pict>
+          </mc:Fallback>
+        </mc:AlternateContent>
+      </w:r>
+    </w:p>
+    <w:p/>
+    <w:p>
+      <w:r>
+        <w:lastRenderedPageBreak/>
+        <w:t xml:space="preserve">A statisztikai riport külön fájllal készíthető el. A stat_report.py nem módosítja a </w:t>
+      </w:r>
+      <w:proofErr w:type="spellStart"/>
+      <w:r>
+        <w:t>barcode</w:t>
+      </w:r>
+      <w:proofErr w:type="spellEnd"/>
+      <w:r>
+        <w:t>-feldolgozást, hanem ugyanazt az olvasási függvényt használja, mint a főprogram, majd az eredményeket strukt</w:t>
+      </w:r>
+      <w:r>
+        <w:t>u</w:t>
+      </w:r>
+      <w:r>
+        <w:t>rált formában öss</w:t>
+      </w:r>
+      <w:r>
+        <w:t>z</w:t>
+      </w:r>
+      <w:r>
+        <w:t>egyűjti [9].</w:t>
+      </w:r>
+    </w:p>
+    <w:p>
+      <w:r>
+        <w:t>Statisztikai riport készítése:</w:t>
+      </w:r>
+    </w:p>
+    <w:p>
+      <w:r>
+        <w:rPr>
+          <w:noProof/>
+        </w:rPr>
+        <mc:AlternateContent>
+          <mc:Choice Requires="wps">
+            <w:drawing>
+              <wp:anchor distT="0" distB="0" distL="114300" distR="114300" simplePos="0" relativeHeight="251661312" behindDoc="0" locked="0" layoutInCell="1" allowOverlap="1" wp14:anchorId="66844745" wp14:editId="6DCA732F">
+                <wp:simplePos x="0" y="0"/>
+                <wp:positionH relativeFrom="column">
+                  <wp:posOffset>0</wp:posOffset>
+                </wp:positionH>
+                <wp:positionV relativeFrom="paragraph">
+                  <wp:posOffset>0</wp:posOffset>
+                </wp:positionV>
+                <wp:extent cx="5787957" cy="535021"/>
+                <wp:effectExtent l="0" t="0" r="16510" b="9525"/>
+                <wp:wrapNone/>
+                <wp:docPr id="1484392724" name="Szövegdoboz 1"/>
+                <wp:cNvGraphicFramePr/>
+                <a:graphic xmlns:a="http://schemas.openxmlformats.org/drawingml/2006/main">
+                  <a:graphicData uri="http://schemas.microsoft.com/office/word/2010/wordprocessingShape">
+                    <wps:wsp>
+                      <wps:cNvSpPr txBox="1"/>
+                      <wps:spPr>
+                        <a:xfrm>
+                          <a:off x="0" y="0"/>
+                          <a:ext cx="5787957" cy="535021"/>
+                        </a:xfrm>
+                        <a:prstGeom prst="rect">
+                          <a:avLst/>
+                        </a:prstGeom>
+                        <a:solidFill>
+                          <a:schemeClr val="tx1">
+                            <a:lumMod val="50000"/>
+                            <a:lumOff val="50000"/>
+                          </a:schemeClr>
+                        </a:solidFill>
+                        <a:ln w="6350">
+                          <a:solidFill>
+                            <a:prstClr val="black"/>
+                          </a:solidFill>
+                        </a:ln>
+                      </wps:spPr>
+                      <wps:txbx>
+                        <w:txbxContent>
+                          <w:p>
+                            <w:pPr>
+                              <w:jc w:val="left"/>
+                              <w:rPr>
+                                <w:rFonts w:ascii="Consolas" w:hAnsi="Consolas" w:cs="Consolas"/>
+                                <w:color w:val="FFFFFF" w:themeColor="background1"/>
+                                <w14:shadow w14:blurRad="38100" w14:dist="19050" w14:dir="2700000" w14:sx="100000" w14:sy="100000" w14:kx="0" w14:ky="0" w14:algn="tl">
+                                  <w14:schemeClr w14:val="dk1">
+                                    <w14:alpha w14:val="60000"/>
+                                  </w14:schemeClr>
+                                </w14:shadow>
+                                <w14:textOutline w14:w="9525" w14:cap="flat" w14:cmpd="sng" w14:algn="ctr">
+                                  <w14:noFill/>
+                                  <w14:prstDash w14:val="solid"/>
+                                  <w14:round/>
+                                </w14:textOutline>
+                              </w:rPr>
+                            </w:pPr>
+                            <w:proofErr w:type="spellStart"/>
+                            <w:r>
+                              <w:rPr>
+                                <w:rFonts w:ascii="Consolas" w:hAnsi="Consolas" w:cs="Consolas"/>
+                                <w:color w:val="FFFFFF" w:themeColor="background1"/>
+                                <w14:shadow w14:blurRad="38100" w14:dist="19050" w14:dir="2700000" w14:sx="100000" w14:sy="100000" w14:kx="0" w14:ky="0" w14:algn="tl">
+                                  <w14:schemeClr w14:val="dk1">
+                                    <w14:alpha w14:val="60000"/>
+                                  </w14:schemeClr>
+                                </w14:shadow>
+                                <w14:textOutline w14:w="9525" w14:cap="flat" w14:cmpd="sng" w14:algn="ctr">
+                                  <w14:noFill/>
+                                  <w14:prstDash w14:val="solid"/>
+                                  <w14:round/>
+                                </w14:textOutline>
+                              </w:rPr>
+                              <w:t>python</w:t>
+                            </w:r>
+                            <w:proofErr w:type="spellEnd"/>
+                            <w:r>
+                              <w:rPr>
+                                <w:rFonts w:ascii="Consolas" w:hAnsi="Consolas" w:cs="Consolas"/>
+                                <w:color w:val="FFFFFF" w:themeColor="background1"/>
+                                <w14:shadow w14:blurRad="38100" w14:dist="19050" w14:dir="2700000" w14:sx="100000" w14:sy="100000" w14:kx="0" w14:ky="0" w14:algn="tl">
+                                  <w14:schemeClr w14:val="dk1">
+                                    <w14:alpha w14:val="60000"/>
+                                  </w14:schemeClr>
+                                </w14:shadow>
+                                <w14:textOutline w14:w="9525" w14:cap="flat" w14:cmpd="sng" w14:algn="ctr">
+                                  <w14:noFill/>
+                                  <w14:prstDash w14:val="solid"/>
+                                  <w14:round/>
+                                </w14:textOutline>
+                              </w:rPr>
+                              <w:t xml:space="preserve"> stats_report.py </w:t>
+                            </w:r>
+                            <w:proofErr w:type="spellStart"/>
+                            <w:r>
+                              <w:rPr>
+                                <w:rFonts w:ascii="Consolas" w:hAnsi="Consolas" w:cs="Consolas"/>
+                                <w:color w:val="FFFFFF" w:themeColor="background1"/>
+                                <w14:shadow w14:blurRad="38100" w14:dist="19050" w14:dir="2700000" w14:sx="100000" w14:sy="100000" w14:kx="0" w14:ky="0" w14:algn="tl">
+                                  <w14:schemeClr w14:val="dk1">
+                                    <w14:alpha w14:val="60000"/>
+                                  </w14:schemeClr>
+                                </w14:shadow>
+                                <w14:textOutline w14:w="9525" w14:cap="flat" w14:cmpd="sng" w14:algn="ctr">
+                                  <w14:noFill/>
+                                  <w14:prstDash w14:val="solid"/>
+                                  <w14:round/>
+                                </w14:textOutline>
+                              </w:rPr>
+                              <w:t>tests</w:t>
+                            </w:r>
+                            <w:proofErr w:type="spellEnd"/>
+                            <w:r>
+                              <w:rPr>
+                                <w:rFonts w:ascii="Consolas" w:hAnsi="Consolas" w:cs="Consolas"/>
+                                <w:color w:val="FFFFFF" w:themeColor="background1"/>
+                                <w14:shadow w14:blurRad="38100" w14:dist="19050" w14:dir="2700000" w14:sx="100000" w14:sy="100000" w14:kx="0" w14:ky="0" w14:algn="tl">
+                                  <w14:schemeClr w14:val="dk1">
+                                    <w14:alpha w14:val="60000"/>
+                                  </w14:schemeClr>
+                                </w14:shadow>
+                                <w14:textOutline w14:w="9525" w14:cap="flat" w14:cmpd="sng" w14:algn="ctr">
+                                  <w14:noFill/>
+                                  <w14:prstDash w14:val="solid"/>
+                                  <w14:round/>
+                                </w14:textOutline>
+                              </w:rPr>
+                              <w:t>/</w:t>
+                            </w:r>
+                            <w:proofErr w:type="spellStart"/>
+                            <w:r>
+                              <w:rPr>
+                                <w:rFonts w:ascii="Consolas" w:hAnsi="Consolas" w:cs="Consolas"/>
+                                <w:color w:val="FFFFFF" w:themeColor="background1"/>
+                                <w14:shadow w14:blurRad="38100" w14:dist="19050" w14:dir="2700000" w14:sx="100000" w14:sy="100000" w14:kx="0" w14:ky="0" w14:algn="tl">
+                                  <w14:schemeClr w14:val="dk1">
+                                    <w14:alpha w14:val="60000"/>
+                                  </w14:schemeClr>
+                                </w14:shadow>
+                                <w14:textOutline w14:w="9525" w14:cap="flat" w14:cmpd="sng" w14:algn="ctr">
+                                  <w14:noFill/>
+                                  <w14:prstDash w14:val="solid"/>
+                                  <w14:round/>
+                                </w14:textOutline>
+                              </w:rPr>
+                              <w:t>images</w:t>
+                            </w:r>
+                            <w:proofErr w:type="spellEnd"/>
+                            <w:r>
+                              <w:rPr>
+                                <w:rFonts w:ascii="Consolas" w:hAnsi="Consolas" w:cs="Consolas"/>
+                                <w:color w:val="FFFFFF" w:themeColor="background1"/>
+                                <w14:shadow w14:blurRad="38100" w14:dist="19050" w14:dir="2700000" w14:sx="100000" w14:sy="100000" w14:kx="0" w14:ky="0" w14:algn="tl">
+                                  <w14:schemeClr w14:val="dk1">
+                                    <w14:alpha w14:val="60000"/>
+                                  </w14:schemeClr>
+                                </w14:shadow>
+                                <w14:textOutline w14:w="9525" w14:cap="flat" w14:cmpd="sng" w14:algn="ctr">
+                                  <w14:noFill/>
+                                  <w14:prstDash w14:val="solid"/>
+                                  <w14:round/>
+                                </w14:textOutline>
+                              </w:rPr>
+                              <w:t>/</w:t>
+                            </w:r>
+                            <w:proofErr w:type="spellStart"/>
+                            <w:r>
+                              <w:rPr>
+                                <w:rFonts w:ascii="Consolas" w:hAnsi="Consolas" w:cs="Consolas"/>
+                                <w:color w:val="FFFFFF" w:themeColor="background1"/>
+                                <w14:shadow w14:blurRad="38100" w14:dist="19050" w14:dir="2700000" w14:sx="100000" w14:sy="100000" w14:kx="0" w14:ky="0" w14:algn="tl">
+                                  <w14:schemeClr w14:val="dk1">
+                                    <w14:alpha w14:val="60000"/>
+                                  </w14:schemeClr>
+                                </w14:shadow>
+                                <w14:textOutline w14:w="9525" w14:cap="flat" w14:cmpd="sng" w14:algn="ctr">
+                                  <w14:noFill/>
+                                  <w14:prstDash w14:val="solid"/>
+                                  <w14:round/>
+                                </w14:textOutline>
+                              </w:rPr>
+                              <w:t>rec</w:t>
+                            </w:r>
+                            <w:proofErr w:type="spellEnd"/>
+                            <w:r>
+                              <w:rPr>
+                                <w:rFonts w:ascii="Consolas" w:hAnsi="Consolas" w:cs="Consolas"/>
+                                <w:color w:val="FFFFFF" w:themeColor="background1"/>
+                                <w14:shadow w14:blurRad="38100" w14:dist="19050" w14:dir="2700000" w14:sx="100000" w14:sy="100000" w14:kx="0" w14:ky="0" w14:algn="tl">
+                                  <w14:schemeClr w14:val="dk1">
+                                    <w14:alpha w14:val="60000"/>
+                                  </w14:schemeClr>
+                                </w14:shadow>
+                                <w14:textOutline w14:w="9525" w14:cap="flat" w14:cmpd="sng" w14:algn="ctr">
+                                  <w14:noFill/>
+                                  <w14:prstDash w14:val="solid"/>
+                                  <w14:round/>
+                                </w14:textOutline>
+                              </w:rPr>
+                              <w:br/>
+                            </w:r>
+                            <w:proofErr w:type="spellStart"/>
+                            <w:r>
+                              <w:rPr>
+                                <w:rFonts w:ascii="Consolas" w:hAnsi="Consolas" w:cs="Consolas"/>
+                                <w:color w:val="FFFFFF" w:themeColor="background1"/>
+                                <w14:shadow w14:blurRad="38100" w14:dist="19050" w14:dir="2700000" w14:sx="100000" w14:sy="100000" w14:kx="0" w14:ky="0" w14:algn="tl">
+                                  <w14:schemeClr w14:val="dk1">
+                                    <w14:alpha w14:val="60000"/>
+                                  </w14:schemeClr>
+                                </w14:shadow>
+                                <w14:textOutline w14:w="9525" w14:cap="flat" w14:cmpd="sng" w14:algn="ctr">
+                                  <w14:noFill/>
+                                  <w14:prstDash w14:val="solid"/>
+                                  <w14:round/>
+                                </w14:textOutline>
+                              </w:rPr>
+                              <w:t>python</w:t>
+                            </w:r>
+                            <w:proofErr w:type="spellEnd"/>
+                            <w:r>
+                              <w:rPr>
+                                <w:rFonts w:ascii="Consolas" w:hAnsi="Consolas" w:cs="Consolas"/>
+                                <w:color w:val="FFFFFF" w:themeColor="background1"/>
+                                <w14:shadow w14:blurRad="38100" w14:dist="19050" w14:dir="2700000" w14:sx="100000" w14:sy="100000" w14:kx="0" w14:ky="0" w14:algn="tl">
+                                  <w14:schemeClr w14:val="dk1">
+                                    <w14:alpha w14:val="60000"/>
+                                  </w14:schemeClr>
+                                </w14:shadow>
+                                <w14:textOutline w14:w="9525" w14:cap="flat" w14:cmpd="sng" w14:algn="ctr">
+                                  <w14:noFill/>
+                                  <w14:prstDash w14:val="solid"/>
+                                  <w14:round/>
+                                </w14:textOutline>
+                              </w:rPr>
+                              <w:t xml:space="preserve"> stats_report.py </w:t>
+                            </w:r>
+                            <w:proofErr w:type="spellStart"/>
+                            <w:r>
+                              <w:rPr>
+                                <w:rFonts w:ascii="Consolas" w:hAnsi="Consolas" w:cs="Consolas"/>
+                                <w:color w:val="FFFFFF" w:themeColor="background1"/>
+                                <w14:shadow w14:blurRad="38100" w14:dist="19050" w14:dir="2700000" w14:sx="100000" w14:sy="100000" w14:kx="0" w14:ky="0" w14:algn="tl">
+                                  <w14:schemeClr w14:val="dk1">
+                                    <w14:alpha w14:val="60000"/>
+                                  </w14:schemeClr>
+                                </w14:shadow>
+                                <w14:textOutline w14:w="9525" w14:cap="flat" w14:cmpd="sng" w14:algn="ctr">
+                                  <w14:noFill/>
+                                  <w14:prstDash w14:val="solid"/>
+                                  <w14:round/>
+                                </w14:textOutline>
+                              </w:rPr>
+                              <w:t>tests</w:t>
+                            </w:r>
+                            <w:proofErr w:type="spellEnd"/>
+                            <w:r>
+                              <w:rPr>
+                                <w:rFonts w:ascii="Consolas" w:hAnsi="Consolas" w:cs="Consolas"/>
+                                <w:color w:val="FFFFFF" w:themeColor="background1"/>
+                                <w14:shadow w14:blurRad="38100" w14:dist="19050" w14:dir="2700000" w14:sx="100000" w14:sy="100000" w14:kx="0" w14:ky="0" w14:algn="tl">
+                                  <w14:schemeClr w14:val="dk1">
+                                    <w14:alpha w14:val="60000"/>
+                                  </w14:schemeClr>
+                                </w14:shadow>
+                                <w14:textOutline w14:w="9525" w14:cap="flat" w14:cmpd="sng" w14:algn="ctr">
+                                  <w14:noFill/>
+                                  <w14:prstDash w14:val="solid"/>
+                                  <w14:round/>
+                                </w14:textOutline>
+                              </w:rPr>
+                              <w:t>/</w:t>
+                            </w:r>
+                            <w:proofErr w:type="spellStart"/>
+                            <w:r>
+                              <w:rPr>
+                                <w:rFonts w:ascii="Consolas" w:hAnsi="Consolas" w:cs="Consolas"/>
+                                <w:color w:val="FFFFFF" w:themeColor="background1"/>
+                                <w14:shadow w14:blurRad="38100" w14:dist="19050" w14:dir="2700000" w14:sx="100000" w14:sy="100000" w14:kx="0" w14:ky="0" w14:algn="tl">
+                                  <w14:schemeClr w14:val="dk1">
+                                    <w14:alpha w14:val="60000"/>
+                                  </w14:schemeClr>
+                                </w14:shadow>
+                                <w14:textOutline w14:w="9525" w14:cap="flat" w14:cmpd="sng" w14:algn="ctr">
+                                  <w14:noFill/>
+                                  <w14:prstDash w14:val="solid"/>
+                                  <w14:round/>
+                                </w14:textOutline>
+                              </w:rPr>
+                              <w:t>images</w:t>
+                            </w:r>
+                            <w:proofErr w:type="spellEnd"/>
+                            <w:r>
+                              <w:rPr>
+                                <w:rFonts w:ascii="Consolas" w:hAnsi="Consolas" w:cs="Consolas"/>
+                                <w:color w:val="FFFFFF" w:themeColor="background1"/>
+                                <w14:shadow w14:blurRad="38100" w14:dist="19050" w14:dir="2700000" w14:sx="100000" w14:sy="100000" w14:kx="0" w14:ky="0" w14:algn="tl">
+                                  <w14:schemeClr w14:val="dk1">
+                                    <w14:alpha w14:val="60000"/>
+                                  </w14:schemeClr>
+                                </w14:shadow>
+                                <w14:textOutline w14:w="9525" w14:cap="flat" w14:cmpd="sng" w14:algn="ctr">
+                                  <w14:noFill/>
+                                  <w14:prstDash w14:val="solid"/>
+                                  <w14:round/>
+                                </w14:textOutline>
+                              </w:rPr>
+                              <w:t>/</w:t>
+                            </w:r>
+                            <w:proofErr w:type="spellStart"/>
+                            <w:r>
+                              <w:rPr>
+                                <w:rFonts w:ascii="Consolas" w:hAnsi="Consolas" w:cs="Consolas"/>
+                                <w:color w:val="FFFFFF" w:themeColor="background1"/>
+                                <w14:shadow w14:blurRad="38100" w14:dist="19050" w14:dir="2700000" w14:sx="100000" w14:sy="100000" w14:kx="0" w14:ky="0" w14:algn="tl">
+                                  <w14:schemeClr w14:val="dk1">
+                                    <w14:alpha w14:val="60000"/>
+                                  </w14:schemeClr>
+                                </w14:shadow>
+                                <w14:textOutline w14:w="9525" w14:cap="flat" w14:cmpd="sng" w14:algn="ctr">
+                                  <w14:noFill/>
+                                  <w14:prstDash w14:val="solid"/>
+                                  <w14:round/>
+                                </w14:textOutline>
+                              </w:rPr>
+                              <w:t>single_test</w:t>
+                            </w:r>
+                            <w:proofErr w:type="spellEnd"/>
+                          </w:p>
+                          <w:p>
+                            <w:pPr>
+                              <w:jc w:val="left"/>
+                              <w:rPr>
+                                <w:rFonts w:ascii="Consolas" w:hAnsi="Consolas" w:cs="Consolas"/>
+                                <w:color w:val="FFFFFF" w:themeColor="background1"/>
+                                <w14:shadow w14:blurRad="38100" w14:dist="19050" w14:dir="2700000" w14:sx="100000" w14:sy="100000" w14:kx="0" w14:ky="0" w14:algn="tl">
+                                  <w14:schemeClr w14:val="dk1">
+                                    <w14:alpha w14:val="60000"/>
+                                  </w14:schemeClr>
+                                </w14:shadow>
+                                <w14:textOutline w14:w="9525" w14:cap="flat" w14:cmpd="sng" w14:algn="ctr">
+                                  <w14:noFill/>
+                                  <w14:prstDash w14:val="solid"/>
+                                  <w14:round/>
+                                </w14:textOutline>
+                              </w:rPr>
+                            </w:pPr>
+                          </w:p>
+                        </w:txbxContent>
+                      </wps:txbx>
+                      <wps:bodyPr rot="0" spcFirstLastPara="0" vertOverflow="overflow" horzOverflow="overflow" vert="horz" wrap="square" lIns="91440" tIns="45720" rIns="91440" bIns="45720" numCol="1" spcCol="0" rtlCol="0" fromWordArt="0" anchor="t" anchorCtr="0" forceAA="0" compatLnSpc="1">
+                        <a:prstTxWarp prst="textNoShape">
+                          <a:avLst/>
+                        </a:prstTxWarp>
+                        <a:noAutofit/>
+                      </wps:bodyPr>
+                    </wps:wsp>
+                  </a:graphicData>
+                </a:graphic>
+                <wp14:sizeRelV relativeFrom="margin">
+                  <wp14:pctHeight>0</wp14:pctHeight>
+                </wp14:sizeRelV>
+              </wp:anchor>
+            </w:drawing>
+          </mc:Choice>
+          <mc:Fallback>
+            <w:pict>
+              <v:shape w14:anchorId="66844745" id="_x0000_s1027" type="#_x0000_t202" style="position:absolute;left:0;text-align:left;margin-left:0;margin-top:0;width:455.75pt;height:42.15pt;z-index:251661312;visibility:visible;mso-wrap-style:square;mso-height-percent:0;mso-wrap-distance-left:9pt;mso-wrap-distance-top:0;mso-wrap-distance-right:9pt;mso-wrap-distance-bottom:0;mso-position-horizontal:absolute;mso-position-horizontal-relative:text;mso-position-vertical:absolute;mso-position-vertical-relative:text;mso-height-percent:0;mso-height-relative:margin;v-text-anchor:top" o:gfxdata="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" fillcolor="gray [1629]" strokeweight=".5pt">
+                <v:textbox>
+                  <w:txbxContent>
+                    <w:p>
+                      <w:pPr>
+                        <w:jc w:val="left"/>
+                        <w:rPr>
+                          <w:rFonts w:ascii="Consolas" w:hAnsi="Consolas" w:cs="Consolas"/>
+                          <w:color w:val="FFFFFF" w:themeColor="background1"/>
+                          <w14:shadow w14:blurRad="38100" w14:dist="19050" w14:dir="2700000" w14:sx="100000" w14:sy="100000" w14:kx="0" w14:ky="0" w14:algn="tl">
+                            <w14:schemeClr w14:val="dk1">
+                              <w14:alpha w14:val="60000"/>
+                            </w14:schemeClr>
+                          </w14:shadow>
+                          <w14:textOutline w14:w="9525" w14:cap="flat" w14:cmpd="sng" w14:algn="ctr">
+                            <w14:noFill/>
+                            <w14:prstDash w14:val="solid"/>
+                            <w14:round/>
+                          </w14:textOutline>
+                        </w:rPr>
+                      </w:pPr>
+                      <w:proofErr w:type="spellStart"/>
+                      <w:r>
+                        <w:rPr>
+                          <w:rFonts w:ascii="Consolas" w:hAnsi="Consolas" w:cs="Consolas"/>
+                          <w:color w:val="FFFFFF" w:themeColor="background1"/>
+                          <w14:shadow w14:blurRad="38100" w14:dist="19050" w14:dir="2700000" w14:sx="100000" w14:sy="100000" w14:kx="0" w14:ky="0" w14:algn="tl">
+                            <w14:schemeClr w14:val="dk1">
+                              <w14:alpha w14:val="60000"/>
+                            </w14:schemeClr>
+                          </w14:shadow>
+                          <w14:textOutline w14:w="9525" w14:cap="flat" w14:cmpd="sng" w14:algn="ctr">
+                            <w14:noFill/>
+                            <w14:prstDash w14:val="solid"/>
+                            <w14:round/>
+                          </w14:textOutline>
+                        </w:rPr>
+                        <w:t>python</w:t>
+                      </w:r>
+                      <w:proofErr w:type="spellEnd"/>
+                      <w:r>
+                        <w:rPr>
+                          <w:rFonts w:ascii="Consolas" w:hAnsi="Consolas" w:cs="Consolas"/>
+                          <w:color w:val="FFFFFF" w:themeColor="background1"/>
+                          <w14:shadow w14:blurRad="38100" w14:dist="19050" w14:dir="2700000" w14:sx="100000" w14:sy="100000" w14:kx="0" w14:ky="0" w14:algn="tl">
+                            <w14:schemeClr w14:val="dk1">
+                              <w14:alpha w14:val="60000"/>
+                            </w14:schemeClr>
+                          </w14:shadow>
+                          <w14:textOutline w14:w="9525" w14:cap="flat" w14:cmpd="sng" w14:algn="ctr">
+                            <w14:noFill/>
+                            <w14:prstDash w14:val="solid"/>
+                            <w14:round/>
+                          </w14:textOutline>
+                        </w:rPr>
+                        <w:t xml:space="preserve"> stats_report.py </w:t>
+                      </w:r>
+                      <w:proofErr w:type="spellStart"/>
+                      <w:r>
+                        <w:rPr>
+                          <w:rFonts w:ascii="Consolas" w:hAnsi="Consolas" w:cs="Consolas"/>
+                          <w:color w:val="FFFFFF" w:themeColor="background1"/>
+                          <w14:shadow w14:blurRad="38100" w14:dist="19050" w14:dir="2700000" w14:sx="100000" w14:sy="100000" w14:kx="0" w14:ky="0" w14:algn="tl">
+                            <w14:schemeClr w14:val="dk1">
+                              <w14:alpha w14:val="60000"/>
+                            </w14:schemeClr>
+                          </w14:shadow>
+                          <w14:textOutline w14:w="9525" w14:cap="flat" w14:cmpd="sng" w14:algn="ctr">
+                            <w14:noFill/>
+                            <w14:prstDash w14:val="solid"/>
+                            <w14:round/>
+                          </w14:textOutline>
+                        </w:rPr>
+                        <w:t>tests</w:t>
+                      </w:r>
+                      <w:proofErr w:type="spellEnd"/>
+                      <w:r>
+                        <w:rPr>
+                          <w:rFonts w:ascii="Consolas" w:hAnsi="Consolas" w:cs="Consolas"/>
+                          <w:color w:val="FFFFFF" w:themeColor="background1"/>
+                          <w14:shadow w14:blurRad="38100" w14:dist="19050" w14:dir="2700000" w14:sx="100000" w14:sy="100000" w14:kx="0" w14:ky="0" w14:algn="tl">
+                            <w14:schemeClr w14:val="dk1">
+                              <w14:alpha w14:val="60000"/>
+                            </w14:schemeClr>
+                          </w14:shadow>
+                          <w14:textOutline w14:w="9525" w14:cap="flat" w14:cmpd="sng" w14:algn="ctr">
+                            <w14:noFill/>
+                            <w14:prstDash w14:val="solid"/>
+                            <w14:round/>
+                          </w14:textOutline>
+                        </w:rPr>
+                        <w:t>/</w:t>
+                      </w:r>
+                      <w:proofErr w:type="spellStart"/>
+                      <w:r>
+                        <w:rPr>
+                          <w:rFonts w:ascii="Consolas" w:hAnsi="Consolas" w:cs="Consolas"/>
+                          <w:color w:val="FFFFFF" w:themeColor="background1"/>
+                          <w14:shadow w14:blurRad="38100" w14:dist="19050" w14:dir="2700000" w14:sx="100000" w14:sy="100000" w14:kx="0" w14:ky="0" w14:algn="tl">
+                            <w14:schemeClr w14:val="dk1">
+                              <w14:alpha w14:val="60000"/>
+                            </w14:schemeClr>
+                          </w14:shadow>
+                          <w14:textOutline w14:w="9525" w14:cap="flat" w14:cmpd="sng" w14:algn="ctr">
+                            <w14:noFill/>
+                            <w14:prstDash w14:val="solid"/>
+                            <w14:round/>
+                          </w14:textOutline>
+                        </w:rPr>
+                        <w:t>images</w:t>
+                      </w:r>
+                      <w:proofErr w:type="spellEnd"/>
+                      <w:r>
+                        <w:rPr>
+                          <w:rFonts w:ascii="Consolas" w:hAnsi="Consolas" w:cs="Consolas"/>
+                          <w:color w:val="FFFFFF" w:themeColor="background1"/>
+                          <w14:shadow w14:blurRad="38100" w14:dist="19050" w14:dir="2700000" w14:sx="100000" w14:sy="100000" w14:kx="0" w14:ky="0" w14:algn="tl">
+                            <w14:schemeClr w14:val="dk1">
+                              <w14:alpha w14:val="60000"/>
+                            </w14:schemeClr>
+                          </w14:shadow>
+                          <w14:textOutline w14:w="9525" w14:cap="flat" w14:cmpd="sng" w14:algn="ctr">
+                            <w14:noFill/>
+                            <w14:prstDash w14:val="solid"/>
+                            <w14:round/>
+                          </w14:textOutline>
+                        </w:rPr>
+                        <w:t>/</w:t>
+                      </w:r>
+                      <w:proofErr w:type="spellStart"/>
+                      <w:r>
+                        <w:rPr>
+                          <w:rFonts w:ascii="Consolas" w:hAnsi="Consolas" w:cs="Consolas"/>
+                          <w:color w:val="FFFFFF" w:themeColor="background1"/>
+                          <w14:shadow w14:blurRad="38100" w14:dist="19050" w14:dir="2700000" w14:sx="100000" w14:sy="100000" w14:kx="0" w14:ky="0" w14:algn="tl">
+                            <w14:schemeClr w14:val="dk1">
+                              <w14:alpha w14:val="60000"/>
+                            </w14:schemeClr>
+                          </w14:shadow>
+                          <w14:textOutline w14:w="9525" w14:cap="flat" w14:cmpd="sng" w14:algn="ctr">
+                            <w14:noFill/>
+                            <w14:prstDash w14:val="solid"/>
+                            <w14:round/>
+                          </w14:textOutline>
+                        </w:rPr>
+                        <w:t>rec</w:t>
+                      </w:r>
+                      <w:proofErr w:type="spellEnd"/>
+                      <w:r>
+                        <w:rPr>
+                          <w:rFonts w:ascii="Consolas" w:hAnsi="Consolas" w:cs="Consolas"/>
+                          <w:color w:val="FFFFFF" w:themeColor="background1"/>
+                          <w14:shadow w14:blurRad="38100" w14:dist="19050" w14:dir="2700000" w14:sx="100000" w14:sy="100000" w14:kx="0" w14:ky="0" w14:algn="tl">
+                            <w14:schemeClr w14:val="dk1">
+                              <w14:alpha w14:val="60000"/>
+                            </w14:schemeClr>
+                          </w14:shadow>
+                          <w14:textOutline w14:w="9525" w14:cap="flat" w14:cmpd="sng" w14:algn="ctr">
+                            <w14:noFill/>
+                            <w14:prstDash w14:val="solid"/>
+                            <w14:round/>
+                          </w14:textOutline>
+                        </w:rPr>
+                        <w:br/>
+                      </w:r>
+                      <w:proofErr w:type="spellStart"/>
+                      <w:r>
+                        <w:rPr>
+                          <w:rFonts w:ascii="Consolas" w:hAnsi="Consolas" w:cs="Consolas"/>
+                          <w:color w:val="FFFFFF" w:themeColor="background1"/>
+                          <w14:shadow w14:blurRad="38100" w14:dist="19050" w14:dir="2700000" w14:sx="100000" w14:sy="100000" w14:kx="0" w14:ky="0" w14:algn="tl">
+                            <w14:schemeClr w14:val="dk1">
+                              <w14:alpha w14:val="60000"/>
+                            </w14:schemeClr>
+                          </w14:shadow>
+                          <w14:textOutline w14:w="9525" w14:cap="flat" w14:cmpd="sng" w14:algn="ctr">
+                            <w14:noFill/>
+                            <w14:prstDash w14:val="solid"/>
+                            <w14:round/>
+                          </w14:textOutline>
+                        </w:rPr>
+                        <w:t>python</w:t>
+                      </w:r>
+                      <w:proofErr w:type="spellEnd"/>
+                      <w:r>
+                        <w:rPr>
+                          <w:rFonts w:ascii="Consolas" w:hAnsi="Consolas" w:cs="Consolas"/>
+                          <w:color w:val="FFFFFF" w:themeColor="background1"/>
+                          <w14:shadow w14:blurRad="38100" w14:dist="19050" w14:dir="2700000" w14:sx="100000" w14:sy="100000" w14:kx="0" w14:ky="0" w14:algn="tl">
+                            <w14:schemeClr w14:val="dk1">
+                              <w14:alpha w14:val="60000"/>
+                            </w14:schemeClr>
+                          </w14:shadow>
+                          <w14:textOutline w14:w="9525" w14:cap="flat" w14:cmpd="sng" w14:algn="ctr">
+                            <w14:noFill/>
+                            <w14:prstDash w14:val="solid"/>
+                            <w14:round/>
+                          </w14:textOutline>
+                        </w:rPr>
+                        <w:t xml:space="preserve"> stats_report.py </w:t>
+                      </w:r>
+                      <w:proofErr w:type="spellStart"/>
+                      <w:r>
+                        <w:rPr>
+                          <w:rFonts w:ascii="Consolas" w:hAnsi="Consolas" w:cs="Consolas"/>
+                          <w:color w:val="FFFFFF" w:themeColor="background1"/>
+                          <w14:shadow w14:blurRad="38100" w14:dist="19050" w14:dir="2700000" w14:sx="100000" w14:sy="100000" w14:kx="0" w14:ky="0" w14:algn="tl">
+                            <w14:schemeClr w14:val="dk1">
+                              <w14:alpha w14:val="60000"/>
+                            </w14:schemeClr>
+                          </w14:shadow>
+                          <w14:textOutline w14:w="9525" w14:cap="flat" w14:cmpd="sng" w14:algn="ctr">
+                            <w14:noFill/>
+                            <w14:prstDash w14:val="solid"/>
+                            <w14:round/>
+                          </w14:textOutline>
+                        </w:rPr>
+                        <w:t>tests</w:t>
+                      </w:r>
+                      <w:proofErr w:type="spellEnd"/>
+                      <w:r>
+                        <w:rPr>
+                          <w:rFonts w:ascii="Consolas" w:hAnsi="Consolas" w:cs="Consolas"/>
+                          <w:color w:val="FFFFFF" w:themeColor="background1"/>
+                          <w14:shadow w14:blurRad="38100" w14:dist="19050" w14:dir="2700000" w14:sx="100000" w14:sy="100000" w14:kx="0" w14:ky="0" w14:algn="tl">
+                            <w14:schemeClr w14:val="dk1">
+                              <w14:alpha w14:val="60000"/>
+                            </w14:schemeClr>
+                          </w14:shadow>
+                          <w14:textOutline w14:w="9525" w14:cap="flat" w14:cmpd="sng" w14:algn="ctr">
+                            <w14:noFill/>
+                            <w14:prstDash w14:val="solid"/>
+                            <w14:round/>
+                          </w14:textOutline>
+                        </w:rPr>
+                        <w:t>/</w:t>
+                      </w:r>
+                      <w:proofErr w:type="spellStart"/>
+                      <w:r>
+                        <w:rPr>
+                          <w:rFonts w:ascii="Consolas" w:hAnsi="Consolas" w:cs="Consolas"/>
+                          <w:color w:val="FFFFFF" w:themeColor="background1"/>
+                          <w14:shadow w14:blurRad="38100" w14:dist="19050" w14:dir="2700000" w14:sx="100000" w14:sy="100000" w14:kx="0" w14:ky="0" w14:algn="tl">
+                            <w14:schemeClr w14:val="dk1">
+                              <w14:alpha w14:val="60000"/>
+                            </w14:schemeClr>
+                          </w14:shadow>
+                          <w14:textOutline w14:w="9525" w14:cap="flat" w14:cmpd="sng" w14:algn="ctr">
+                            <w14:noFill/>
+                            <w14:prstDash w14:val="solid"/>
+                            <w14:round/>
+                          </w14:textOutline>
+                        </w:rPr>
+                        <w:t>images</w:t>
+                      </w:r>
+                      <w:proofErr w:type="spellEnd"/>
+                      <w:r>
+                        <w:rPr>
+                          <w:rFonts w:ascii="Consolas" w:hAnsi="Consolas" w:cs="Consolas"/>
+                          <w:color w:val="FFFFFF" w:themeColor="background1"/>
+                          <w14:shadow w14:blurRad="38100" w14:dist="19050" w14:dir="2700000" w14:sx="100000" w14:sy="100000" w14:kx="0" w14:ky="0" w14:algn="tl">
+                            <w14:schemeClr w14:val="dk1">
+                              <w14:alpha w14:val="60000"/>
+                            </w14:schemeClr>
+                          </w14:shadow>
+                          <w14:textOutline w14:w="9525" w14:cap="flat" w14:cmpd="sng" w14:algn="ctr">
+                            <w14:noFill/>
+                            <w14:prstDash w14:val="solid"/>
+                            <w14:round/>
+                          </w14:textOutline>
+                        </w:rPr>
+                        <w:t>/</w:t>
+                      </w:r>
+                      <w:proofErr w:type="spellStart"/>
+                      <w:r>
+                        <w:rPr>
+                          <w:rFonts w:ascii="Consolas" w:hAnsi="Consolas" w:cs="Consolas"/>
+                          <w:color w:val="FFFFFF" w:themeColor="background1"/>
+                          <w14:shadow w14:blurRad="38100" w14:dist="19050" w14:dir="2700000" w14:sx="100000" w14:sy="100000" w14:kx="0" w14:ky="0" w14:algn="tl">
+                            <w14:schemeClr w14:val="dk1">
+                              <w14:alpha w14:val="60000"/>
+                            </w14:schemeClr>
+                          </w14:shadow>
+                          <w14:textOutline w14:w="9525" w14:cap="flat" w14:cmpd="sng" w14:algn="ctr">
+                            <w14:noFill/>
+                            <w14:prstDash w14:val="solid"/>
+                            <w14:round/>
+                          </w14:textOutline>
+                        </w:rPr>
+                        <w:t>single_test</w:t>
+                      </w:r>
+                      <w:proofErr w:type="spellEnd"/>
+                    </w:p>
+                    <w:p>
+                      <w:pPr>
+                        <w:jc w:val="left"/>
+                        <w:rPr>
+                          <w:rFonts w:ascii="Consolas" w:hAnsi="Consolas" w:cs="Consolas"/>
+                          <w:color w:val="FFFFFF" w:themeColor="background1"/>
+                          <w14:shadow w14:blurRad="38100" w14:dist="19050" w14:dir="2700000" w14:sx="100000" w14:sy="100000" w14:kx="0" w14:ky="0" w14:algn="tl">
+                            <w14:schemeClr w14:val="dk1">
+                              <w14:alpha w14:val="60000"/>
+                            </w14:schemeClr>
+                          </w14:shadow>
+                          <w14:textOutline w14:w="9525" w14:cap="flat" w14:cmpd="sng" w14:algn="ctr">
+                            <w14:noFill/>
+                            <w14:prstDash w14:val="solid"/>
+                            <w14:round/>
+                          </w14:textOutline>
+                        </w:rPr>
+                      </w:pPr>
+                    </w:p>
+                  </w:txbxContent>
+                </v:textbox>
+              </v:shape>
+            </w:pict>
+          </mc:Fallback>
+        </mc:AlternateContent>
+      </w:r>
+    </w:p>
+    <w:p/>
+    <w:p>
+      <w:r>
+        <w:rPr>
+          <w:noProof/>
+        </w:rPr>
+        <mc:AlternateContent>
+          <mc:Choice Requires="wps">
+            <w:drawing>
+              <wp:anchor distT="0" distB="0" distL="114300" distR="114300" simplePos="0" relativeHeight="251663360" behindDoc="0" locked="0" layoutInCell="1" allowOverlap="1" wp14:anchorId="371A8285" wp14:editId="449DB8BE">
+                <wp:simplePos x="0" y="0"/>
+                <wp:positionH relativeFrom="column">
+                  <wp:posOffset>-4850</wp:posOffset>
+                </wp:positionH>
+                <wp:positionV relativeFrom="paragraph">
+                  <wp:posOffset>319243</wp:posOffset>
+                </wp:positionV>
+                <wp:extent cx="5787390" cy="787940"/>
+                <wp:effectExtent l="0" t="0" r="16510" b="12700"/>
+                <wp:wrapNone/>
+                <wp:docPr id="1231348299" name="Szövegdoboz 1"/>
+                <wp:cNvGraphicFramePr/>
+                <a:graphic xmlns:a="http://schemas.openxmlformats.org/drawingml/2006/main">
+                  <a:graphicData uri="http://schemas.microsoft.com/office/word/2010/wordprocessingShape">
+                    <wps:wsp>
+                      <wps:cNvSpPr txBox="1"/>
+                      <wps:spPr>
+                        <a:xfrm>
+                          <a:off x="0" y="0"/>
+                          <a:ext cx="5787390" cy="787940"/>
+                        </a:xfrm>
+                        <a:prstGeom prst="rect">
+                          <a:avLst/>
+                        </a:prstGeom>
+                        <a:solidFill>
+                          <a:schemeClr val="tx1">
+                            <a:lumMod val="50000"/>
+                            <a:lumOff val="50000"/>
+                          </a:schemeClr>
+                        </a:solidFill>
+                        <a:ln w="6350">
+                          <a:solidFill>
+                            <a:prstClr val="black"/>
+                          </a:solidFill>
+                        </a:ln>
+                      </wps:spPr>
+                      <wps:txbx>
+                        <w:txbxContent>
+                          <w:p>
+                            <w:pPr>
+                              <w:jc w:val="left"/>
+                              <w:rPr>
+                                <w:rFonts w:ascii="Consolas" w:hAnsi="Consolas" w:cs="Consolas"/>
+                                <w:color w:val="FFFFFF" w:themeColor="background1"/>
+                                <w14:shadow w14:blurRad="38100" w14:dist="19050" w14:dir="2700000" w14:sx="100000" w14:sy="100000" w14:kx="0" w14:ky="0" w14:algn="tl">
+                                  <w14:schemeClr w14:val="dk1">
+                                    <w14:alpha w14:val="60000"/>
+                                  </w14:schemeClr>
+                                </w14:shadow>
+                                <w14:textOutline w14:w="9525" w14:cap="flat" w14:cmpd="sng" w14:algn="ctr">
+                                  <w14:noFill/>
+                                  <w14:prstDash w14:val="solid"/>
+                                  <w14:round/>
+                                </w14:textOutline>
+                              </w:rPr>
+                            </w:pPr>
+                            <w:r>
+                              <w:rPr>
+                                <w:rFonts w:ascii="Consolas" w:hAnsi="Consolas" w:cs="Consolas"/>
+                                <w:color w:val="FFFFFF" w:themeColor="background1"/>
+                                <w14:shadow w14:blurRad="38100" w14:dist="19050" w14:dir="2700000" w14:sx="100000" w14:sy="100000" w14:kx="0" w14:ky="0" w14:algn="tl">
+                                  <w14:schemeClr w14:val="dk1">
+                                    <w14:alpha w14:val="60000"/>
+                                  </w14:schemeClr>
+                                </w14:shadow>
+                                <w14:textOutline w14:w="9525" w14:cap="flat" w14:cmpd="sng" w14:algn="ctr">
+                                  <w14:noFill/>
+                                  <w14:prstDash w14:val="solid"/>
+                                  <w14:round/>
+                                </w14:textOutline>
+                              </w:rPr>
+                              <w:t>scanner_report.md       # Markdown formátumú riport</w:t>
+                            </w:r>
+                            <w:r>
+                              <w:rPr>
+                                <w:rFonts w:ascii="Consolas" w:hAnsi="Consolas" w:cs="Consolas"/>
+                                <w:color w:val="FFFFFF" w:themeColor="background1"/>
+                                <w14:shadow w14:blurRad="38100" w14:dist="19050" w14:dir="2700000" w14:sx="100000" w14:sy="100000" w14:kx="0" w14:ky="0" w14:algn="tl">
+                                  <w14:schemeClr w14:val="dk1">
+                                    <w14:alpha w14:val="60000"/>
+                                  </w14:schemeClr>
+                                </w14:shadow>
+                                <w14:textOutline w14:w="9525" w14:cap="flat" w14:cmpd="sng" w14:algn="ctr">
+                                  <w14:noFill/>
+                                  <w14:prstDash w14:val="solid"/>
+                                  <w14:round/>
+                                </w14:textOutline>
+                              </w:rPr>
+                              <w:br/>
+                              <w:t xml:space="preserve">scanner_result.csv      # </w:t>
+                            </w:r>
+                            <w:proofErr w:type="spellStart"/>
+                            <w:r>
+                              <w:rPr>
+                                <w:rFonts w:ascii="Consolas" w:hAnsi="Consolas" w:cs="Consolas"/>
+                                <w:color w:val="FFFFFF" w:themeColor="background1"/>
+                                <w14:shadow w14:blurRad="38100" w14:dist="19050" w14:dir="2700000" w14:sx="100000" w14:sy="100000" w14:kx="0" w14:ky="0" w14:algn="tl">
+                                  <w14:schemeClr w14:val="dk1">
+                                    <w14:alpha w14:val="60000"/>
+                                  </w14:schemeClr>
+                                </w14:shadow>
+                                <w14:textOutline w14:w="9525" w14:cap="flat" w14:cmpd="sng" w14:algn="ctr">
+                                  <w14:noFill/>
+                                  <w14:prstDash w14:val="solid"/>
+                                  <w14:round/>
+                                </w14:textOutline>
+                              </w:rPr>
+                              <w:t>Képenkénti</w:t>
+                            </w:r>
+                            <w:proofErr w:type="spellEnd"/>
+                            <w:r>
+                              <w:rPr>
+                                <w:rFonts w:ascii="Consolas" w:hAnsi="Consolas" w:cs="Consolas"/>
+                                <w:color w:val="FFFFFF" w:themeColor="background1"/>
+                                <w14:shadow w14:blurRad="38100" w14:dist="19050" w14:dir="2700000" w14:sx="100000" w14:sy="100000" w14:kx="0" w14:ky="0" w14:algn="tl">
+                                  <w14:schemeClr w14:val="dk1">
+                                    <w14:alpha w14:val="60000"/>
+                                  </w14:schemeClr>
+                                </w14:shadow>
+                                <w14:textOutline w14:w="9525" w14:cap="flat" w14:cmpd="sng" w14:algn="ctr">
+                                  <w14:noFill/>
+                                  <w14:prstDash w14:val="solid"/>
+                                  <w14:round/>
+                                </w14:textOutline>
+                              </w:rPr>
+                              <w:t xml:space="preserve"> részletes eredménylista</w:t>
+                            </w:r>
+                            <w:r>
+                              <w:rPr>
+                                <w:rFonts w:ascii="Consolas" w:hAnsi="Consolas" w:cs="Consolas"/>
+                                <w:color w:val="FFFFFF" w:themeColor="background1"/>
+                                <w14:shadow w14:blurRad="38100" w14:dist="19050" w14:dir="2700000" w14:sx="100000" w14:sy="100000" w14:kx="0" w14:ky="0" w14:algn="tl">
+                                  <w14:schemeClr w14:val="dk1">
+                                    <w14:alpha w14:val="60000"/>
+                                  </w14:schemeClr>
+                                </w14:shadow>
+                                <w14:textOutline w14:w="9525" w14:cap="flat" w14:cmpd="sng" w14:algn="ctr">
+                                  <w14:noFill/>
+                                  <w14:prstDash w14:val="solid"/>
+                                  <w14:round/>
+                                </w14:textOutline>
+                              </w:rPr>
+                              <w:br/>
+                            </w:r>
+                            <w:proofErr w:type="spellStart"/>
+                            <w:r>
+                              <w:rPr>
+                                <w:rFonts w:ascii="Consolas" w:hAnsi="Consolas" w:cs="Consolas"/>
+                                <w:color w:val="FFFFFF" w:themeColor="background1"/>
+                                <w14:shadow w14:blurRad="38100" w14:dist="19050" w14:dir="2700000" w14:sx="100000" w14:sy="100000" w14:kx="0" w14:ky="0" w14:algn="tl">
+                                  <w14:schemeClr w14:val="dk1">
+                                    <w14:alpha w14:val="60000"/>
+                                  </w14:schemeClr>
+                                </w14:shadow>
+                                <w14:textOutline w14:w="9525" w14:cap="flat" w14:cmpd="sng" w14:algn="ctr">
+                                  <w14:noFill/>
+                                  <w14:prstDash w14:val="solid"/>
+                                  <w14:round/>
+                                </w14:textOutline>
+                              </w:rPr>
+                              <w:t>scanner_</w:t>
+                            </w:r>
+                            <w:proofErr w:type="gramStart"/>
+                            <w:r>
+                              <w:rPr>
+                                <w:rFonts w:ascii="Consolas" w:hAnsi="Consolas" w:cs="Consolas"/>
+                                <w:color w:val="FFFFFF" w:themeColor="background1"/>
+                                <w14:shadow w14:blurRad="38100" w14:dist="19050" w14:dir="2700000" w14:sx="100000" w14:sy="100000" w14:kx="0" w14:ky="0" w14:algn="tl">
+                                  <w14:schemeClr w14:val="dk1">
+                                    <w14:alpha w14:val="60000"/>
+                                  </w14:schemeClr>
+                                </w14:shadow>
+                                <w14:textOutline w14:w="9525" w14:cap="flat" w14:cmpd="sng" w14:algn="ctr">
+                                  <w14:noFill/>
+                                  <w14:prstDash w14:val="solid"/>
+                                  <w14:round/>
+                                </w14:textOutline>
+                              </w:rPr>
+                              <w:t>result.json</w:t>
+                            </w:r>
+                            <w:proofErr w:type="spellEnd"/>
+                            <w:proofErr w:type="gramEnd"/>
+                            <w:r>
+                              <w:rPr>
+                                <w:rFonts w:ascii="Consolas" w:hAnsi="Consolas" w:cs="Consolas"/>
+                                <w:color w:val="FFFFFF" w:themeColor="background1"/>
+                                <w14:shadow w14:blurRad="38100" w14:dist="19050" w14:dir="2700000" w14:sx="100000" w14:sy="100000" w14:kx="0" w14:ky="0" w14:algn="tl">
+                                  <w14:schemeClr w14:val="dk1">
+                                    <w14:alpha w14:val="60000"/>
+                                  </w14:schemeClr>
+                                </w14:shadow>
+                                <w14:textOutline w14:w="9525" w14:cap="flat" w14:cmpd="sng" w14:algn="ctr">
+                                  <w14:noFill/>
+                                  <w14:prstDash w14:val="solid"/>
+                                  <w14:round/>
+                                </w14:textOutline>
+                              </w:rPr>
+                              <w:t xml:space="preserve">     # Géppel könnyebben feldolgozható </w:t>
+                            </w:r>
+                            <w:r>
+                              <w:rPr>
+                                <w:rFonts w:ascii="Consolas" w:hAnsi="Consolas" w:cs="Consolas"/>
+                                <w:color w:val="FFFFFF" w:themeColor="background1"/>
+                                <w14:shadow w14:blurRad="38100" w14:dist="19050" w14:dir="2700000" w14:sx="100000" w14:sy="100000" w14:kx="0" w14:ky="0" w14:algn="tl">
+                                  <w14:schemeClr w14:val="dk1">
+                                    <w14:alpha w14:val="60000"/>
+                                  </w14:schemeClr>
+                                </w14:shadow>
+                                <w14:textOutline w14:w="9525" w14:cap="flat" w14:cmpd="sng" w14:algn="ctr">
+                                  <w14:noFill/>
+                                  <w14:prstDash w14:val="solid"/>
+                                  <w14:round/>
+                                </w14:textOutline>
+                              </w:rPr>
+                              <w:t>lista</w:t>
+                            </w:r>
+                          </w:p>
+                          <w:p>
+                            <w:pPr>
+                              <w:jc w:val="left"/>
+                              <w:rPr>
+                                <w:rFonts w:ascii="Consolas" w:hAnsi="Consolas" w:cs="Consolas"/>
+                                <w:color w:val="FFFFFF" w:themeColor="background1"/>
+                                <w14:shadow w14:blurRad="38100" w14:dist="19050" w14:dir="2700000" w14:sx="100000" w14:sy="100000" w14:kx="0" w14:ky="0" w14:algn="tl">
+                                  <w14:schemeClr w14:val="dk1">
+                                    <w14:alpha w14:val="60000"/>
+                                  </w14:schemeClr>
+                                </w14:shadow>
+                                <w14:textOutline w14:w="9525" w14:cap="flat" w14:cmpd="sng" w14:algn="ctr">
+                                  <w14:noFill/>
+                                  <w14:prstDash w14:val="solid"/>
+                                  <w14:round/>
+                                </w14:textOutline>
+                              </w:rPr>
+                            </w:pPr>
+                          </w:p>
+                        </w:txbxContent>
+                      </wps:txbx>
+                      <wps:bodyPr rot="0" spcFirstLastPara="0" vertOverflow="overflow" horzOverflow="overflow" vert="horz" wrap="square" lIns="91440" tIns="45720" rIns="91440" bIns="45720" numCol="1" spcCol="0" rtlCol="0" fromWordArt="0" anchor="t" anchorCtr="0" forceAA="0" compatLnSpc="1">
+                        <a:prstTxWarp prst="textNoShape">
+                          <a:avLst/>
+                        </a:prstTxWarp>
+                        <a:noAutofit/>
+                      </wps:bodyPr>
+                    </wps:wsp>
+                  </a:graphicData>
+                </a:graphic>
+                <wp14:sizeRelV relativeFrom="margin">
+                  <wp14:pctHeight>0</wp14:pctHeight>
+                </wp14:sizeRelV>
+              </wp:anchor>
+            </w:drawing>
+          </mc:Choice>
+          <mc:Fallback>
+            <w:pict>
+              <v:shape w14:anchorId="371A8285" id="_x0000_s1028" type="#_x0000_t202" style="position:absolute;left:0;text-align:left;margin-left:-.4pt;margin-top:25.15pt;width:455.7pt;height:62.05pt;z-index:251663360;visibility:visible;mso-wrap-style:square;mso-height-percent:0;mso-wrap-distance-left:9pt;mso-wrap-distance-top:0;mso-wrap-distance-right:9pt;mso-wrap-distance-bottom:0;mso-position-horizontal:absolute;mso-position-horizontal-relative:text;mso-position-vertical:absolute;mso-position-vertical-relative:text;mso-height-percent:0;mso-height-relative:margin;v-text-anchor:top" o:gfxdata="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" fillcolor="gray [1629]" strokeweight=".5pt">
+                <v:textbox>
+                  <w:txbxContent>
+                    <w:p>
+                      <w:pPr>
+                        <w:jc w:val="left"/>
+                        <w:rPr>
+                          <w:rFonts w:ascii="Consolas" w:hAnsi="Consolas" w:cs="Consolas"/>
+                          <w:color w:val="FFFFFF" w:themeColor="background1"/>
+                          <w14:shadow w14:blurRad="38100" w14:dist="19050" w14:dir="2700000" w14:sx="100000" w14:sy="100000" w14:kx="0" w14:ky="0" w14:algn="tl">
+                            <w14:schemeClr w14:val="dk1">
+                              <w14:alpha w14:val="60000"/>
+                            </w14:schemeClr>
+                          </w14:shadow>
+                          <w14:textOutline w14:w="9525" w14:cap="flat" w14:cmpd="sng" w14:algn="ctr">
+                            <w14:noFill/>
+                            <w14:prstDash w14:val="solid"/>
+                            <w14:round/>
+                          </w14:textOutline>
+                        </w:rPr>
+                      </w:pPr>
+                      <w:r>
+                        <w:rPr>
+                          <w:rFonts w:ascii="Consolas" w:hAnsi="Consolas" w:cs="Consolas"/>
+                          <w:color w:val="FFFFFF" w:themeColor="background1"/>
+                          <w14:shadow w14:blurRad="38100" w14:dist="19050" w14:dir="2700000" w14:sx="100000" w14:sy="100000" w14:kx="0" w14:ky="0" w14:algn="tl">
+                            <w14:schemeClr w14:val="dk1">
+                              <w14:alpha w14:val="60000"/>
+                            </w14:schemeClr>
+                          </w14:shadow>
+                          <w14:textOutline w14:w="9525" w14:cap="flat" w14:cmpd="sng" w14:algn="ctr">
+                            <w14:noFill/>
+                            <w14:prstDash w14:val="solid"/>
+                            <w14:round/>
+                          </w14:textOutline>
+                        </w:rPr>
+                        <w:t>scanner_report.md       # Markdown formátumú riport</w:t>
+                      </w:r>
+                      <w:r>
+                        <w:rPr>
+                          <w:rFonts w:ascii="Consolas" w:hAnsi="Consolas" w:cs="Consolas"/>
+                          <w:color w:val="FFFFFF" w:themeColor="background1"/>
+                          <w14:shadow w14:blurRad="38100" w14:dist="19050" w14:dir="2700000" w14:sx="100000" w14:sy="100000" w14:kx="0" w14:ky="0" w14:algn="tl">
+                            <w14:schemeClr w14:val="dk1">
+                              <w14:alpha w14:val="60000"/>
+                            </w14:schemeClr>
+                          </w14:shadow>
+                          <w14:textOutline w14:w="9525" w14:cap="flat" w14:cmpd="sng" w14:algn="ctr">
+                            <w14:noFill/>
+                            <w14:prstDash w14:val="solid"/>
+                            <w14:round/>
+                          </w14:textOutline>
+                        </w:rPr>
+                        <w:br/>
+                        <w:t xml:space="preserve">scanner_result.csv      # </w:t>
+                      </w:r>
+                      <w:proofErr w:type="spellStart"/>
+                      <w:r>
+                        <w:rPr>
+                          <w:rFonts w:ascii="Consolas" w:hAnsi="Consolas" w:cs="Consolas"/>
+                          <w:color w:val="FFFFFF" w:themeColor="background1"/>
+                          <w14:shadow w14:blurRad="38100" w14:dist="19050" w14:dir="2700000" w14:sx="100000" w14:sy="100000" w14:kx="0" w14:ky="0" w14:algn="tl">
+                            <w14:schemeClr w14:val="dk1">
+                              <w14:alpha w14:val="60000"/>
+                            </w14:schemeClr>
+                          </w14:shadow>
+                          <w14:textOutline w14:w="9525" w14:cap="flat" w14:cmpd="sng" w14:algn="ctr">
+                            <w14:noFill/>
+                            <w14:prstDash w14:val="solid"/>
+                            <w14:round/>
+                          </w14:textOutline>
+                        </w:rPr>
+                        <w:t>Képenkénti</w:t>
+                      </w:r>
+                      <w:proofErr w:type="spellEnd"/>
+                      <w:r>
+                        <w:rPr>
+                          <w:rFonts w:ascii="Consolas" w:hAnsi="Consolas" w:cs="Consolas"/>
+                          <w:color w:val="FFFFFF" w:themeColor="background1"/>
+                          <w14:shadow w14:blurRad="38100" w14:dist="19050" w14:dir="2700000" w14:sx="100000" w14:sy="100000" w14:kx="0" w14:ky="0" w14:algn="tl">
+                            <w14:schemeClr w14:val="dk1">
+                              <w14:alpha w14:val="60000"/>
+                            </w14:schemeClr>
+                          </w14:shadow>
+                          <w14:textOutline w14:w="9525" w14:cap="flat" w14:cmpd="sng" w14:algn="ctr">
+                            <w14:noFill/>
+                            <w14:prstDash w14:val="solid"/>
+                            <w14:round/>
+                          </w14:textOutline>
+                        </w:rPr>
+                        <w:t xml:space="preserve"> részletes eredménylista</w:t>
+                      </w:r>
+                      <w:r>
+                        <w:rPr>
+                          <w:rFonts w:ascii="Consolas" w:hAnsi="Consolas" w:cs="Consolas"/>
+                          <w:color w:val="FFFFFF" w:themeColor="background1"/>
+                          <w14:shadow w14:blurRad="38100" w14:dist="19050" w14:dir="2700000" w14:sx="100000" w14:sy="100000" w14:kx="0" w14:ky="0" w14:algn="tl">
+                            <w14:schemeClr w14:val="dk1">
+                              <w14:alpha w14:val="60000"/>
+                            </w14:schemeClr>
+                          </w14:shadow>
+                          <w14:textOutline w14:w="9525" w14:cap="flat" w14:cmpd="sng" w14:algn="ctr">
+                            <w14:noFill/>
+                            <w14:prstDash w14:val="solid"/>
+                            <w14:round/>
+                          </w14:textOutline>
+                        </w:rPr>
+                        <w:br/>
+                      </w:r>
+                      <w:proofErr w:type="spellStart"/>
+                      <w:r>
+                        <w:rPr>
+                          <w:rFonts w:ascii="Consolas" w:hAnsi="Consolas" w:cs="Consolas"/>
+                          <w:color w:val="FFFFFF" w:themeColor="background1"/>
+                          <w14:shadow w14:blurRad="38100" w14:dist="19050" w14:dir="2700000" w14:sx="100000" w14:sy="100000" w14:kx="0" w14:ky="0" w14:algn="tl">
+                            <w14:schemeClr w14:val="dk1">
+                              <w14:alpha w14:val="60000"/>
+                            </w14:schemeClr>
+                          </w14:shadow>
+                          <w14:textOutline w14:w="9525" w14:cap="flat" w14:cmpd="sng" w14:algn="ctr">
+                            <w14:noFill/>
+                            <w14:prstDash w14:val="solid"/>
+                            <w14:round/>
+                          </w14:textOutline>
+                        </w:rPr>
+                        <w:t>scanner_</w:t>
+                      </w:r>
+                      <w:proofErr w:type="gramStart"/>
+                      <w:r>
+                        <w:rPr>
+                          <w:rFonts w:ascii="Consolas" w:hAnsi="Consolas" w:cs="Consolas"/>
+                          <w:color w:val="FFFFFF" w:themeColor="background1"/>
+                          <w14:shadow w14:blurRad="38100" w14:dist="19050" w14:dir="2700000" w14:sx="100000" w14:sy="100000" w14:kx="0" w14:ky="0" w14:algn="tl">
+                            <w14:schemeClr w14:val="dk1">
+                              <w14:alpha w14:val="60000"/>
+                            </w14:schemeClr>
+                          </w14:shadow>
+                          <w14:textOutline w14:w="9525" w14:cap="flat" w14:cmpd="sng" w14:algn="ctr">
+                            <w14:noFill/>
+                            <w14:prstDash w14:val="solid"/>
+                            <w14:round/>
+                          </w14:textOutline>
+                        </w:rPr>
+                        <w:t>result.json</w:t>
+                      </w:r>
+                      <w:proofErr w:type="spellEnd"/>
+                      <w:proofErr w:type="gramEnd"/>
+                      <w:r>
+                        <w:rPr>
+                          <w:rFonts w:ascii="Consolas" w:hAnsi="Consolas" w:cs="Consolas"/>
+                          <w:color w:val="FFFFFF" w:themeColor="background1"/>
+                          <w14:shadow w14:blurRad="38100" w14:dist="19050" w14:dir="2700000" w14:sx="100000" w14:sy="100000" w14:kx="0" w14:ky="0" w14:algn="tl">
+                            <w14:schemeClr w14:val="dk1">
+                              <w14:alpha w14:val="60000"/>
+                            </w14:schemeClr>
+                          </w14:shadow>
+                          <w14:textOutline w14:w="9525" w14:cap="flat" w14:cmpd="sng" w14:algn="ctr">
+                            <w14:noFill/>
+                            <w14:prstDash w14:val="solid"/>
+                            <w14:round/>
+                          </w14:textOutline>
+                        </w:rPr>
+                        <w:t xml:space="preserve">     # Géppel könnyebben feldolgozható </w:t>
+                      </w:r>
+                      <w:r>
+                        <w:rPr>
+                          <w:rFonts w:ascii="Consolas" w:hAnsi="Consolas" w:cs="Consolas"/>
+                          <w:color w:val="FFFFFF" w:themeColor="background1"/>
+                          <w14:shadow w14:blurRad="38100" w14:dist="19050" w14:dir="2700000" w14:sx="100000" w14:sy="100000" w14:kx="0" w14:ky="0" w14:algn="tl">
+                            <w14:schemeClr w14:val="dk1">
+                              <w14:alpha w14:val="60000"/>
+                            </w14:schemeClr>
+                          </w14:shadow>
+                          <w14:textOutline w14:w="9525" w14:cap="flat" w14:cmpd="sng" w14:algn="ctr">
+                            <w14:noFill/>
+                            <w14:prstDash w14:val="solid"/>
+                            <w14:round/>
+                          </w14:textOutline>
+                        </w:rPr>
+                        <w:t>lista</w:t>
+                      </w:r>
+                    </w:p>
+                    <w:p>
+                      <w:pPr>
+                        <w:jc w:val="left"/>
+                        <w:rPr>
+                          <w:rFonts w:ascii="Consolas" w:hAnsi="Consolas" w:cs="Consolas"/>
+                          <w:color w:val="FFFFFF" w:themeColor="background1"/>
+                          <w14:shadow w14:blurRad="38100" w14:dist="19050" w14:dir="2700000" w14:sx="100000" w14:sy="100000" w14:kx="0" w14:ky="0" w14:algn="tl">
+                            <w14:schemeClr w14:val="dk1">
+                              <w14:alpha w14:val="60000"/>
+                            </w14:schemeClr>
+                          </w14:shadow>
+                          <w14:textOutline w14:w="9525" w14:cap="flat" w14:cmpd="sng" w14:algn="ctr">
+                            <w14:noFill/>
+                            <w14:prstDash w14:val="solid"/>
+                            <w14:round/>
+                          </w14:textOutline>
+                        </w:rPr>
+                      </w:pPr>
+                    </w:p>
+                  </w:txbxContent>
+                </v:textbox>
+              </v:shape>
+            </w:pict>
+          </mc:Fallback>
+        </mc:AlternateContent>
+      </w:r>
+      <w:r>
+        <w:t>A riportgenerálás három kimeneti fájlt hoz létre:</w:t>
+      </w:r>
+    </w:p>
+    <w:p/>
+    <w:p/>
+    <w:p/>
+    <w:p>
+      <w:r>
+        <w:t xml:space="preserve">A statisztikai riport az OK, ROSSZ és HIBA kategóriák darabszámát és arányát, a hibatípusok gyakoriságát, a </w:t>
+      </w:r>
+      <w:proofErr w:type="spellStart"/>
+      <w:r>
+        <w:t>score</w:t>
+      </w:r>
+      <w:proofErr w:type="spellEnd"/>
+      <w:r>
+        <w:t xml:space="preserve"> és találatszám statisztikáit, a leggyakoribb módszercsaládok, valamint a legfontosabb hibás beolvasásokat tartalmazza [9]. Ezen kimenet alapján készítettem el a </w:t>
+      </w:r>
+      <w:r>
+        <w:t>kiértékelést.</w:t>
+      </w:r>
+    </w:p>
+    <w:p>
+      <w:pPr>
+        <w:pStyle w:val="Cmsor1"/>
+      </w:pPr>
+      <w:bookmarkStart w:id="33" w:name="_Toc229670096"/>
       <w:r>
         <w:t>Összegzés</w:t>
       </w:r>
-      <w:bookmarkEnd w:id="32"/>
+      <w:bookmarkEnd w:id="33"/>
     </w:p>
     <w:p>
       <w:pPr>
         <w:pStyle w:val="Cmsor1"/>
       </w:pPr>
-      <w:bookmarkStart w:id="33" w:name="_Toc229666713"/>
+      <w:bookmarkStart w:id="34" w:name="_Toc229670097"/>
       <w:r>
         <w:t>Források</w:t>
       </w:r>
-      <w:bookmarkEnd w:id="33"/>
+      <w:bookmarkEnd w:id="34"/>
     </w:p>
     <w:p>
       <w:pPr>
@@ -5003,160 +6985,163 @@
         <w:jc w:val="left"/>
       </w:pPr>
       <w:r>
+        <w:t xml:space="preserve">[4] </w:t>
+      </w:r>
+      <w:proofErr w:type="spellStart"/>
+      <w:r>
+        <w:t>OpenCV</w:t>
+      </w:r>
+      <w:proofErr w:type="spellEnd"/>
+      <w:r>
+        <w:t xml:space="preserve">, „Image </w:t>
+      </w:r>
+      <w:proofErr w:type="spellStart"/>
+      <w:r>
+        <w:t>Processing</w:t>
+      </w:r>
+      <w:proofErr w:type="spellEnd"/>
+      <w:r>
+        <w:t xml:space="preserve"> (</w:t>
+      </w:r>
+      <w:proofErr w:type="spellStart"/>
+      <w:r>
+        <w:t>imgproc</w:t>
+      </w:r>
+      <w:proofErr w:type="spellEnd"/>
+      <w:r>
+        <w:t xml:space="preserve"> </w:t>
+      </w:r>
+      <w:proofErr w:type="spellStart"/>
+      <w:r>
+        <w:t>module</w:t>
+      </w:r>
+      <w:proofErr w:type="spellEnd"/>
+      <w:r>
+        <w:t xml:space="preserve">),” </w:t>
+      </w:r>
+      <w:proofErr w:type="spellStart"/>
+      <w:r>
+        <w:t>OpenCV</w:t>
+      </w:r>
+      <w:proofErr w:type="spellEnd"/>
+      <w:r>
+        <w:t xml:space="preserve"> </w:t>
+      </w:r>
+      <w:proofErr w:type="spellStart"/>
+      <w:r>
+        <w:t>Documentation</w:t>
+      </w:r>
+      <w:proofErr w:type="spellEnd"/>
+      <w:r>
+        <w:t>. [Online]. Elérhető: https://docs.opencv.org/3.4/d7/da8/tutorial_table_of_content_imgproc.html. [Hozzáférés: 2026. május 14.]</w:t>
+      </w:r>
+    </w:p>
+    <w:p>
+      <w:pPr>
+        <w:jc w:val="left"/>
+      </w:pPr>
+      <w:r>
+        <w:t xml:space="preserve">[5] </w:t>
+      </w:r>
+      <w:proofErr w:type="spellStart"/>
+      <w:r>
+        <w:t>OpenCV</w:t>
+      </w:r>
+      <w:proofErr w:type="spellEnd"/>
+      <w:r>
+        <w:t xml:space="preserve">-Python </w:t>
+      </w:r>
+      <w:proofErr w:type="spellStart"/>
+      <w:r>
+        <w:t>Tutorials</w:t>
+      </w:r>
+      <w:proofErr w:type="spellEnd"/>
+      <w:r>
+        <w:t xml:space="preserve">, „Image </w:t>
+      </w:r>
+      <w:proofErr w:type="spellStart"/>
+      <w:r>
+        <w:t>Thresholding</w:t>
+      </w:r>
+      <w:proofErr w:type="spellEnd"/>
+      <w:r>
+        <w:t xml:space="preserve">,” </w:t>
+      </w:r>
+      <w:proofErr w:type="spellStart"/>
+      <w:r>
+        <w:t>OpenCV</w:t>
+      </w:r>
+      <w:proofErr w:type="spellEnd"/>
+      <w:r>
+        <w:t xml:space="preserve">-Python </w:t>
+      </w:r>
+      <w:proofErr w:type="spellStart"/>
+      <w:r>
+        <w:t>Tutorials</w:t>
+      </w:r>
+      <w:proofErr w:type="spellEnd"/>
+      <w:r>
+        <w:t>. [Online]. Elérhető: https://opencv24-python-tutorials.readthedocs.io/en/latest/py_tutorials/py_imgproc/py_thresholding/py_thresholding.html. [Hozzáférés: 2026. május 14.]</w:t>
+      </w:r>
+    </w:p>
+    <w:p>
+      <w:pPr>
+        <w:jc w:val="left"/>
+      </w:pPr>
+      <w:r>
+        <w:t xml:space="preserve">[6] </w:t>
+      </w:r>
+      <w:proofErr w:type="spellStart"/>
+      <w:r>
+        <w:t>OpenCV</w:t>
+      </w:r>
+      <w:proofErr w:type="spellEnd"/>
+      <w:r>
+        <w:t xml:space="preserve">-Python </w:t>
+      </w:r>
+      <w:proofErr w:type="spellStart"/>
+      <w:r>
+        <w:t>Tutorials</w:t>
+      </w:r>
+      <w:proofErr w:type="spellEnd"/>
+      <w:r>
+        <w:t>, „</w:t>
+      </w:r>
+      <w:proofErr w:type="spellStart"/>
+      <w:r>
+        <w:t>Morphological</w:t>
+      </w:r>
+      <w:proofErr w:type="spellEnd"/>
+      <w:r>
+        <w:t xml:space="preserve"> </w:t>
+      </w:r>
+      <w:proofErr w:type="spellStart"/>
+      <w:r>
+        <w:t>Transformations</w:t>
+      </w:r>
+      <w:proofErr w:type="spellEnd"/>
+      <w:r>
+        <w:t xml:space="preserve">,” </w:t>
+      </w:r>
+      <w:proofErr w:type="spellStart"/>
+      <w:r>
+        <w:t>OpenCV</w:t>
+      </w:r>
+      <w:proofErr w:type="spellEnd"/>
+      <w:r>
+        <w:t xml:space="preserve">-Python </w:t>
+      </w:r>
+      <w:proofErr w:type="spellStart"/>
+      <w:r>
+        <w:t>Tutorials</w:t>
+      </w:r>
+      <w:proofErr w:type="spellEnd"/>
+      <w:r>
+        <w:t>. [Online]. Elérhető: https://opencv24-python-</w:t>
+      </w:r>
+      <w:r>
         <w:lastRenderedPageBreak/>
-        <w:t xml:space="preserve">[4] </w:t>
-      </w:r>
-      <w:proofErr w:type="spellStart"/>
-      <w:r>
-        <w:t>OpenCV</w:t>
-      </w:r>
-      <w:proofErr w:type="spellEnd"/>
-      <w:r>
-        <w:t xml:space="preserve">, „Image </w:t>
-      </w:r>
-      <w:proofErr w:type="spellStart"/>
-      <w:r>
-        <w:t>Processing</w:t>
-      </w:r>
-      <w:proofErr w:type="spellEnd"/>
-      <w:r>
-        <w:t xml:space="preserve"> (</w:t>
-      </w:r>
-      <w:proofErr w:type="spellStart"/>
-      <w:r>
-        <w:t>imgproc</w:t>
-      </w:r>
-      <w:proofErr w:type="spellEnd"/>
-      <w:r>
-        <w:t xml:space="preserve"> </w:t>
-      </w:r>
-      <w:proofErr w:type="spellStart"/>
-      <w:r>
-        <w:t>module</w:t>
-      </w:r>
-      <w:proofErr w:type="spellEnd"/>
-      <w:r>
-        <w:t xml:space="preserve">),” </w:t>
-      </w:r>
-      <w:proofErr w:type="spellStart"/>
-      <w:r>
-        <w:t>OpenCV</w:t>
-      </w:r>
-      <w:proofErr w:type="spellEnd"/>
-      <w:r>
-        <w:t xml:space="preserve"> </w:t>
-      </w:r>
-      <w:proofErr w:type="spellStart"/>
-      <w:r>
-        <w:t>Documentation</w:t>
-      </w:r>
-      <w:proofErr w:type="spellEnd"/>
-      <w:r>
-        <w:t>. [Online]. Elérhető: https://docs.opencv.org/3.4/d7/da8/tutorial_table_of_content_imgproc.html. [Hozzáférés: 2026. május 14.]</w:t>
-      </w:r>
-    </w:p>
-    <w:p>
-      <w:pPr>
-        <w:jc w:val="left"/>
-      </w:pPr>
-      <w:r>
-        <w:t xml:space="preserve">[5] </w:t>
-      </w:r>
-      <w:proofErr w:type="spellStart"/>
-      <w:r>
-        <w:t>OpenCV</w:t>
-      </w:r>
-      <w:proofErr w:type="spellEnd"/>
-      <w:r>
-        <w:t xml:space="preserve">-Python </w:t>
-      </w:r>
-      <w:proofErr w:type="spellStart"/>
-      <w:r>
-        <w:t>Tutorials</w:t>
-      </w:r>
-      <w:proofErr w:type="spellEnd"/>
-      <w:r>
-        <w:t xml:space="preserve">, „Image </w:t>
-      </w:r>
-      <w:proofErr w:type="spellStart"/>
-      <w:r>
-        <w:t>Thresholding</w:t>
-      </w:r>
-      <w:proofErr w:type="spellEnd"/>
-      <w:r>
-        <w:t xml:space="preserve">,” </w:t>
-      </w:r>
-      <w:proofErr w:type="spellStart"/>
-      <w:r>
-        <w:t>OpenCV</w:t>
-      </w:r>
-      <w:proofErr w:type="spellEnd"/>
-      <w:r>
-        <w:t xml:space="preserve">-Python </w:t>
-      </w:r>
-      <w:proofErr w:type="spellStart"/>
-      <w:r>
-        <w:t>Tutorials</w:t>
-      </w:r>
-      <w:proofErr w:type="spellEnd"/>
-      <w:r>
-        <w:t>. [Online]. Elérhető: https://opencv24-python-tutorials.readthedocs.io/en/latest/py_tutorials/py_imgproc/py_thresholding/py_thresholding.html. [Hozzáférés: 2026. május 14.]</w:t>
-      </w:r>
-    </w:p>
-    <w:p>
-      <w:pPr>
-        <w:jc w:val="left"/>
-      </w:pPr>
-      <w:r>
-        <w:t xml:space="preserve">[6] </w:t>
-      </w:r>
-      <w:proofErr w:type="spellStart"/>
-      <w:r>
-        <w:t>OpenCV</w:t>
-      </w:r>
-      <w:proofErr w:type="spellEnd"/>
-      <w:r>
-        <w:t xml:space="preserve">-Python </w:t>
-      </w:r>
-      <w:proofErr w:type="spellStart"/>
-      <w:r>
-        <w:t>Tutorials</w:t>
-      </w:r>
-      <w:proofErr w:type="spellEnd"/>
-      <w:r>
-        <w:t>, „</w:t>
-      </w:r>
-      <w:proofErr w:type="spellStart"/>
-      <w:r>
-        <w:t>Morphological</w:t>
-      </w:r>
-      <w:proofErr w:type="spellEnd"/>
-      <w:r>
-        <w:t xml:space="preserve"> </w:t>
-      </w:r>
-      <w:proofErr w:type="spellStart"/>
-      <w:r>
-        <w:t>Transformations</w:t>
-      </w:r>
-      <w:proofErr w:type="spellEnd"/>
-      <w:r>
-        <w:t xml:space="preserve">,” </w:t>
-      </w:r>
-      <w:proofErr w:type="spellStart"/>
-      <w:r>
-        <w:t>OpenCV</w:t>
-      </w:r>
-      <w:proofErr w:type="spellEnd"/>
-      <w:r>
-        <w:t xml:space="preserve">-Python </w:t>
-      </w:r>
-      <w:proofErr w:type="spellStart"/>
-      <w:r>
-        <w:t>Tutorials</w:t>
-      </w:r>
-      <w:proofErr w:type="spellEnd"/>
-      <w:r>
-        <w:t>. [Online]. Elérhető: https://opencv24-python-tutorials.readthedocs.io/en/latest/py_tutorials/py_imgproc/py_morphological_ops/py_morphological_ops.html. [Hozzáférés: 2026. május 14.]</w:t>
+        <w:t>tutorials.readthedocs.io/en/latest/py_tutorials/py_imgproc/py_morphological_ops/py_morphological_ops.html. [Hozzáférés: 2026. május 14.]</w:t>
       </w:r>
     </w:p>
     <w:p>
@@ -7305,7 +9290,7 @@
 </file>
 
 <file path=customXml/itemProps1.xml><?xml version="1.0" encoding="utf-8"?>
-<ds:datastoreItem xmlns:ds="http://schemas.openxmlformats.org/officeDocument/2006/customXml" ds:itemID="{155132B8-8294-5547-B7B1-29C13398C11B}">
+<ds:datastoreItem xmlns:ds="http://schemas.openxmlformats.org/officeDocument/2006/customXml" ds:itemID="{5151E254-5E18-0F4F-AD5D-C3DBEFF84D53}">
   <ds:schemaRefs>
     <ds:schemaRef ds:uri="http://schemas.openxmlformats.org/officeDocument/2006/bibliography"/>
   </ds:schemaRefs>

</xml_diff>

<commit_message>
[Add] documentation -> stats, final
</commit_message>
<xml_diff>
--- a/documentation.docx
+++ b/documentation.docx
@@ -120,6 +120,17 @@
     </w:p>
     <w:sdt>
       <w:sdtPr>
+        <w:rPr>
+          <w:rFonts w:asciiTheme="minorHAnsi" w:eastAsiaTheme="minorHAnsi" w:hAnsiTheme="minorHAnsi" w:cstheme="minorBidi"/>
+          <w:b w:val="0"/>
+          <w:bCs w:val="0"/>
+          <w:color w:val="auto"/>
+          <w:kern w:val="2"/>
+          <w:sz w:val="24"/>
+          <w:szCs w:val="24"/>
+          <w:lang w:eastAsia="en-US"/>
+          <w14:ligatures w14:val="standardContextual"/>
+        </w:rPr>
         <w:id w:val="813452132"/>
         <w:docPartObj>
           <w:docPartGallery w:val="Table of Contents"/>
@@ -128,14 +139,7 @@
       </w:sdtPr>
       <w:sdtEndPr>
         <w:rPr>
-          <w:rFonts w:asciiTheme="minorHAnsi" w:eastAsiaTheme="minorHAnsi" w:hAnsiTheme="minorHAnsi" w:cstheme="minorBidi"/>
           <w:noProof/>
-          <w:color w:val="auto"/>
-          <w:kern w:val="2"/>
-          <w:sz w:val="24"/>
-          <w:szCs w:val="24"/>
-          <w:lang w:eastAsia="en-US"/>
-          <w14:ligatures w14:val="standardContextual"/>
         </w:rPr>
       </w:sdtEndPr>
       <w:sdtContent>
@@ -182,7 +186,7 @@
             </w:rPr>
             <w:fldChar w:fldCharType="separate"/>
           </w:r>
-          <w:hyperlink w:anchor="_Toc229670063" w:history="1">
+          <w:hyperlink w:anchor="_Toc229745823" w:history="1">
             <w:r>
               <w:rPr>
                 <w:rStyle w:val="Hiperhivatkozs"/>
@@ -229,7 +233,7 @@
                 <w:noProof/>
                 <w:webHidden/>
               </w:rPr>
-              <w:instrText xml:space="preserve"> PAGEREF _Toc229670063 \h </w:instrText>
+              <w:instrText xml:space="preserve"> PAGEREF _Toc229745823 \h </w:instrText>
             </w:r>
             <w:r>
               <w:rPr>
@@ -278,7 +282,7 @@
               <w:lang w:eastAsia="hu-HU"/>
             </w:rPr>
           </w:pPr>
-          <w:hyperlink w:anchor="_Toc229670064" w:history="1">
+          <w:hyperlink w:anchor="_Toc229745824" w:history="1">
             <w:r>
               <w:rPr>
                 <w:rStyle w:val="Hiperhivatkozs"/>
@@ -325,7 +329,7 @@
                 <w:noProof/>
                 <w:webHidden/>
               </w:rPr>
-              <w:instrText xml:space="preserve"> PAGEREF _Toc229670064 \h </w:instrText>
+              <w:instrText xml:space="preserve"> PAGEREF _Toc229745824 \h </w:instrText>
             </w:r>
             <w:r>
               <w:rPr>
@@ -374,7 +378,7 @@
               <w:lang w:eastAsia="hu-HU"/>
             </w:rPr>
           </w:pPr>
-          <w:hyperlink w:anchor="_Toc229670065" w:history="1">
+          <w:hyperlink w:anchor="_Toc229745825" w:history="1">
             <w:r>
               <w:rPr>
                 <w:rStyle w:val="Hiperhivatkozs"/>
@@ -421,7 +425,7 @@
                 <w:noProof/>
                 <w:webHidden/>
               </w:rPr>
-              <w:instrText xml:space="preserve"> PAGEREF _Toc229670065 \h </w:instrText>
+              <w:instrText xml:space="preserve"> PAGEREF _Toc229745825 \h </w:instrText>
             </w:r>
             <w:r>
               <w:rPr>
@@ -468,7 +472,7 @@
               <w:lang w:eastAsia="hu-HU"/>
             </w:rPr>
           </w:pPr>
-          <w:hyperlink w:anchor="_Toc229670066" w:history="1">
+          <w:hyperlink w:anchor="_Toc229745826" w:history="1">
             <w:r>
               <w:rPr>
                 <w:rStyle w:val="Hiperhivatkozs"/>
@@ -513,7 +517,7 @@
                 <w:noProof/>
                 <w:webHidden/>
               </w:rPr>
-              <w:instrText xml:space="preserve"> PAGEREF _Toc229670066 \h </w:instrText>
+              <w:instrText xml:space="preserve"> PAGEREF _Toc229745826 \h </w:instrText>
             </w:r>
             <w:r>
               <w:rPr>
@@ -560,7 +564,7 @@
               <w:lang w:eastAsia="hu-HU"/>
             </w:rPr>
           </w:pPr>
-          <w:hyperlink w:anchor="_Toc229670067" w:history="1">
+          <w:hyperlink w:anchor="_Toc229745827" w:history="1">
             <w:r>
               <w:rPr>
                 <w:rStyle w:val="Hiperhivatkozs"/>
@@ -605,7 +609,7 @@
                 <w:noProof/>
                 <w:webHidden/>
               </w:rPr>
-              <w:instrText xml:space="preserve"> PAGEREF _Toc229670067 \h </w:instrText>
+              <w:instrText xml:space="preserve"> PAGEREF _Toc229745827 \h </w:instrText>
             </w:r>
             <w:r>
               <w:rPr>
@@ -652,7 +656,7 @@
               <w:lang w:eastAsia="hu-HU"/>
             </w:rPr>
           </w:pPr>
-          <w:hyperlink w:anchor="_Toc229670068" w:history="1">
+          <w:hyperlink w:anchor="_Toc229745828" w:history="1">
             <w:r>
               <w:rPr>
                 <w:rStyle w:val="Hiperhivatkozs"/>
@@ -697,7 +701,7 @@
                 <w:noProof/>
                 <w:webHidden/>
               </w:rPr>
-              <w:instrText xml:space="preserve"> PAGEREF _Toc229670068 \h </w:instrText>
+              <w:instrText xml:space="preserve"> PAGEREF _Toc229745828 \h </w:instrText>
             </w:r>
             <w:r>
               <w:rPr>
@@ -744,7 +748,7 @@
               <w:lang w:eastAsia="hu-HU"/>
             </w:rPr>
           </w:pPr>
-          <w:hyperlink w:anchor="_Toc229670069" w:history="1">
+          <w:hyperlink w:anchor="_Toc229745829" w:history="1">
             <w:r>
               <w:rPr>
                 <w:rStyle w:val="Hiperhivatkozs"/>
@@ -789,7 +793,7 @@
                 <w:noProof/>
                 <w:webHidden/>
               </w:rPr>
-              <w:instrText xml:space="preserve"> PAGEREF _Toc229670069 \h </w:instrText>
+              <w:instrText xml:space="preserve"> PAGEREF _Toc229745829 \h </w:instrText>
             </w:r>
             <w:r>
               <w:rPr>
@@ -836,7 +840,7 @@
               <w:lang w:eastAsia="hu-HU"/>
             </w:rPr>
           </w:pPr>
-          <w:hyperlink w:anchor="_Toc229670070" w:history="1">
+          <w:hyperlink w:anchor="_Toc229745830" w:history="1">
             <w:r>
               <w:rPr>
                 <w:rStyle w:val="Hiperhivatkozs"/>
@@ -881,7 +885,7 @@
                 <w:noProof/>
                 <w:webHidden/>
               </w:rPr>
-              <w:instrText xml:space="preserve"> PAGEREF _Toc229670070 \h </w:instrText>
+              <w:instrText xml:space="preserve"> PAGEREF _Toc229745830 \h </w:instrText>
             </w:r>
             <w:r>
               <w:rPr>
@@ -928,7 +932,7 @@
               <w:lang w:eastAsia="hu-HU"/>
             </w:rPr>
           </w:pPr>
-          <w:hyperlink w:anchor="_Toc229670071" w:history="1">
+          <w:hyperlink w:anchor="_Toc229745831" w:history="1">
             <w:r>
               <w:rPr>
                 <w:rStyle w:val="Hiperhivatkozs"/>
@@ -973,7 +977,7 @@
                 <w:noProof/>
                 <w:webHidden/>
               </w:rPr>
-              <w:instrText xml:space="preserve"> PAGEREF _Toc229670071 \h </w:instrText>
+              <w:instrText xml:space="preserve"> PAGEREF _Toc229745831 \h </w:instrText>
             </w:r>
             <w:r>
               <w:rPr>
@@ -1022,7 +1026,7 @@
               <w:lang w:eastAsia="hu-HU"/>
             </w:rPr>
           </w:pPr>
-          <w:hyperlink w:anchor="_Toc229670072" w:history="1">
+          <w:hyperlink w:anchor="_Toc229745832" w:history="1">
             <w:r>
               <w:rPr>
                 <w:rStyle w:val="Hiperhivatkozs"/>
@@ -1069,7 +1073,7 @@
                 <w:noProof/>
                 <w:webHidden/>
               </w:rPr>
-              <w:instrText xml:space="preserve"> PAGEREF _Toc229670072 \h </w:instrText>
+              <w:instrText xml:space="preserve"> PAGEREF _Toc229745832 \h </w:instrText>
             </w:r>
             <w:r>
               <w:rPr>
@@ -1116,7 +1120,7 @@
               <w:lang w:eastAsia="hu-HU"/>
             </w:rPr>
           </w:pPr>
-          <w:hyperlink w:anchor="_Toc229670073" w:history="1">
+          <w:hyperlink w:anchor="_Toc229745833" w:history="1">
             <w:r>
               <w:rPr>
                 <w:rStyle w:val="Hiperhivatkozs"/>
@@ -1161,7 +1165,7 @@
                 <w:noProof/>
                 <w:webHidden/>
               </w:rPr>
-              <w:instrText xml:space="preserve"> PAGEREF _Toc229670073 \h </w:instrText>
+              <w:instrText xml:space="preserve"> PAGEREF _Toc229745833 \h </w:instrText>
             </w:r>
             <w:r>
               <w:rPr>
@@ -1208,7 +1212,7 @@
               <w:lang w:eastAsia="hu-HU"/>
             </w:rPr>
           </w:pPr>
-          <w:hyperlink w:anchor="_Toc229670074" w:history="1">
+          <w:hyperlink w:anchor="_Toc229745834" w:history="1">
             <w:r>
               <w:rPr>
                 <w:rStyle w:val="Hiperhivatkozs"/>
@@ -1253,7 +1257,7 @@
                 <w:noProof/>
                 <w:webHidden/>
               </w:rPr>
-              <w:instrText xml:space="preserve"> PAGEREF _Toc229670074 \h </w:instrText>
+              <w:instrText xml:space="preserve"> PAGEREF _Toc229745834 \h </w:instrText>
             </w:r>
             <w:r>
               <w:rPr>
@@ -1300,7 +1304,7 @@
               <w:lang w:eastAsia="hu-HU"/>
             </w:rPr>
           </w:pPr>
-          <w:hyperlink w:anchor="_Toc229670075" w:history="1">
+          <w:hyperlink w:anchor="_Toc229745835" w:history="1">
             <w:r>
               <w:rPr>
                 <w:rStyle w:val="Hiperhivatkozs"/>
@@ -1345,7 +1349,7 @@
                 <w:noProof/>
                 <w:webHidden/>
               </w:rPr>
-              <w:instrText xml:space="preserve"> PAGEREF _Toc229670075 \h </w:instrText>
+              <w:instrText xml:space="preserve"> PAGEREF _Toc229745835 \h </w:instrText>
             </w:r>
             <w:r>
               <w:rPr>
@@ -1392,7 +1396,7 @@
               <w:lang w:eastAsia="hu-HU"/>
             </w:rPr>
           </w:pPr>
-          <w:hyperlink w:anchor="_Toc229670076" w:history="1">
+          <w:hyperlink w:anchor="_Toc229745836" w:history="1">
             <w:r>
               <w:rPr>
                 <w:rStyle w:val="Hiperhivatkozs"/>
@@ -1437,7 +1441,7 @@
                 <w:noProof/>
                 <w:webHidden/>
               </w:rPr>
-              <w:instrText xml:space="preserve"> PAGEREF _Toc229670076 \h </w:instrText>
+              <w:instrText xml:space="preserve"> PAGEREF _Toc229745836 \h </w:instrText>
             </w:r>
             <w:r>
               <w:rPr>
@@ -1484,7 +1488,7 @@
               <w:lang w:eastAsia="hu-HU"/>
             </w:rPr>
           </w:pPr>
-          <w:hyperlink w:anchor="_Toc229670077" w:history="1">
+          <w:hyperlink w:anchor="_Toc229745837" w:history="1">
             <w:r>
               <w:rPr>
                 <w:rStyle w:val="Hiperhivatkozs"/>
@@ -1529,7 +1533,7 @@
                 <w:noProof/>
                 <w:webHidden/>
               </w:rPr>
-              <w:instrText xml:space="preserve"> PAGEREF _Toc229670077 \h </w:instrText>
+              <w:instrText xml:space="preserve"> PAGEREF _Toc229745837 \h </w:instrText>
             </w:r>
             <w:r>
               <w:rPr>
@@ -1576,7 +1580,7 @@
               <w:lang w:eastAsia="hu-HU"/>
             </w:rPr>
           </w:pPr>
-          <w:hyperlink w:anchor="_Toc229670078" w:history="1">
+          <w:hyperlink w:anchor="_Toc229745838" w:history="1">
             <w:r>
               <w:rPr>
                 <w:rStyle w:val="Hiperhivatkozs"/>
@@ -1621,7 +1625,7 @@
                 <w:noProof/>
                 <w:webHidden/>
               </w:rPr>
-              <w:instrText xml:space="preserve"> PAGEREF _Toc229670078 \h </w:instrText>
+              <w:instrText xml:space="preserve"> PAGEREF _Toc229745838 \h </w:instrText>
             </w:r>
             <w:r>
               <w:rPr>
@@ -1668,7 +1672,7 @@
               <w:lang w:eastAsia="hu-HU"/>
             </w:rPr>
           </w:pPr>
-          <w:hyperlink w:anchor="_Toc229670079" w:history="1">
+          <w:hyperlink w:anchor="_Toc229745839" w:history="1">
             <w:r>
               <w:rPr>
                 <w:rStyle w:val="Hiperhivatkozs"/>
@@ -1713,7 +1717,7 @@
                 <w:noProof/>
                 <w:webHidden/>
               </w:rPr>
-              <w:instrText xml:space="preserve"> PAGEREF _Toc229670079 \h </w:instrText>
+              <w:instrText xml:space="preserve"> PAGEREF _Toc229745839 \h </w:instrText>
             </w:r>
             <w:r>
               <w:rPr>
@@ -1760,7 +1764,7 @@
               <w:lang w:eastAsia="hu-HU"/>
             </w:rPr>
           </w:pPr>
-          <w:hyperlink w:anchor="_Toc229670080" w:history="1">
+          <w:hyperlink w:anchor="_Toc229745840" w:history="1">
             <w:r>
               <w:rPr>
                 <w:rStyle w:val="Hiperhivatkozs"/>
@@ -1805,7 +1809,7 @@
                 <w:noProof/>
                 <w:webHidden/>
               </w:rPr>
-              <w:instrText xml:space="preserve"> PAGEREF _Toc229670080 \h </w:instrText>
+              <w:instrText xml:space="preserve"> PAGEREF _Toc229745840 \h </w:instrText>
             </w:r>
             <w:r>
               <w:rPr>
@@ -1852,7 +1856,7 @@
               <w:lang w:eastAsia="hu-HU"/>
             </w:rPr>
           </w:pPr>
-          <w:hyperlink w:anchor="_Toc229670081" w:history="1">
+          <w:hyperlink w:anchor="_Toc229745841" w:history="1">
             <w:r>
               <w:rPr>
                 <w:rStyle w:val="Hiperhivatkozs"/>
@@ -1897,7 +1901,7 @@
                 <w:noProof/>
                 <w:webHidden/>
               </w:rPr>
-              <w:instrText xml:space="preserve"> PAGEREF _Toc229670081 \h </w:instrText>
+              <w:instrText xml:space="preserve"> PAGEREF _Toc229745841 \h </w:instrText>
             </w:r>
             <w:r>
               <w:rPr>
@@ -1946,7 +1950,7 @@
               <w:lang w:eastAsia="hu-HU"/>
             </w:rPr>
           </w:pPr>
-          <w:hyperlink w:anchor="_Toc229670082" w:history="1">
+          <w:hyperlink w:anchor="_Toc229745842" w:history="1">
             <w:r>
               <w:rPr>
                 <w:rStyle w:val="Hiperhivatkozs"/>
@@ -1993,7 +1997,7 @@
                 <w:noProof/>
                 <w:webHidden/>
               </w:rPr>
-              <w:instrText xml:space="preserve"> PAGEREF _Toc229670082 \h </w:instrText>
+              <w:instrText xml:space="preserve"> PAGEREF _Toc229745842 \h </w:instrText>
             </w:r>
             <w:r>
               <w:rPr>
@@ -2042,7 +2046,7 @@
               <w:lang w:eastAsia="hu-HU"/>
             </w:rPr>
           </w:pPr>
-          <w:hyperlink w:anchor="_Toc229670083" w:history="1">
+          <w:hyperlink w:anchor="_Toc229745843" w:history="1">
             <w:r>
               <w:rPr>
                 <w:rStyle w:val="Hiperhivatkozs"/>
@@ -2089,7 +2093,7 @@
                 <w:noProof/>
                 <w:webHidden/>
               </w:rPr>
-              <w:instrText xml:space="preserve"> PAGEREF _Toc229670083 \h </w:instrText>
+              <w:instrText xml:space="preserve"> PAGEREF _Toc229745843 \h </w:instrText>
             </w:r>
             <w:r>
               <w:rPr>
@@ -2138,7 +2142,7 @@
               <w:lang w:eastAsia="hu-HU"/>
             </w:rPr>
           </w:pPr>
-          <w:hyperlink w:anchor="_Toc229670084" w:history="1">
+          <w:hyperlink w:anchor="_Toc229745844" w:history="1">
             <w:r>
               <w:rPr>
                 <w:rStyle w:val="Hiperhivatkozs"/>
@@ -2185,7 +2189,7 @@
                 <w:noProof/>
                 <w:webHidden/>
               </w:rPr>
-              <w:instrText xml:space="preserve"> PAGEREF _Toc229670084 \h </w:instrText>
+              <w:instrText xml:space="preserve"> PAGEREF _Toc229745844 \h </w:instrText>
             </w:r>
             <w:r>
               <w:rPr>
@@ -2234,7 +2238,7 @@
               <w:lang w:eastAsia="hu-HU"/>
             </w:rPr>
           </w:pPr>
-          <w:hyperlink w:anchor="_Toc229670085" w:history="1">
+          <w:hyperlink w:anchor="_Toc229745845" w:history="1">
             <w:r>
               <w:rPr>
                 <w:rStyle w:val="Hiperhivatkozs"/>
@@ -2281,7 +2285,7 @@
                 <w:noProof/>
                 <w:webHidden/>
               </w:rPr>
-              <w:instrText xml:space="preserve"> PAGEREF _Toc229670085 \h </w:instrText>
+              <w:instrText xml:space="preserve"> PAGEREF _Toc229745845 \h </w:instrText>
             </w:r>
             <w:r>
               <w:rPr>
@@ -2330,7 +2334,7 @@
               <w:lang w:eastAsia="hu-HU"/>
             </w:rPr>
           </w:pPr>
-          <w:hyperlink w:anchor="_Toc229670086" w:history="1">
+          <w:hyperlink w:anchor="_Toc229745846" w:history="1">
             <w:r>
               <w:rPr>
                 <w:rStyle w:val="Hiperhivatkozs"/>
@@ -2377,7 +2381,7 @@
                 <w:noProof/>
                 <w:webHidden/>
               </w:rPr>
-              <w:instrText xml:space="preserve"> PAGEREF _Toc229670086 \h </w:instrText>
+              <w:instrText xml:space="preserve"> PAGEREF _Toc229745846 \h </w:instrText>
             </w:r>
             <w:r>
               <w:rPr>
@@ -2426,7 +2430,7 @@
               <w:lang w:eastAsia="hu-HU"/>
             </w:rPr>
           </w:pPr>
-          <w:hyperlink w:anchor="_Toc229670087" w:history="1">
+          <w:hyperlink w:anchor="_Toc229745847" w:history="1">
             <w:r>
               <w:rPr>
                 <w:rStyle w:val="Hiperhivatkozs"/>
@@ -2473,7 +2477,7 @@
                 <w:noProof/>
                 <w:webHidden/>
               </w:rPr>
-              <w:instrText xml:space="preserve"> PAGEREF _Toc229670087 \h </w:instrText>
+              <w:instrText xml:space="preserve"> PAGEREF _Toc229745847 \h </w:instrText>
             </w:r>
             <w:r>
               <w:rPr>
@@ -2520,7 +2524,7 @@
               <w:lang w:eastAsia="hu-HU"/>
             </w:rPr>
           </w:pPr>
-          <w:hyperlink w:anchor="_Toc229670088" w:history="1">
+          <w:hyperlink w:anchor="_Toc229745848" w:history="1">
             <w:r>
               <w:rPr>
                 <w:rStyle w:val="Hiperhivatkozs"/>
@@ -2565,7 +2569,7 @@
                 <w:noProof/>
                 <w:webHidden/>
               </w:rPr>
-              <w:instrText xml:space="preserve"> PAGEREF _Toc229670088 \h </w:instrText>
+              <w:instrText xml:space="preserve"> PAGEREF _Toc229745848 \h </w:instrText>
             </w:r>
             <w:r>
               <w:rPr>
@@ -2585,7 +2589,7 @@
                 <w:noProof/>
                 <w:webHidden/>
               </w:rPr>
-              <w:t>9</w:t>
+              <w:t>10</w:t>
             </w:r>
             <w:r>
               <w:rPr>
@@ -2612,7 +2616,7 @@
               <w:lang w:eastAsia="hu-HU"/>
             </w:rPr>
           </w:pPr>
-          <w:hyperlink w:anchor="_Toc229670089" w:history="1">
+          <w:hyperlink w:anchor="_Toc229745849" w:history="1">
             <w:r>
               <w:rPr>
                 <w:rStyle w:val="Hiperhivatkozs"/>
@@ -2657,7 +2661,7 @@
                 <w:noProof/>
                 <w:webHidden/>
               </w:rPr>
-              <w:instrText xml:space="preserve"> PAGEREF _Toc229670089 \h </w:instrText>
+              <w:instrText xml:space="preserve"> PAGEREF _Toc229745849 \h </w:instrText>
             </w:r>
             <w:r>
               <w:rPr>
@@ -2677,7 +2681,7 @@
                 <w:noProof/>
                 <w:webHidden/>
               </w:rPr>
-              <w:t>9</w:t>
+              <w:t>11</w:t>
             </w:r>
             <w:r>
               <w:rPr>
@@ -2704,7 +2708,7 @@
               <w:lang w:eastAsia="hu-HU"/>
             </w:rPr>
           </w:pPr>
-          <w:hyperlink w:anchor="_Toc229670090" w:history="1">
+          <w:hyperlink w:anchor="_Toc229745850" w:history="1">
             <w:r>
               <w:rPr>
                 <w:rStyle w:val="Hiperhivatkozs"/>
@@ -2749,7 +2753,7 @@
                 <w:noProof/>
                 <w:webHidden/>
               </w:rPr>
-              <w:instrText xml:space="preserve"> PAGEREF _Toc229670090 \h </w:instrText>
+              <w:instrText xml:space="preserve"> PAGEREF _Toc229745850 \h </w:instrText>
             </w:r>
             <w:r>
               <w:rPr>
@@ -2769,7 +2773,7 @@
                 <w:noProof/>
                 <w:webHidden/>
               </w:rPr>
-              <w:t>9</w:t>
+              <w:t>11</w:t>
             </w:r>
             <w:r>
               <w:rPr>
@@ -2796,7 +2800,7 @@
               <w:lang w:eastAsia="hu-HU"/>
             </w:rPr>
           </w:pPr>
-          <w:hyperlink w:anchor="_Toc229670091" w:history="1">
+          <w:hyperlink w:anchor="_Toc229745851" w:history="1">
             <w:r>
               <w:rPr>
                 <w:rStyle w:val="Hiperhivatkozs"/>
@@ -2841,7 +2845,7 @@
                 <w:noProof/>
                 <w:webHidden/>
               </w:rPr>
-              <w:instrText xml:space="preserve"> PAGEREF _Toc229670091 \h </w:instrText>
+              <w:instrText xml:space="preserve"> PAGEREF _Toc229745851 \h </w:instrText>
             </w:r>
             <w:r>
               <w:rPr>
@@ -2861,7 +2865,7 @@
                 <w:noProof/>
                 <w:webHidden/>
               </w:rPr>
-              <w:t>9</w:t>
+              <w:t>12</w:t>
             </w:r>
             <w:r>
               <w:rPr>
@@ -2888,7 +2892,7 @@
               <w:lang w:eastAsia="hu-HU"/>
             </w:rPr>
           </w:pPr>
-          <w:hyperlink w:anchor="_Toc229670092" w:history="1">
+          <w:hyperlink w:anchor="_Toc229745852" w:history="1">
             <w:r>
               <w:rPr>
                 <w:rStyle w:val="Hiperhivatkozs"/>
@@ -2933,7 +2937,7 @@
                 <w:noProof/>
                 <w:webHidden/>
               </w:rPr>
-              <w:instrText xml:space="preserve"> PAGEREF _Toc229670092 \h </w:instrText>
+              <w:instrText xml:space="preserve"> PAGEREF _Toc229745852 \h </w:instrText>
             </w:r>
             <w:r>
               <w:rPr>
@@ -2953,7 +2957,7 @@
                 <w:noProof/>
                 <w:webHidden/>
               </w:rPr>
-              <w:t>9</w:t>
+              <w:t>12</w:t>
             </w:r>
             <w:r>
               <w:rPr>
@@ -2982,7 +2986,7 @@
               <w:lang w:eastAsia="hu-HU"/>
             </w:rPr>
           </w:pPr>
-          <w:hyperlink w:anchor="_Toc229670093" w:history="1">
+          <w:hyperlink w:anchor="_Toc229745853" w:history="1">
             <w:r>
               <w:rPr>
                 <w:rStyle w:val="Hiperhivatkozs"/>
@@ -3029,7 +3033,7 @@
                 <w:noProof/>
                 <w:webHidden/>
               </w:rPr>
-              <w:instrText xml:space="preserve"> PAGEREF _Toc229670093 \h </w:instrText>
+              <w:instrText xml:space="preserve"> PAGEREF _Toc229745853 \h </w:instrText>
             </w:r>
             <w:r>
               <w:rPr>
@@ -3049,7 +3053,7 @@
                 <w:noProof/>
                 <w:webHidden/>
               </w:rPr>
-              <w:t>9</w:t>
+              <w:t>13</w:t>
             </w:r>
             <w:r>
               <w:rPr>
@@ -3078,7 +3082,7 @@
               <w:lang w:eastAsia="hu-HU"/>
             </w:rPr>
           </w:pPr>
-          <w:hyperlink w:anchor="_Toc229670094" w:history="1">
+          <w:hyperlink w:anchor="_Toc229745854" w:history="1">
             <w:r>
               <w:rPr>
                 <w:rStyle w:val="Hiperhivatkozs"/>
@@ -3125,7 +3129,7 @@
                 <w:noProof/>
                 <w:webHidden/>
               </w:rPr>
-              <w:instrText xml:space="preserve"> PAGEREF _Toc229670094 \h </w:instrText>
+              <w:instrText xml:space="preserve"> PAGEREF _Toc229745854 \h </w:instrText>
             </w:r>
             <w:r>
               <w:rPr>
@@ -3145,7 +3149,7 @@
                 <w:noProof/>
                 <w:webHidden/>
               </w:rPr>
-              <w:t>9</w:t>
+              <w:t>13</w:t>
             </w:r>
             <w:r>
               <w:rPr>
@@ -3174,7 +3178,7 @@
               <w:lang w:eastAsia="hu-HU"/>
             </w:rPr>
           </w:pPr>
-          <w:hyperlink w:anchor="_Toc229670095" w:history="1">
+          <w:hyperlink w:anchor="_Toc229745855" w:history="1">
             <w:r>
               <w:rPr>
                 <w:rStyle w:val="Hiperhivatkozs"/>
@@ -3221,7 +3225,7 @@
                 <w:noProof/>
                 <w:webHidden/>
               </w:rPr>
-              <w:instrText xml:space="preserve"> PAGEREF _Toc229670095 \h </w:instrText>
+              <w:instrText xml:space="preserve"> PAGEREF _Toc229745855 \h </w:instrText>
             </w:r>
             <w:r>
               <w:rPr>
@@ -3241,7 +3245,7 @@
                 <w:noProof/>
                 <w:webHidden/>
               </w:rPr>
-              <w:t>9</w:t>
+              <w:t>14</w:t>
             </w:r>
             <w:r>
               <w:rPr>
@@ -3270,7 +3274,7 @@
               <w:lang w:eastAsia="hu-HU"/>
             </w:rPr>
           </w:pPr>
-          <w:hyperlink w:anchor="_Toc229670096" w:history="1">
+          <w:hyperlink w:anchor="_Toc229745856" w:history="1">
             <w:r>
               <w:rPr>
                 <w:rStyle w:val="Hiperhivatkozs"/>
@@ -3317,7 +3321,7 @@
                 <w:noProof/>
                 <w:webHidden/>
               </w:rPr>
-              <w:instrText xml:space="preserve"> PAGEREF _Toc229670096 \h </w:instrText>
+              <w:instrText xml:space="preserve"> PAGEREF _Toc229745856 \h </w:instrText>
             </w:r>
             <w:r>
               <w:rPr>
@@ -3337,7 +3341,7 @@
                 <w:noProof/>
                 <w:webHidden/>
               </w:rPr>
-              <w:t>10</w:t>
+              <w:t>15</w:t>
             </w:r>
             <w:r>
               <w:rPr>
@@ -3352,7 +3356,6 @@
           <w:pPr>
             <w:pStyle w:val="TJ1"/>
             <w:tabs>
-              <w:tab w:val="left" w:pos="480"/>
               <w:tab w:val="right" w:leader="dot" w:pos="9062"/>
             </w:tabs>
             <w:rPr>
@@ -3366,43 +3369,23 @@
               <w:lang w:eastAsia="hu-HU"/>
             </w:rPr>
           </w:pPr>
-          <w:hyperlink w:anchor="_Toc229670097" w:history="1">
+          <w:hyperlink w:anchor="_Toc229745857" w:history="1">
             <w:r>
               <w:rPr>
                 <w:rStyle w:val="Hiperhivatkozs"/>
                 <w:noProof/>
               </w:rPr>
-              <w:t>15</w:t>
-            </w:r>
-            <w:r>
-              <w:rPr>
-                <w:rFonts w:eastAsiaTheme="minorEastAsia"/>
-                <w:b w:val="0"/>
-                <w:bCs w:val="0"/>
-                <w:caps w:val="0"/>
-                <w:noProof/>
-                <w:sz w:val="24"/>
-                <w:szCs w:val="24"/>
-                <w:lang w:eastAsia="hu-HU"/>
+              <w:t>Források</w:t>
+            </w:r>
+            <w:r>
+              <w:rPr>
+                <w:noProof/>
+                <w:webHidden/>
               </w:rPr>
               <w:tab/>
             </w:r>
             <w:r>
               <w:rPr>
-                <w:rStyle w:val="Hiperhivatkozs"/>
-                <w:noProof/>
-              </w:rPr>
-              <w:t>Források</w:t>
-            </w:r>
-            <w:r>
-              <w:rPr>
-                <w:noProof/>
-                <w:webHidden/>
-              </w:rPr>
-              <w:tab/>
-            </w:r>
-            <w:r>
-              <w:rPr>
                 <w:noProof/>
                 <w:webHidden/>
               </w:rPr>
@@ -3413,7 +3396,7 @@
                 <w:noProof/>
                 <w:webHidden/>
               </w:rPr>
-              <w:instrText xml:space="preserve"> PAGEREF _Toc229670097 \h </w:instrText>
+              <w:instrText xml:space="preserve"> PAGEREF _Toc229745857 \h </w:instrText>
             </w:r>
             <w:r>
               <w:rPr>
@@ -3433,7 +3416,7 @@
                 <w:noProof/>
                 <w:webHidden/>
               </w:rPr>
-              <w:t>10</w:t>
+              <w:t>16</w:t>
             </w:r>
             <w:r>
               <w:rPr>
@@ -3465,7 +3448,7 @@
       <w:pPr>
         <w:pStyle w:val="Cmsor1"/>
       </w:pPr>
-      <w:bookmarkStart w:id="0" w:name="_Toc229670063"/>
+      <w:bookmarkStart w:id="0" w:name="_Toc229745823"/>
       <w:r>
         <w:lastRenderedPageBreak/>
         <w:t>Bevezetés</w:t>
@@ -3537,7 +3520,7 @@
       <w:pPr>
         <w:pStyle w:val="Cmsor1"/>
       </w:pPr>
-      <w:bookmarkStart w:id="1" w:name="_Toc229670064"/>
+      <w:bookmarkStart w:id="1" w:name="_Toc229745824"/>
       <w:r>
         <w:t>A</w:t>
       </w:r>
@@ -3657,7 +3640,7 @@
       <w:pPr>
         <w:pStyle w:val="Cmsor1"/>
       </w:pPr>
-      <w:bookmarkStart w:id="2" w:name="_Toc229670065"/>
+      <w:bookmarkStart w:id="2" w:name="_Toc229745825"/>
       <w:r>
         <w:t>Az EAN-13 kódrendszer áttekintése</w:t>
       </w:r>
@@ -3681,7 +3664,7 @@
       <w:pPr>
         <w:pStyle w:val="Cmsor2"/>
       </w:pPr>
-      <w:bookmarkStart w:id="3" w:name="_Toc229670066"/>
+      <w:bookmarkStart w:id="3" w:name="_Toc229745826"/>
       <w:r>
         <w:t>Az EAN-13 szerepe a termékazonosításban</w:t>
       </w:r>
@@ -3712,7 +3695,7 @@
       <w:pPr>
         <w:pStyle w:val="Cmsor2"/>
       </w:pPr>
-      <w:bookmarkStart w:id="4" w:name="_Toc229670067"/>
+      <w:bookmarkStart w:id="4" w:name="_Toc229745827"/>
       <w:r>
         <w:t>A 13 számjegy felépítése</w:t>
       </w:r>
@@ -3777,7 +3760,7 @@
       <w:pPr>
         <w:pStyle w:val="Cmsor2"/>
       </w:pPr>
-      <w:bookmarkStart w:id="5" w:name="_Toc229670068"/>
+      <w:bookmarkStart w:id="5" w:name="_Toc229745828"/>
       <w:r>
         <w:lastRenderedPageBreak/>
         <w:t>A 95 modulból álló vonalkódszerkezet</w:t>
@@ -3919,7 +3902,7 @@
       <w:pPr>
         <w:pStyle w:val="Cmsor2"/>
       </w:pPr>
-      <w:bookmarkStart w:id="6" w:name="_Toc229670069"/>
+      <w:bookmarkStart w:id="6" w:name="_Toc229745829"/>
       <w:r>
         <w:t>L, G, és R kódolási minták</w:t>
       </w:r>
@@ -3954,7 +3937,7 @@
       <w:pPr>
         <w:pStyle w:val="Cmsor2"/>
       </w:pPr>
-      <w:bookmarkStart w:id="7" w:name="_Toc229670070"/>
+      <w:bookmarkStart w:id="7" w:name="_Toc229745830"/>
       <w:r>
         <w:t>Ellenőrző számjegy és hibafelismerés</w:t>
       </w:r>
@@ -4042,7 +4025,7 @@
       <w:pPr>
         <w:pStyle w:val="Cmsor2"/>
       </w:pPr>
-      <w:bookmarkStart w:id="8" w:name="_Toc229670071"/>
+      <w:bookmarkStart w:id="8" w:name="_Toc229745831"/>
       <w:proofErr w:type="spellStart"/>
       <w:r>
         <w:t>Quiet</w:t>
@@ -4128,7 +4111,7 @@
       <w:pPr>
         <w:pStyle w:val="Cmsor1"/>
       </w:pPr>
-      <w:bookmarkStart w:id="9" w:name="_Toc229670072"/>
+      <w:bookmarkStart w:id="9" w:name="_Toc229745832"/>
       <w:r>
         <w:t>A program fő moduljai</w:t>
       </w:r>
@@ -4157,7 +4140,7 @@
       <w:pPr>
         <w:pStyle w:val="Cmsor2"/>
       </w:pPr>
-      <w:bookmarkStart w:id="10" w:name="_Toc229670073"/>
+      <w:bookmarkStart w:id="10" w:name="_Toc229745833"/>
       <w:r>
         <w:t>main.py</w:t>
       </w:r>
@@ -4183,7 +4166,7 @@
       <w:pPr>
         <w:pStyle w:val="Cmsor2"/>
       </w:pPr>
-      <w:bookmarkStart w:id="11" w:name="_Toc229670074"/>
+      <w:bookmarkStart w:id="11" w:name="_Toc229745834"/>
       <w:r>
         <w:t>barcode_detection.py</w:t>
       </w:r>
@@ -4209,7 +4192,7 @@
       <w:pPr>
         <w:pStyle w:val="Cmsor2"/>
       </w:pPr>
-      <w:bookmarkStart w:id="12" w:name="_Toc229670075"/>
+      <w:bookmarkStart w:id="12" w:name="_Toc229745835"/>
       <w:r>
         <w:t>image_processing.py</w:t>
       </w:r>
@@ -4232,7 +4215,7 @@
       <w:pPr>
         <w:pStyle w:val="Cmsor2"/>
       </w:pPr>
-      <w:bookmarkStart w:id="13" w:name="_Toc229670076"/>
+      <w:bookmarkStart w:id="13" w:name="_Toc229745836"/>
       <w:r>
         <w:lastRenderedPageBreak/>
         <w:t>scanline.py</w:t>
@@ -4288,7 +4271,7 @@
       <w:pPr>
         <w:pStyle w:val="Cmsor2"/>
       </w:pPr>
-      <w:bookmarkStart w:id="14" w:name="_Toc229670077"/>
+      <w:bookmarkStart w:id="14" w:name="_Toc229745837"/>
       <w:r>
         <w:t>pattern_decoder.py</w:t>
       </w:r>
@@ -4319,7 +4302,7 @@
       <w:pPr>
         <w:pStyle w:val="Cmsor2"/>
       </w:pPr>
-      <w:bookmarkStart w:id="15" w:name="_Toc229670078"/>
+      <w:bookmarkStart w:id="15" w:name="_Toc229745838"/>
       <w:r>
         <w:t>decoder.py</w:t>
       </w:r>
@@ -4342,7 +4325,7 @@
       <w:pPr>
         <w:pStyle w:val="Cmsor2"/>
       </w:pPr>
-      <w:bookmarkStart w:id="16" w:name="_Toc229670079"/>
+      <w:bookmarkStart w:id="16" w:name="_Toc229745839"/>
       <w:r>
         <w:t>ean13_patterns.py</w:t>
       </w:r>
@@ -4357,7 +4340,7 @@
       <w:pPr>
         <w:pStyle w:val="Cmsor2"/>
       </w:pPr>
-      <w:bookmarkStart w:id="17" w:name="_Toc229670080"/>
+      <w:bookmarkStart w:id="17" w:name="_Toc229745840"/>
       <w:r>
         <w:t>barcode_reader.py</w:t>
       </w:r>
@@ -4396,7 +4379,7 @@
       <w:pPr>
         <w:pStyle w:val="Cmsor2"/>
       </w:pPr>
-      <w:bookmarkStart w:id="18" w:name="_Toc229670081"/>
+      <w:bookmarkStart w:id="18" w:name="_Toc229745841"/>
       <w:r>
         <w:t>stats_report.py</w:t>
       </w:r>
@@ -4419,7 +4402,7 @@
       <w:pPr>
         <w:pStyle w:val="Cmsor1"/>
       </w:pPr>
-      <w:bookmarkStart w:id="19" w:name="_Toc229670082"/>
+      <w:bookmarkStart w:id="19" w:name="_Toc229745842"/>
       <w:r>
         <w:t>Feldolgozási folyamat</w:t>
       </w:r>
@@ -4641,7 +4624,7 @@
       <w:pPr>
         <w:pStyle w:val="Cmsor1"/>
       </w:pPr>
-      <w:bookmarkStart w:id="20" w:name="_Toc229670083"/>
+      <w:bookmarkStart w:id="20" w:name="_Toc229745843"/>
       <w:r>
         <w:t>Előfeldolgozás és ROI detektálás</w:t>
       </w:r>
@@ -4687,22 +4670,14 @@
       </w:r>
       <w:proofErr w:type="spellEnd"/>
       <w:r>
-        <w:t xml:space="preserve">-küszöbölés választja szét az erősebb éleket a háttértől [5], [8]. Ezután morfológiai zárás kapcsolja össze a vonalkód egymáshoz közeli sávjait egy nagyobb blokkszerű területté [6], [8]. A kontúrokból forgatott téglalapok készülnek, majd a program méret, oldalarány és terület alapján </w:t>
-      </w:r>
-      <w:proofErr w:type="spellStart"/>
-      <w:r>
-        <w:t xml:space="preserve">választja </w:t>
-      </w:r>
-      <w:proofErr w:type="spellEnd"/>
-      <w:r>
-        <w:t>ki a legerősebb jelölteket.</w:t>
+        <w:t>-küszöbölés választja szét az erősebb éleket a háttértől [5], [8]. Ezután morfológiai zárás kapcsolja össze a vonalkód egymáshoz közeli sávjait egy nagyobb blokkszerű területté [6], [8]. A kontúrokból forgatott téglalapok készülnek, majd a program méret, oldalarány és terület alapján választja ki a legerősebb jelölteket.</w:t>
       </w:r>
     </w:p>
     <w:p>
       <w:pPr>
         <w:pStyle w:val="Cmsor1"/>
       </w:pPr>
-      <w:bookmarkStart w:id="21" w:name="_Toc229670084"/>
+      <w:bookmarkStart w:id="21" w:name="_Toc229745844"/>
       <w:proofErr w:type="spellStart"/>
       <w:r>
         <w:t>Scanline</w:t>
@@ -4778,7 +4753,7 @@
       <w:pPr>
         <w:pStyle w:val="Cmsor1"/>
       </w:pPr>
-      <w:bookmarkStart w:id="22" w:name="_Toc229670085"/>
+      <w:bookmarkStart w:id="22" w:name="_Toc229745845"/>
       <w:proofErr w:type="spellStart"/>
       <w:r>
         <w:t>Run</w:t>
@@ -4875,7 +4850,7 @@
       <w:pPr>
         <w:pStyle w:val="Cmsor1"/>
       </w:pPr>
-      <w:bookmarkStart w:id="23" w:name="_Toc229670086"/>
+      <w:bookmarkStart w:id="23" w:name="_Toc229745846"/>
       <w:r>
         <w:lastRenderedPageBreak/>
         <w:t>Hibakezelés és bizonytalansági logika</w:t>
@@ -4937,29 +4912,784 @@
       <w:pPr>
         <w:pStyle w:val="Cmsor1"/>
       </w:pPr>
-      <w:bookmarkStart w:id="24" w:name="_Toc229670087"/>
+      <w:bookmarkStart w:id="24" w:name="_Toc229745847"/>
       <w:r>
         <w:t>Statisztika értékelése</w:t>
       </w:r>
       <w:bookmarkEnd w:id="24"/>
     </w:p>
     <w:p>
+      <w:r>
+        <w:t xml:space="preserve">A rendszer kiértékelése 1200 darab termékfotón történt, a DEAL KAIST </w:t>
+      </w:r>
+      <w:proofErr w:type="spellStart"/>
+      <w:r>
+        <w:t>Lab</w:t>
+      </w:r>
+      <w:proofErr w:type="spellEnd"/>
+      <w:r>
+        <w:t xml:space="preserve"> </w:t>
+      </w:r>
+      <w:proofErr w:type="spellStart"/>
+      <w:r>
+        <w:t>Barcode</w:t>
+      </w:r>
+      <w:proofErr w:type="spellEnd"/>
+      <w:r>
+        <w:t xml:space="preserve"> </w:t>
+      </w:r>
+      <w:proofErr w:type="spellStart"/>
+      <w:r>
+        <w:t>Dataset</w:t>
+      </w:r>
+      <w:proofErr w:type="spellEnd"/>
+      <w:r>
+        <w:t xml:space="preserve"> felhasználásával [7], [9]. A tesztelés során minden képhez ismert volt az elvárt EAN-13 kód, mivel ez a fájlnévből kinyerhető volt. Ez tette lehetővé, hogy automatikusan össze lehessen hasonlítani a kapott eredményt a valós</w:t>
+      </w:r>
+      <w:r>
+        <w:t xml:space="preserve"> kóddal, ez alapján pedig a rendszer a három kategória egyikébe sorolta az olvasást: helyes olvasás, hibás olvasás vagy sikertelen </w:t>
+      </w:r>
+      <w:proofErr w:type="spellStart"/>
+      <w:r>
+        <w:t>olvasás.</w:t>
+      </w:r>
+      <w:proofErr w:type="spellEnd"/>
+    </w:p>
+    <w:p>
+      <w:r>
+        <w:t>A mérés eredményei alapján a rendszer 713 képet olvasott be helyesen, 477 esetben nem adott vissza kódot, és 10 esetben adott vissza hibás kódot [9]. Ez százalékosan 59,42% helyes olvasási arányt, 39,75% sikertelen olvasási arányt és 0,83% hibás olvasási arányt jelent.</w:t>
+      </w:r>
+    </w:p>
+    <w:tbl>
+      <w:tblPr>
+        <w:tblStyle w:val="Rcsostblzat"/>
+        <w:tblW w:w="0" w:type="auto"/>
+        <w:tblLook w:val="04A0" w:firstRow="1" w:lastRow="0" w:firstColumn="1" w:lastColumn="0" w:noHBand="0" w:noVBand="1"/>
+      </w:tblPr>
+      <w:tblGrid>
+        <w:gridCol w:w="3020"/>
+        <w:gridCol w:w="3021"/>
+        <w:gridCol w:w="3021"/>
+      </w:tblGrid>
+      <w:tr>
+        <w:tc>
+          <w:tcPr>
+            <w:tcW w:w="3020" w:type="dxa"/>
+          </w:tcPr>
+          <w:p>
+            <w:pPr>
+              <w:rPr>
+                <w:b/>
+                <w:bCs/>
+              </w:rPr>
+            </w:pPr>
+            <w:r>
+              <w:rPr>
+                <w:b/>
+                <w:bCs/>
+              </w:rPr>
+              <w:t>Kategória</w:t>
+            </w:r>
+          </w:p>
+        </w:tc>
+        <w:tc>
+          <w:tcPr>
+            <w:tcW w:w="3021" w:type="dxa"/>
+          </w:tcPr>
+          <w:p>
+            <w:pPr>
+              <w:jc w:val="center"/>
+              <w:rPr>
+                <w:b/>
+                <w:bCs/>
+              </w:rPr>
+            </w:pPr>
+            <w:r>
+              <w:rPr>
+                <w:b/>
+                <w:bCs/>
+              </w:rPr>
+              <w:t>Darabszám</w:t>
+            </w:r>
+          </w:p>
+        </w:tc>
+        <w:tc>
+          <w:tcPr>
+            <w:tcW w:w="3021" w:type="dxa"/>
+          </w:tcPr>
+          <w:p>
+            <w:pPr>
+              <w:jc w:val="center"/>
+              <w:rPr>
+                <w:b/>
+                <w:bCs/>
+              </w:rPr>
+            </w:pPr>
+            <w:r>
+              <w:rPr>
+                <w:b/>
+                <w:bCs/>
+              </w:rPr>
+              <w:t>Arány</w:t>
+            </w:r>
+          </w:p>
+        </w:tc>
+      </w:tr>
+      <w:tr>
+        <w:tc>
+          <w:tcPr>
+            <w:tcW w:w="3020" w:type="dxa"/>
+          </w:tcPr>
+          <w:p>
+            <w:r>
+              <w:t>Helyes olvasás (OK)</w:t>
+            </w:r>
+          </w:p>
+        </w:tc>
+        <w:tc>
+          <w:tcPr>
+            <w:tcW w:w="3021" w:type="dxa"/>
+          </w:tcPr>
+          <w:p>
+            <w:pPr>
+              <w:jc w:val="center"/>
+            </w:pPr>
+            <w:r>
+              <w:t>713</w:t>
+            </w:r>
+          </w:p>
+        </w:tc>
+        <w:tc>
+          <w:tcPr>
+            <w:tcW w:w="3021" w:type="dxa"/>
+          </w:tcPr>
+          <w:p>
+            <w:pPr>
+              <w:jc w:val="center"/>
+            </w:pPr>
+            <w:r>
+              <w:t>59,42%</w:t>
+            </w:r>
+          </w:p>
+        </w:tc>
+      </w:tr>
+      <w:tr>
+        <w:tc>
+          <w:tcPr>
+            <w:tcW w:w="3020" w:type="dxa"/>
+          </w:tcPr>
+          <w:p>
+            <w:r>
+              <w:t>Sikertelen olvasás (HIBA)</w:t>
+            </w:r>
+          </w:p>
+        </w:tc>
+        <w:tc>
+          <w:tcPr>
+            <w:tcW w:w="3021" w:type="dxa"/>
+          </w:tcPr>
+          <w:p>
+            <w:pPr>
+              <w:jc w:val="center"/>
+            </w:pPr>
+            <w:r>
+              <w:t>477</w:t>
+            </w:r>
+          </w:p>
+        </w:tc>
+        <w:tc>
+          <w:tcPr>
+            <w:tcW w:w="3021" w:type="dxa"/>
+          </w:tcPr>
+          <w:p>
+            <w:pPr>
+              <w:jc w:val="center"/>
+            </w:pPr>
+            <w:r>
+              <w:t>39,75%</w:t>
+            </w:r>
+          </w:p>
+        </w:tc>
+      </w:tr>
+      <w:tr>
+        <w:tc>
+          <w:tcPr>
+            <w:tcW w:w="3020" w:type="dxa"/>
+          </w:tcPr>
+          <w:p>
+            <w:r>
+              <w:t>Hibás olvasás (ROSSZ)</w:t>
+            </w:r>
+          </w:p>
+        </w:tc>
+        <w:tc>
+          <w:tcPr>
+            <w:tcW w:w="3021" w:type="dxa"/>
+          </w:tcPr>
+          <w:p>
+            <w:pPr>
+              <w:jc w:val="center"/>
+            </w:pPr>
+            <w:r>
+              <w:t>10</w:t>
+            </w:r>
+          </w:p>
+        </w:tc>
+        <w:tc>
+          <w:tcPr>
+            <w:tcW w:w="3021" w:type="dxa"/>
+          </w:tcPr>
+          <w:p>
+            <w:pPr>
+              <w:jc w:val="center"/>
+            </w:pPr>
+            <w:r>
+              <w:t>0,83%</w:t>
+            </w:r>
+          </w:p>
+        </w:tc>
+      </w:tr>
+      <w:tr>
+        <w:tc>
+          <w:tcPr>
+            <w:tcW w:w="3020" w:type="dxa"/>
+          </w:tcPr>
+          <w:p>
+            <w:r>
+              <w:t>Összesen</w:t>
+            </w:r>
+          </w:p>
+        </w:tc>
+        <w:tc>
+          <w:tcPr>
+            <w:tcW w:w="3021" w:type="dxa"/>
+          </w:tcPr>
+          <w:p>
+            <w:pPr>
+              <w:jc w:val="center"/>
+            </w:pPr>
+            <w:r>
+              <w:t>1200</w:t>
+            </w:r>
+          </w:p>
+        </w:tc>
+        <w:tc>
+          <w:tcPr>
+            <w:tcW w:w="3021" w:type="dxa"/>
+          </w:tcPr>
+          <w:p>
+            <w:pPr>
+              <w:jc w:val="center"/>
+            </w:pPr>
+            <w:r>
+              <w:t>100%</w:t>
+            </w:r>
+          </w:p>
+        </w:tc>
+      </w:tr>
+    </w:tbl>
+    <w:p>
+      <w:r>
+        <w:br/>
+        <w:t>Az eredmények értelmezésénél fontos különbséget tenni a sikertelen és a hibás olvasás között.</w:t>
+      </w:r>
+      <w:r>
+        <w:t xml:space="preserve"> A sikertelen olvasás azt jelenti, hogy a rendszer nem volt elég biztos az eredményben, ezért nem adott vissza kódot. A hibás olvasás ezzel szemben azt jelenti, hogy a rendszer adott vissza egy </w:t>
+      </w:r>
+      <w:proofErr w:type="spellStart"/>
+      <w:r>
+        <w:t>checksum</w:t>
+      </w:r>
+      <w:proofErr w:type="spellEnd"/>
+      <w:r>
+        <w:t>-helyes EAN-13 kódot, de az eltért az elvárt értéktől. Gyakorlati felhasználásban a hibás olvasás veszélyesebb, mert a rendszer ilyenkor látszólag sikeresen működik, mégis rossz terméket azonosít.</w:t>
+      </w:r>
+    </w:p>
+    <w:p>
+      <w:r>
+        <w:t xml:space="preserve">A jelenlegi eredmények alapján a rendszer inkább konzervatív működésű: sok bizonytalan esetet elutasít, viszont alacsonyan tartja a hibás pozitív találatok számát. Ez a vonalkódolvasás szempontjából kedvező kompromisszum, mert a téves azonosítás általában nagyobb kockázatot jelent, mint az, ha a felhasználónak újra kell fotóznia vagy közelebbről </w:t>
+      </w:r>
+      <w:r>
+        <w:t>kell beolvasnia a terméket.</w:t>
+      </w:r>
+    </w:p>
+    <w:p>
       <w:pPr>
         <w:pStyle w:val="Cmsor2"/>
       </w:pPr>
-      <w:bookmarkStart w:id="25" w:name="_Toc229670088"/>
-      <w:r>
+      <w:bookmarkStart w:id="25" w:name="_Toc229745848"/>
+      <w:r>
+        <w:lastRenderedPageBreak/>
         <w:t>Hibakategóriák elemzése</w:t>
       </w:r>
       <w:bookmarkEnd w:id="25"/>
     </w:p>
     <w:p>
+      <w:r>
+        <w:t xml:space="preserve">A 477 sikertelen olvasás három fő kategóriába sorolható [9]. A leggyakoribb hibatípus a </w:t>
+      </w:r>
+      <w:proofErr w:type="spellStart"/>
+      <w:r>
+        <w:rPr>
+          <w:rFonts w:ascii="Consolas" w:hAnsi="Consolas" w:cs="Consolas"/>
+          <w:i/>
+          <w:iCs/>
+        </w:rPr>
+        <w:t>tul_keves_valtas</w:t>
+      </w:r>
+      <w:proofErr w:type="spellEnd"/>
+      <w:r>
+        <w:t>, amely 258 alkalommal fordult elő</w:t>
+      </w:r>
+      <w:r>
+        <w:t xml:space="preserve">, és az összes hiba 54,09%-át adta. Ez azt jelenti, hogy a vizsgált </w:t>
+      </w:r>
+      <w:proofErr w:type="spellStart"/>
+      <w:r>
+        <w:t>scanline</w:t>
+      </w:r>
+      <w:proofErr w:type="spellEnd"/>
+      <w:r>
+        <w:t>-okon nem jelent meg elég fekete-fehér váltás ahhoz, hogy a szabályos EAN-13 mintázatot lehessen felismerni.</w:t>
+      </w:r>
+    </w:p>
+    <w:p>
+      <w:r>
+        <w:t xml:space="preserve">A második leggyakoribb kategória a </w:t>
+      </w:r>
+      <w:proofErr w:type="spellStart"/>
+      <w:r>
+        <w:rPr>
+          <w:rFonts w:ascii="Consolas" w:hAnsi="Consolas" w:cs="Consolas"/>
+          <w:i/>
+          <w:iCs/>
+        </w:rPr>
+        <w:t>bizonytalan_olvasas</w:t>
+      </w:r>
+      <w:proofErr w:type="spellEnd"/>
+      <w:r>
+        <w:t>, amely 207 esetben jelent meg, vagyis a hibás 43,40%-</w:t>
+      </w:r>
+      <w:proofErr w:type="spellStart"/>
+      <w:r>
+        <w:t>átt</w:t>
+      </w:r>
+      <w:proofErr w:type="spellEnd"/>
+      <w:r>
+        <w:t xml:space="preserve"> tette ki.</w:t>
+      </w:r>
+      <w:r>
+        <w:t xml:space="preserve"> Ebben az esetben a rendszer talált </w:t>
+      </w:r>
+      <w:proofErr w:type="spellStart"/>
+      <w:r>
+        <w:t>checksum</w:t>
+      </w:r>
+      <w:proofErr w:type="spellEnd"/>
+      <w:r>
+        <w:t xml:space="preserve">-helyes jelölteket, de azok nem kaptak elég erős támogatást, vagy több eltérő jelölt egymáshoz túl közeli pontszámot kapott. A harmadik kategória a </w:t>
+      </w:r>
+      <w:proofErr w:type="spellStart"/>
+      <w:r>
+        <w:rPr>
+          <w:rFonts w:ascii="Consolas" w:hAnsi="Consolas" w:cs="Consolas"/>
+          <w:i/>
+          <w:iCs/>
+        </w:rPr>
+        <w:t>nem_talalt_roi</w:t>
+      </w:r>
+      <w:proofErr w:type="spellEnd"/>
+      <w:r>
+        <w:t>, amely mindössze 12 esetben fordult elő, vagyis a hibák 2,52%-át jelentette.</w:t>
+      </w:r>
+    </w:p>
+    <w:tbl>
+      <w:tblPr>
+        <w:tblStyle w:val="Rcsostblzat"/>
+        <w:tblW w:w="0" w:type="auto"/>
+        <w:tblLook w:val="04A0" w:firstRow="1" w:lastRow="0" w:firstColumn="1" w:lastColumn="0" w:noHBand="0" w:noVBand="1"/>
+      </w:tblPr>
+      <w:tblGrid>
+        <w:gridCol w:w="2724"/>
+        <w:gridCol w:w="1447"/>
+        <w:gridCol w:w="1778"/>
+        <w:gridCol w:w="3113"/>
+      </w:tblGrid>
+      <w:tr>
+        <w:tc>
+          <w:tcPr>
+            <w:tcW w:w="2724" w:type="dxa"/>
+          </w:tcPr>
+          <w:p>
+            <w:pPr>
+              <w:rPr>
+                <w:b/>
+                <w:bCs/>
+              </w:rPr>
+            </w:pPr>
+            <w:r>
+              <w:rPr>
+                <w:b/>
+                <w:bCs/>
+              </w:rPr>
+              <w:t>Hibakategória</w:t>
+            </w:r>
+          </w:p>
+        </w:tc>
+        <w:tc>
+          <w:tcPr>
+            <w:tcW w:w="1447" w:type="dxa"/>
+          </w:tcPr>
+          <w:p>
+            <w:pPr>
+              <w:jc w:val="center"/>
+              <w:rPr>
+                <w:b/>
+                <w:bCs/>
+              </w:rPr>
+            </w:pPr>
+            <w:r>
+              <w:rPr>
+                <w:b/>
+                <w:bCs/>
+              </w:rPr>
+              <w:t>Darabszám</w:t>
+            </w:r>
+          </w:p>
+        </w:tc>
+        <w:tc>
+          <w:tcPr>
+            <w:tcW w:w="1778" w:type="dxa"/>
+          </w:tcPr>
+          <w:p>
+            <w:pPr>
+              <w:jc w:val="center"/>
+              <w:rPr>
+                <w:b/>
+                <w:bCs/>
+              </w:rPr>
+            </w:pPr>
+            <w:r>
+              <w:rPr>
+                <w:b/>
+                <w:bCs/>
+              </w:rPr>
+              <w:t>Arány a hibákon belül</w:t>
+            </w:r>
+          </w:p>
+        </w:tc>
+        <w:tc>
+          <w:tcPr>
+            <w:tcW w:w="3113" w:type="dxa"/>
+          </w:tcPr>
+          <w:p>
+            <w:pPr>
+              <w:rPr>
+                <w:b/>
+                <w:bCs/>
+              </w:rPr>
+            </w:pPr>
+            <w:r>
+              <w:rPr>
+                <w:b/>
+                <w:bCs/>
+              </w:rPr>
+              <w:t>Értelmezés</w:t>
+            </w:r>
+          </w:p>
+        </w:tc>
+      </w:tr>
+      <w:tr>
+        <w:tc>
+          <w:tcPr>
+            <w:tcW w:w="2724" w:type="dxa"/>
+          </w:tcPr>
+          <w:p>
+            <w:pPr>
+              <w:rPr>
+                <w:rFonts w:ascii="Consolas" w:hAnsi="Consolas" w:cs="Consolas"/>
+                <w:i/>
+                <w:iCs/>
+              </w:rPr>
+            </w:pPr>
+            <w:proofErr w:type="spellStart"/>
+            <w:r>
+              <w:rPr>
+                <w:rFonts w:ascii="Consolas" w:hAnsi="Consolas" w:cs="Consolas"/>
+                <w:i/>
+                <w:iCs/>
+              </w:rPr>
+              <w:t>tul_keves_valtas</w:t>
+            </w:r>
+            <w:proofErr w:type="spellEnd"/>
+          </w:p>
+        </w:tc>
+        <w:tc>
+          <w:tcPr>
+            <w:tcW w:w="1447" w:type="dxa"/>
+          </w:tcPr>
+          <w:p>
+            <w:pPr>
+              <w:jc w:val="center"/>
+            </w:pPr>
+            <w:r>
+              <w:t>258</w:t>
+            </w:r>
+          </w:p>
+        </w:tc>
+        <w:tc>
+          <w:tcPr>
+            <w:tcW w:w="1778" w:type="dxa"/>
+          </w:tcPr>
+          <w:p>
+            <w:pPr>
+              <w:jc w:val="center"/>
+            </w:pPr>
+            <w:r>
+              <w:t>54,09%</w:t>
+            </w:r>
+          </w:p>
+        </w:tc>
+        <w:tc>
+          <w:tcPr>
+            <w:tcW w:w="3113" w:type="dxa"/>
+          </w:tcPr>
+          <w:p>
+            <w:r>
+              <w:t xml:space="preserve">A </w:t>
+            </w:r>
+            <w:proofErr w:type="spellStart"/>
+            <w:r>
+              <w:t>scanline</w:t>
+            </w:r>
+            <w:proofErr w:type="spellEnd"/>
+            <w:r>
+              <w:t xml:space="preserve"> nem tartalmaz elég stabil fekete-fehér átmenetet.</w:t>
+            </w:r>
+          </w:p>
+        </w:tc>
+      </w:tr>
+      <w:tr>
+        <w:tc>
+          <w:tcPr>
+            <w:tcW w:w="2724" w:type="dxa"/>
+          </w:tcPr>
+          <w:p>
+            <w:pPr>
+              <w:rPr>
+                <w:rFonts w:ascii="Consolas" w:hAnsi="Consolas" w:cs="Consolas"/>
+                <w:i/>
+                <w:iCs/>
+              </w:rPr>
+            </w:pPr>
+            <w:proofErr w:type="spellStart"/>
+            <w:r>
+              <w:rPr>
+                <w:rFonts w:ascii="Consolas" w:hAnsi="Consolas" w:cs="Consolas"/>
+                <w:i/>
+                <w:iCs/>
+              </w:rPr>
+              <w:t>bizonytalan_olvasas</w:t>
+            </w:r>
+            <w:proofErr w:type="spellEnd"/>
+          </w:p>
+        </w:tc>
+        <w:tc>
+          <w:tcPr>
+            <w:tcW w:w="1447" w:type="dxa"/>
+          </w:tcPr>
+          <w:p>
+            <w:pPr>
+              <w:jc w:val="center"/>
+            </w:pPr>
+            <w:r>
+              <w:t>207</w:t>
+            </w:r>
+          </w:p>
+        </w:tc>
+        <w:tc>
+          <w:tcPr>
+            <w:tcW w:w="1778" w:type="dxa"/>
+          </w:tcPr>
+          <w:p>
+            <w:pPr>
+              <w:jc w:val="center"/>
+            </w:pPr>
+            <w:r>
+              <w:t>43,40%</w:t>
+            </w:r>
+          </w:p>
+        </w:tc>
+        <w:tc>
+          <w:tcPr>
+            <w:tcW w:w="3113" w:type="dxa"/>
+          </w:tcPr>
+          <w:p>
+            <w:r>
+              <w:t>Van jelölt, de nem elég domináns vagy nem kap elég támogatást.</w:t>
+            </w:r>
+          </w:p>
+        </w:tc>
+      </w:tr>
+      <w:tr>
+        <w:tc>
+          <w:tcPr>
+            <w:tcW w:w="2724" w:type="dxa"/>
+          </w:tcPr>
+          <w:p>
+            <w:pPr>
+              <w:rPr>
+                <w:rFonts w:ascii="Consolas" w:hAnsi="Consolas" w:cs="Consolas"/>
+                <w:i/>
+                <w:iCs/>
+              </w:rPr>
+            </w:pPr>
+            <w:proofErr w:type="spellStart"/>
+            <w:r>
+              <w:rPr>
+                <w:rFonts w:ascii="Consolas" w:hAnsi="Consolas" w:cs="Consolas"/>
+                <w:i/>
+                <w:iCs/>
+              </w:rPr>
+              <w:t>nem_talalt_roi</w:t>
+            </w:r>
+            <w:proofErr w:type="spellEnd"/>
+          </w:p>
+        </w:tc>
+        <w:tc>
+          <w:tcPr>
+            <w:tcW w:w="1447" w:type="dxa"/>
+          </w:tcPr>
+          <w:p>
+            <w:pPr>
+              <w:jc w:val="center"/>
+            </w:pPr>
+            <w:r>
+              <w:t>12</w:t>
+            </w:r>
+          </w:p>
+        </w:tc>
+        <w:tc>
+          <w:tcPr>
+            <w:tcW w:w="1778" w:type="dxa"/>
+          </w:tcPr>
+          <w:p>
+            <w:pPr>
+              <w:jc w:val="center"/>
+            </w:pPr>
+            <w:r>
+              <w:t>2,52%</w:t>
+            </w:r>
+          </w:p>
+        </w:tc>
+        <w:tc>
+          <w:tcPr>
+            <w:tcW w:w="3113" w:type="dxa"/>
+          </w:tcPr>
+          <w:p>
+            <w:r>
+              <w:t>A rendszer nem talált megfelelő vonalkód-gyanús területet.</w:t>
+            </w:r>
+          </w:p>
+        </w:tc>
+      </w:tr>
+    </w:tbl>
+    <w:p>
+      <w:r>
+        <w:br/>
+        <w:t xml:space="preserve">Ez az eloszlás azt mutatja, hogy a rendszer fő problémája már nem elsősorban a vonalkód helyének megtalálása. A </w:t>
+      </w:r>
+      <w:proofErr w:type="spellStart"/>
+      <w:r>
+        <w:rPr>
+          <w:rFonts w:ascii="Consolas" w:hAnsi="Consolas" w:cs="Consolas"/>
+          <w:i/>
+          <w:iCs/>
+        </w:rPr>
+        <w:t>nem_talalt_roi</w:t>
+      </w:r>
+      <w:proofErr w:type="spellEnd"/>
+      <w:r>
+        <w:t xml:space="preserve"> aránya alacsony, tehát a ROI detektálás a legtöbb képen legalább valamilyen használható jelöltet előállít. A hibák nagyobb része inkább a ROI-n belüli dekódolási stabilitáshoz kapcsolódik: a kivágott részben a vonalkód vagy túl ferde, túl elmosódott, túl kis felbontású, vagy a </w:t>
+      </w:r>
+      <w:proofErr w:type="spellStart"/>
+      <w:r>
+        <w:t>scanline</w:t>
+      </w:r>
+      <w:proofErr w:type="spellEnd"/>
+      <w:r>
+        <w:t xml:space="preserve"> nem a sávokra merőlegesen halad át.</w:t>
+      </w:r>
+    </w:p>
+    <w:p>
+      <w:r>
+        <w:t xml:space="preserve">A </w:t>
+      </w:r>
+      <w:proofErr w:type="spellStart"/>
+      <w:r>
+        <w:rPr>
+          <w:rFonts w:ascii="Consolas" w:hAnsi="Consolas" w:cs="Consolas"/>
+          <w:i/>
+          <w:iCs/>
+        </w:rPr>
+        <w:t>tul_keves_valtas</w:t>
+      </w:r>
+      <w:proofErr w:type="spellEnd"/>
+      <w:r>
+        <w:t xml:space="preserve"> kategória</w:t>
+      </w:r>
+      <w:r>
+        <w:t xml:space="preserve"> különösen fontos, mert ez gyakran arra utal, hogy a vizsgált sor nem a tényleges vonalkódon halad keresztül, hanem háttéren, szövegen, csomagoláselemeken</w:t>
+      </w:r>
+      <w:r>
+        <w:t>,</w:t>
+      </w:r>
+      <w:r>
+        <w:t xml:space="preserve"> vagy csak a vonalkód egy részén. Ez előfordulhat akkor is, ha a ROI tartalmazza a vonalkódot, de túl nagy területet fog át, és a </w:t>
+      </w:r>
+      <w:proofErr w:type="spellStart"/>
+      <w:r>
+        <w:t>scanline</w:t>
+      </w:r>
+      <w:proofErr w:type="spellEnd"/>
+      <w:r>
+        <w:t>-ok jelentős része nem a hasznos sávokon fut.</w:t>
+      </w:r>
+    </w:p>
+    <w:p>
+      <w:r>
+        <w:t xml:space="preserve">A </w:t>
+      </w:r>
+      <w:proofErr w:type="spellStart"/>
+      <w:r>
+        <w:rPr>
+          <w:rFonts w:ascii="Consolas" w:hAnsi="Consolas" w:cs="Consolas"/>
+          <w:i/>
+          <w:iCs/>
+        </w:rPr>
+        <w:t>bizonytalan_olvasas</w:t>
+      </w:r>
+      <w:proofErr w:type="spellEnd"/>
+      <w:r>
+        <w:t xml:space="preserve"> kategória már egy fejlettebb hibakezelési állapot. Ilyenkor a rendszer nem teljesen sikertelen, mert talál lehetséges EAN-13 jelölteket. Azonban a </w:t>
+      </w:r>
+      <w:proofErr w:type="spellStart"/>
+      <w:r>
+        <w:t>score</w:t>
+      </w:r>
+      <w:proofErr w:type="spellEnd"/>
+      <w:r>
+        <w:t>, a találatszám vagy az alternatív jelöltek közelsége alapján nem tekinti biztonságosnak az eredményt. Ez a kategória részben a hamis pozitívok elleni védelem következménye, és tudatosan vállalt kompromisszum.</w:t>
+      </w:r>
+    </w:p>
+    <w:p>
       <w:pPr>
         <w:pStyle w:val="Cmsor2"/>
       </w:pPr>
-      <w:bookmarkStart w:id="26" w:name="_Toc229670089"/>
-      <w:proofErr w:type="spellStart"/>
-      <w:r>
+      <w:bookmarkStart w:id="26" w:name="_Toc229745849"/>
+      <w:proofErr w:type="spellStart"/>
+      <w:r>
+        <w:lastRenderedPageBreak/>
         <w:t>Score</w:t>
       </w:r>
       <w:proofErr w:type="spellEnd"/>
@@ -4969,60 +5699,950 @@
       <w:bookmarkEnd w:id="26"/>
     </w:p>
     <w:p>
+      <w:r>
+        <w:t xml:space="preserve">A statisztika alapján a helyes és hibás olvasások közötti jelentős különbség látható a </w:t>
+      </w:r>
+      <w:proofErr w:type="spellStart"/>
+      <w:r>
+        <w:t>score</w:t>
+      </w:r>
+      <w:proofErr w:type="spellEnd"/>
+      <w:r>
+        <w:t xml:space="preserve"> és a találatszám tekintetében [9]. A helyes olvasások átlagos </w:t>
+      </w:r>
+      <w:proofErr w:type="spellStart"/>
+      <w:r>
+        <w:t>score</w:t>
+      </w:r>
+      <w:proofErr w:type="spellEnd"/>
+      <w:r>
+        <w:t xml:space="preserve"> értéke 757,33, mediánja 503,08 volt. Ezzel szemben a hibás olvasások átlagos </w:t>
+      </w:r>
+      <w:proofErr w:type="spellStart"/>
+      <w:r>
+        <w:t>score</w:t>
+      </w:r>
+      <w:proofErr w:type="spellEnd"/>
+      <w:r>
+        <w:t xml:space="preserve"> értéke csak 26,60, mediánja pedig 18,28 volt.</w:t>
+      </w:r>
+    </w:p>
+    <w:tbl>
+      <w:tblPr>
+        <w:tblStyle w:val="Rcsostblzat"/>
+        <w:tblW w:w="0" w:type="auto"/>
+        <w:tblLook w:val="04A0" w:firstRow="1" w:lastRow="0" w:firstColumn="1" w:lastColumn="0" w:noHBand="0" w:noVBand="1"/>
+      </w:tblPr>
+      <w:tblGrid>
+        <w:gridCol w:w="3020"/>
+        <w:gridCol w:w="3021"/>
+        <w:gridCol w:w="3021"/>
+      </w:tblGrid>
+      <w:tr>
+        <w:tc>
+          <w:tcPr>
+            <w:tcW w:w="3020" w:type="dxa"/>
+          </w:tcPr>
+          <w:p>
+            <w:pPr>
+              <w:rPr>
+                <w:b/>
+                <w:bCs/>
+              </w:rPr>
+            </w:pPr>
+            <w:r>
+              <w:rPr>
+                <w:b/>
+                <w:bCs/>
+              </w:rPr>
+              <w:t>Mutató</w:t>
+            </w:r>
+          </w:p>
+        </w:tc>
+        <w:tc>
+          <w:tcPr>
+            <w:tcW w:w="3021" w:type="dxa"/>
+          </w:tcPr>
+          <w:p>
+            <w:pPr>
+              <w:rPr>
+                <w:b/>
+                <w:bCs/>
+              </w:rPr>
+            </w:pPr>
+            <w:r>
+              <w:rPr>
+                <w:b/>
+                <w:bCs/>
+              </w:rPr>
+              <w:t>Helyes olvasások</w:t>
+            </w:r>
+          </w:p>
+        </w:tc>
+        <w:tc>
+          <w:tcPr>
+            <w:tcW w:w="3021" w:type="dxa"/>
+          </w:tcPr>
+          <w:p>
+            <w:pPr>
+              <w:rPr>
+                <w:b/>
+                <w:bCs/>
+              </w:rPr>
+            </w:pPr>
+            <w:r>
+              <w:rPr>
+                <w:b/>
+                <w:bCs/>
+              </w:rPr>
+              <w:t>Hibás olvasások</w:t>
+            </w:r>
+          </w:p>
+        </w:tc>
+      </w:tr>
+      <w:tr>
+        <w:tc>
+          <w:tcPr>
+            <w:tcW w:w="3020" w:type="dxa"/>
+          </w:tcPr>
+          <w:p>
+            <w:r>
+              <w:t xml:space="preserve">Átlagos </w:t>
+            </w:r>
+            <w:proofErr w:type="spellStart"/>
+            <w:r>
+              <w:t>score</w:t>
+            </w:r>
+            <w:proofErr w:type="spellEnd"/>
+          </w:p>
+        </w:tc>
+        <w:tc>
+          <w:tcPr>
+            <w:tcW w:w="3021" w:type="dxa"/>
+          </w:tcPr>
+          <w:p>
+            <w:r>
+              <w:t>757,33</w:t>
+            </w:r>
+          </w:p>
+        </w:tc>
+        <w:tc>
+          <w:tcPr>
+            <w:tcW w:w="3021" w:type="dxa"/>
+          </w:tcPr>
+          <w:p>
+            <w:r>
+              <w:t>26,60</w:t>
+            </w:r>
+          </w:p>
+        </w:tc>
+      </w:tr>
+      <w:tr>
+        <w:tc>
+          <w:tcPr>
+            <w:tcW w:w="3020" w:type="dxa"/>
+          </w:tcPr>
+          <w:p>
+            <w:r>
+              <w:t xml:space="preserve">Medián </w:t>
+            </w:r>
+            <w:proofErr w:type="spellStart"/>
+            <w:r>
+              <w:t>score</w:t>
+            </w:r>
+            <w:proofErr w:type="spellEnd"/>
+          </w:p>
+        </w:tc>
+        <w:tc>
+          <w:tcPr>
+            <w:tcW w:w="3021" w:type="dxa"/>
+          </w:tcPr>
+          <w:p>
+            <w:r>
+              <w:t>503,08</w:t>
+            </w:r>
+          </w:p>
+        </w:tc>
+        <w:tc>
+          <w:tcPr>
+            <w:tcW w:w="3021" w:type="dxa"/>
+          </w:tcPr>
+          <w:p>
+            <w:r>
+              <w:t>18,28</w:t>
+            </w:r>
+          </w:p>
+        </w:tc>
+      </w:tr>
+      <w:tr>
+        <w:tc>
+          <w:tcPr>
+            <w:tcW w:w="3020" w:type="dxa"/>
+          </w:tcPr>
+          <w:p>
+            <w:r>
+              <w:t>Átlagos találatszám</w:t>
+            </w:r>
+          </w:p>
+        </w:tc>
+        <w:tc>
+          <w:tcPr>
+            <w:tcW w:w="3021" w:type="dxa"/>
+          </w:tcPr>
+          <w:p>
+            <w:r>
+              <w:t>935,91</w:t>
+            </w:r>
+          </w:p>
+        </w:tc>
+        <w:tc>
+          <w:tcPr>
+            <w:tcW w:w="3021" w:type="dxa"/>
+          </w:tcPr>
+          <w:p>
+            <w:r>
+              <w:t>33,90</w:t>
+            </w:r>
+          </w:p>
+        </w:tc>
+      </w:tr>
+      <w:tr>
+        <w:tc>
+          <w:tcPr>
+            <w:tcW w:w="3020" w:type="dxa"/>
+          </w:tcPr>
+          <w:p>
+            <w:r>
+              <w:t>Medián találatszám</w:t>
+            </w:r>
+          </w:p>
+        </w:tc>
+        <w:tc>
+          <w:tcPr>
+            <w:tcW w:w="3021" w:type="dxa"/>
+          </w:tcPr>
+          <w:p>
+            <w:r>
+              <w:t>645,00</w:t>
+            </w:r>
+          </w:p>
+        </w:tc>
+        <w:tc>
+          <w:tcPr>
+            <w:tcW w:w="3021" w:type="dxa"/>
+          </w:tcPr>
+          <w:p>
+            <w:r>
+              <w:t>24,00</w:t>
+            </w:r>
+          </w:p>
+        </w:tc>
+      </w:tr>
+    </w:tbl>
+    <w:p>
+      <w:r>
+        <w:br/>
+        <w:t xml:space="preserve">Ez az eltérés arra utal, hogy a </w:t>
+      </w:r>
+      <w:proofErr w:type="spellStart"/>
+      <w:r>
+        <w:t>score</w:t>
+      </w:r>
+      <w:proofErr w:type="spellEnd"/>
+      <w:r>
+        <w:t xml:space="preserve"> és a találatszám jól használható megbízhatósági mutató. A helyes olvasásoknál jellemzően sok </w:t>
+      </w:r>
+      <w:proofErr w:type="spellStart"/>
+      <w:r>
+        <w:t>scanline</w:t>
+      </w:r>
+      <w:proofErr w:type="spellEnd"/>
+      <w:r>
+        <w:t xml:space="preserve"> ugyanazt a kódot támogatja, míg a hibás olvasásoknál kevés sorból és alacsony pontszámból áll össze a találat.</w:t>
+      </w:r>
+    </w:p>
+    <w:p>
+      <w:r>
+        <w:t xml:space="preserve">A medián értékek különösen beszédesek, a helyes olvasások medián találatszáma 654, míg a hibás olvasásokél 24. Ez azt jelenti, hogy egy tipikus helyes beolvasást több száz </w:t>
+      </w:r>
+      <w:proofErr w:type="spellStart"/>
+      <w:r>
+        <w:t>scanline</w:t>
+      </w:r>
+      <w:proofErr w:type="spellEnd"/>
+      <w:r>
+        <w:t xml:space="preserve"> támaszt alá, míg egy tipikus hibás olvasást csak néhány tucat. Ez alapján további biztonsági szabályként alkalmazható lenne egy minimális találatszám vagy </w:t>
+      </w:r>
+      <w:proofErr w:type="spellStart"/>
+      <w:r>
+        <w:t>score</w:t>
+      </w:r>
+      <w:proofErr w:type="spellEnd"/>
+      <w:r>
+        <w:t>-határ, különösen azoknál az eseteknél, ahol csak egy módszercsalád támogatja a jelöltet.</w:t>
+      </w:r>
+    </w:p>
+    <w:p>
+      <w:r>
+        <w:t xml:space="preserve">A </w:t>
+      </w:r>
+      <w:proofErr w:type="spellStart"/>
+      <w:r>
+        <w:t>score</w:t>
+      </w:r>
+      <w:proofErr w:type="spellEnd"/>
+      <w:r>
+        <w:t xml:space="preserve">-ok közötti különbség ugyanakkor nem jelenti azt, hogy minden alacsony </w:t>
+      </w:r>
+      <w:proofErr w:type="spellStart"/>
+      <w:r>
+        <w:t>score</w:t>
+      </w:r>
+      <w:proofErr w:type="spellEnd"/>
+      <w:r>
+        <w:t xml:space="preserve"> hibás lenne. A tesztben előfordultak alacsony </w:t>
+      </w:r>
+      <w:proofErr w:type="spellStart"/>
+      <w:r>
+        <w:t>score</w:t>
+      </w:r>
+      <w:proofErr w:type="spellEnd"/>
+      <w:r>
+        <w:t xml:space="preserve">-ú, de helyes olvasások is. Ezért a </w:t>
+      </w:r>
+      <w:proofErr w:type="spellStart"/>
+      <w:r>
+        <w:t>score</w:t>
+      </w:r>
+      <w:proofErr w:type="spellEnd"/>
+      <w:r>
+        <w:t xml:space="preserve"> önmagában nem elegendő döntési feltétel. Megbízhatóbb eredményt ad, ha a rendszer egyszerre veszi figyelembe a </w:t>
+      </w:r>
+      <w:proofErr w:type="spellStart"/>
+      <w:r>
+        <w:t>score</w:t>
+      </w:r>
+      <w:proofErr w:type="spellEnd"/>
+      <w:r>
+        <w:t xml:space="preserve">-t, a találatszámot, a módszerek sokféleségét, valamint az alternatív jelöltek </w:t>
+      </w:r>
+      <w:proofErr w:type="spellStart"/>
+      <w:r>
+        <w:t>pontszámát</w:t>
+      </w:r>
+      <w:proofErr w:type="spellEnd"/>
+      <w:r>
+        <w:t>.</w:t>
+      </w:r>
+    </w:p>
+    <w:p>
       <w:pPr>
         <w:pStyle w:val="Cmsor2"/>
       </w:pPr>
-      <w:bookmarkStart w:id="27" w:name="_Toc229670090"/>
+      <w:bookmarkStart w:id="27" w:name="_Toc229745850"/>
       <w:r>
         <w:t>A hibás olvasások jelentősége</w:t>
       </w:r>
       <w:bookmarkEnd w:id="27"/>
     </w:p>
     <w:p>
+      <w:r>
+        <w:t xml:space="preserve">A 10 hibás olvasás külön elemzést igényel, mert ezek képviselik a rendszer legkritikusabb hibáit [9]. A hibás olvasások közös jellemzője, hogy a program olyan mintázatot talált, amely megfelelt az EAN-13 </w:t>
+      </w:r>
+      <w:proofErr w:type="spellStart"/>
+      <w:r>
+        <w:t>checksum</w:t>
+      </w:r>
+      <w:proofErr w:type="spellEnd"/>
+      <w:r>
+        <w:t xml:space="preserve"> szabályának, de nem a képen szereplő tényleges vonalkódot adta vissza.</w:t>
+      </w:r>
+    </w:p>
+    <w:p>
+      <w:r>
+        <w:t xml:space="preserve">A statisztikában több hibás esetnél látható, hogy a találatot viszonylag kevés </w:t>
+      </w:r>
+      <w:proofErr w:type="spellStart"/>
+      <w:r>
+        <w:t>scanline</w:t>
+      </w:r>
+      <w:proofErr w:type="spellEnd"/>
+      <w:r>
+        <w:t xml:space="preserve"> támogatta. Például egyes hibás olvasásokn</w:t>
+      </w:r>
+      <w:r>
+        <w:t>á</w:t>
+      </w:r>
+      <w:r>
+        <w:t xml:space="preserve">l 12, 14, 24 vagy 32 találat szerepel, miközben a helyes olvasásoknál </w:t>
+      </w:r>
+      <w:r>
+        <w:t>a tipikus találatszám több száz.</w:t>
+      </w:r>
+      <w:r>
+        <w:t xml:space="preserve"> Ez arra utal, hogy ezek a hibák gyakran lokális, véletlenszerű mintázatokból, szövegből, táblázatból, grafikai elemből vagy részleges vonalkód-szakaszból keletkeznek.</w:t>
+      </w:r>
+    </w:p>
+    <w:p>
+      <w:r>
+        <w:t xml:space="preserve">Külön figyelmet érdemelnek azok az esetek, ahol a hibás olvasás magasabb </w:t>
+      </w:r>
+      <w:proofErr w:type="spellStart"/>
+      <w:r>
+        <w:t>score</w:t>
+      </w:r>
+      <w:proofErr w:type="spellEnd"/>
+      <w:r>
+        <w:t xml:space="preserve">-t kapott, például 40-60 körüli értéket. Ezek nem egyszerű zajból származó hibák, hanem olyan képrészletek, amelyek több </w:t>
+      </w:r>
+      <w:proofErr w:type="spellStart"/>
+      <w:r>
+        <w:t>scanline-on</w:t>
+      </w:r>
+      <w:proofErr w:type="spellEnd"/>
+      <w:r>
+        <w:t xml:space="preserve"> is hasonló, de téves mintát </w:t>
+      </w:r>
+      <w:r>
+        <w:lastRenderedPageBreak/>
+        <w:t xml:space="preserve">eredményeztek. Ilyen esetben a további fejlesztésnek nemcsak </w:t>
+      </w:r>
+      <w:proofErr w:type="spellStart"/>
+      <w:r>
+        <w:t>score</w:t>
+      </w:r>
+      <w:proofErr w:type="spellEnd"/>
+      <w:r>
+        <w:t xml:space="preserve"> küszöböt kell növelnie, hanem a térbeli konzisztenciát is vizsgálnia kell, azaz valóban ugyanabból a vonalkódterületből származnak-e a találatok, szabályos-e a sávok geometriája, és megfelelő-e a </w:t>
+      </w:r>
+      <w:proofErr w:type="spellStart"/>
+      <w:r>
+        <w:t>quiet</w:t>
+      </w:r>
+      <w:proofErr w:type="spellEnd"/>
+      <w:r>
+        <w:t xml:space="preserve"> </w:t>
+      </w:r>
+      <w:proofErr w:type="spellStart"/>
+      <w:r>
+        <w:t>zone</w:t>
+      </w:r>
+      <w:proofErr w:type="spellEnd"/>
+      <w:r>
+        <w:t xml:space="preserve"> a vonalkód két oldalán.</w:t>
+      </w:r>
+    </w:p>
+    <w:p>
+      <w:r>
+        <w:t>A hibás olvasások aránya alacsony, mindössze 0,83%-os eredménye kedvező, de dokumentáció szempontjából fontos megemlíteni</w:t>
+      </w:r>
+      <w:r>
+        <w:t xml:space="preserve">, hogy ez a legkritikusabb hibacsoport. Egy automatikus rendszerben egy sikertelen olvasás könnyen kezelhető </w:t>
+      </w:r>
+      <w:proofErr w:type="spellStart"/>
+      <w:r>
+        <w:t>újrapróbálással</w:t>
+      </w:r>
+      <w:proofErr w:type="spellEnd"/>
+      <w:r>
+        <w:t>, míg egy hibás olvasás téves adatbevitelhez vezethet.</w:t>
+      </w:r>
+    </w:p>
+    <w:p>
       <w:pPr>
         <w:pStyle w:val="Cmsor2"/>
       </w:pPr>
-      <w:bookmarkStart w:id="28" w:name="_Toc229670091"/>
+      <w:bookmarkStart w:id="28" w:name="_Toc229745851"/>
       <w:r>
         <w:t>Módszercsaládok szerepe</w:t>
       </w:r>
       <w:bookmarkEnd w:id="28"/>
     </w:p>
     <w:p>
+      <w:r>
+        <w:t xml:space="preserve">A statisztika külön gyűjti, hogy mely </w:t>
+      </w:r>
+      <w:proofErr w:type="spellStart"/>
+      <w:r>
+        <w:t>binarizálási</w:t>
+      </w:r>
+      <w:proofErr w:type="spellEnd"/>
+      <w:r>
+        <w:t xml:space="preserve"> és dekódolási módszerek járultak hozzá a találatokhoz [9]. A legtöbb találat az </w:t>
+      </w:r>
+      <w:proofErr w:type="spellStart"/>
+      <w:r>
+        <w:t>Otsu</w:t>
+      </w:r>
+      <w:proofErr w:type="spellEnd"/>
+      <w:r>
+        <w:t xml:space="preserve"> küszöböléshez és a </w:t>
+      </w:r>
+      <w:proofErr w:type="spellStart"/>
+      <w:r>
+        <w:t>run</w:t>
+      </w:r>
+      <w:proofErr w:type="spellEnd"/>
+      <w:r>
+        <w:t xml:space="preserve">-alapú dekódoláshoz kapcsolódott. Különösen erős volt a </w:t>
+      </w:r>
+      <w:r>
+        <w:rPr>
+          <w:rFonts w:ascii="Consolas" w:hAnsi="Consolas" w:cs="Consolas"/>
+          <w:i/>
+          <w:iCs/>
+        </w:rPr>
+        <w:t>roi0/</w:t>
+      </w:r>
+      <w:proofErr w:type="spellStart"/>
+      <w:r>
+        <w:rPr>
+          <w:rFonts w:ascii="Consolas" w:hAnsi="Consolas" w:cs="Consolas"/>
+          <w:i/>
+          <w:iCs/>
+        </w:rPr>
+        <w:t>otsu</w:t>
+      </w:r>
+      <w:proofErr w:type="spellEnd"/>
+      <w:r>
+        <w:t xml:space="preserve"> és </w:t>
+      </w:r>
+      <w:r>
+        <w:rPr>
+          <w:rFonts w:ascii="Consolas" w:hAnsi="Consolas" w:cs="Consolas"/>
+          <w:i/>
+          <w:iCs/>
+        </w:rPr>
+        <w:t>a roi180/</w:t>
+      </w:r>
+      <w:proofErr w:type="spellStart"/>
+      <w:r>
+        <w:rPr>
+          <w:rFonts w:ascii="Consolas" w:hAnsi="Consolas" w:cs="Consolas"/>
+          <w:i/>
+          <w:iCs/>
+        </w:rPr>
+        <w:t>otsu</w:t>
+      </w:r>
+      <w:proofErr w:type="spellEnd"/>
+      <w:r>
+        <w:t xml:space="preserve"> módszercsalád szerepe.</w:t>
+      </w:r>
+    </w:p>
+    <w:p>
+      <w:r>
+        <w:t>Ez arra utal, hogy a tesztképek jelentős részén a globális küszöbölés elegendő volt a vonalkód sávjainak elkülönítésére. Az adaptív küszöbölés szintén fontos szerepet játszott, főleg a változó megvilágítású vagy árnyékos képeknél. Az invertált módszerek viszont jóval kisebb arányban járultak hozzá a találatokhoz, és a hibás olvasások között is megjelentek. Emiatt az invertált találatok szigorúbb kezelése indokolt.</w:t>
+      </w:r>
+    </w:p>
+    <w:p>
+      <w:r>
+        <w:t xml:space="preserve">A módszercsaládok elemzése azért hasznos, mert nemcsak azt mutatja meg, hogy </w:t>
+      </w:r>
+      <w:proofErr w:type="spellStart"/>
+      <w:r>
+        <w:t>sikerüle</w:t>
+      </w:r>
+      <w:proofErr w:type="spellEnd"/>
+      <w:r>
+        <w:t xml:space="preserve">-e olvasni, hanem azt is, milyen típusú előfeldolgozás bizonyult hatékonynak. Ha egy jelöltet több különböző módszer, több ROI-forgatás és több </w:t>
+      </w:r>
+      <w:proofErr w:type="spellStart"/>
+      <w:r>
+        <w:t>scanline</w:t>
+      </w:r>
+      <w:proofErr w:type="spellEnd"/>
+      <w:r>
+        <w:t xml:space="preserve"> is támogat, akkor az eredmény megbízhatóbb. Ha viszont csak egyetlen módszercsalád ad találatot, különösen alacsony </w:t>
+      </w:r>
+      <w:proofErr w:type="spellStart"/>
+      <w:r>
+        <w:t>score</w:t>
+      </w:r>
+      <w:proofErr w:type="spellEnd"/>
+      <w:r>
+        <w:t xml:space="preserve"> mellett, akkor nagyobb a hamis pozitív kockázata.</w:t>
+      </w:r>
+    </w:p>
+    <w:p>
       <w:pPr>
         <w:pStyle w:val="Cmsor2"/>
       </w:pPr>
-      <w:bookmarkStart w:id="29" w:name="_Toc229670092"/>
+      <w:bookmarkStart w:id="29" w:name="_Toc229745852"/>
       <w:r>
         <w:t>ROI detektálás értékelése</w:t>
       </w:r>
       <w:bookmarkEnd w:id="29"/>
     </w:p>
     <w:p>
+      <w:r>
+        <w:t xml:space="preserve">A </w:t>
+      </w:r>
+      <w:proofErr w:type="spellStart"/>
+      <w:r>
+        <w:rPr>
+          <w:rFonts w:ascii="Consolas" w:hAnsi="Consolas" w:cs="Consolas"/>
+          <w:i/>
+          <w:iCs/>
+        </w:rPr>
+        <w:t>nem_</w:t>
+      </w:r>
+      <w:r>
+        <w:rPr>
+          <w:rFonts w:ascii="Consolas" w:hAnsi="Consolas" w:cs="Consolas"/>
+          <w:i/>
+          <w:iCs/>
+        </w:rPr>
+        <w:t>ta</w:t>
+      </w:r>
+      <w:r>
+        <w:rPr>
+          <w:rFonts w:ascii="Consolas" w:hAnsi="Consolas" w:cs="Consolas"/>
+          <w:i/>
+          <w:iCs/>
+        </w:rPr>
+        <w:t>lalt_roi</w:t>
+      </w:r>
+      <w:proofErr w:type="spellEnd"/>
+      <w:r>
+        <w:t xml:space="preserve"> kategória mindössze 12 esetben jelent meg [9].</w:t>
+      </w:r>
+      <w:r>
+        <w:t xml:space="preserve"> Ez alapján a ROI detektálás a teljes hibamennyiséghez képest viszonylag ritkán bukik el teljesen. Ez pozitív eredmény, mert a korábbi fejlesztési fázisokban a vonalkódterület megtalálása még jelentős problémát okozott</w:t>
+      </w:r>
+      <w:r>
+        <w:t>, különösen oldalra fordított, csomagolásba ágyazott vagy más grafikai elemekkel körülvett vonalkódok esetén.</w:t>
+      </w:r>
+    </w:p>
+    <w:p>
+      <w:r>
+        <w:t xml:space="preserve">Ugyanakkor az alacsony </w:t>
+      </w:r>
+      <w:proofErr w:type="spellStart"/>
+      <w:r>
+        <w:rPr>
+          <w:rFonts w:ascii="Consolas" w:hAnsi="Consolas" w:cs="Consolas"/>
+          <w:i/>
+          <w:iCs/>
+        </w:rPr>
+        <w:t>nem_talalt_roi</w:t>
+      </w:r>
+      <w:proofErr w:type="spellEnd"/>
+      <w:r>
+        <w:t xml:space="preserve"> arány jelenti azt, hogy a ROI-k minden esetben pontosan. A </w:t>
+      </w:r>
+      <w:proofErr w:type="spellStart"/>
+      <w:r>
+        <w:rPr>
+          <w:rFonts w:ascii="Consolas" w:hAnsi="Consolas" w:cs="Consolas"/>
+          <w:i/>
+          <w:iCs/>
+        </w:rPr>
+        <w:t>tul_keves_valtas</w:t>
+      </w:r>
+      <w:proofErr w:type="spellEnd"/>
+      <w:r>
+        <w:t xml:space="preserve"> hibák egy része valószínűleg olyan ROI-</w:t>
+      </w:r>
+      <w:proofErr w:type="spellStart"/>
+      <w:r>
+        <w:t>kból</w:t>
+      </w:r>
+      <w:proofErr w:type="spellEnd"/>
+      <w:r>
+        <w:t xml:space="preserve"> származnak, amelyek tartalmazzák ugyan a vonalkódot, de túl nagyok, túl ferdék vagy nem megfelelően vannak igazítva.</w:t>
+      </w:r>
+    </w:p>
+    <w:p>
+      <w:r>
+        <w:t xml:space="preserve">A jelenlegi rendszer tehát többnyire megtalálja a vonalkód környezetét, de nem mindig képes azt olyan normalizált formára hozni, amelyben a </w:t>
+      </w:r>
+      <w:proofErr w:type="spellStart"/>
+      <w:r>
+        <w:t>scanline</w:t>
+      </w:r>
+      <w:proofErr w:type="spellEnd"/>
+      <w:r>
+        <w:t>-ok stabilan dekódolhatóak.</w:t>
+      </w:r>
+    </w:p>
+    <w:p>
       <w:pPr>
         <w:pStyle w:val="Cmsor1"/>
       </w:pPr>
-      <w:bookmarkStart w:id="30" w:name="_Toc229670093"/>
-      <w:r>
+      <w:bookmarkStart w:id="30" w:name="_Toc229745853"/>
+      <w:r>
+        <w:lastRenderedPageBreak/>
         <w:t>Eredmények értelmezése</w:t>
       </w:r>
       <w:bookmarkEnd w:id="30"/>
     </w:p>
     <w:p>
+      <w:r>
+        <w:t>Az eredmények alapján a rendszer jelenlegi állapota már akár használható kísérleti EAN-13 olvasóként, de nem tekinthető teljesen robosztus, ipari pontosságú megoldásnak</w:t>
+      </w:r>
+      <w:r>
+        <w:t xml:space="preserve"> [9]</w:t>
+      </w:r>
+      <w:r>
+        <w:t>.</w:t>
+      </w:r>
+      <w:r>
+        <w:t xml:space="preserve"> A helyes olvasási arány közel 60%, ami nem ideális, ugyanakkor figyelembe kell venni, hogy a bemeneti képek nem kontrollált körülmények között készültek. A rendszer nem előre kivágott, jó minőségű vonalkódképeket kapott, hanem teljes termékfotókból kellett megtalálnia és értelmeznie a vonalkódot.</w:t>
+      </w:r>
+    </w:p>
+    <w:p>
+      <w:r>
+        <w:t>A legfontosabb pozitív eredmény a hibás olvasások alacsony aránya. A 0,83%-os ROSSZ kategória azt mutatja, hogy a bizonytalansági szabályok nagyrészt jól működnek. A rendszer sok esetben inkább nem ad vissza eredményt, ha az olvasás nem elég megbízható. Ez különösen fontos olyan alkalmazási környezetben, ahol a visszaadott kód alapján automatikus termékazonosítás történik.</w:t>
+      </w:r>
+    </w:p>
+    <w:p>
+      <w:r>
+        <w:t xml:space="preserve">A HIBA kategória magas aránya ugyanakkor azt jelzi, hogy a rendszer érzékeny a képminőségre, a perspektívára és a vonalkód geometriájára. A legtöbb </w:t>
+      </w:r>
+      <w:proofErr w:type="spellStart"/>
+      <w:r>
+        <w:t>hibva</w:t>
+      </w:r>
+      <w:proofErr w:type="spellEnd"/>
+      <w:r>
+        <w:t xml:space="preserve"> nem abból </w:t>
+      </w:r>
+      <w:proofErr w:type="spellStart"/>
+      <w:r>
+        <w:t>fakat</w:t>
+      </w:r>
+      <w:proofErr w:type="spellEnd"/>
+      <w:r>
+        <w:t xml:space="preserve">, hogy a program egyáltalán nem talál vonalkódot, hanem abból, hogy a kivágott területből nem nyerhető ki elég stabil EAN-13 mintázat. Ez alapján a további fejlesztéseknek elsősorban nem a szabványos dekóderlogikára, hanem a képi normalizálásra és a </w:t>
+      </w:r>
+      <w:proofErr w:type="spellStart"/>
+      <w:r>
+        <w:t>scanline</w:t>
+      </w:r>
+      <w:proofErr w:type="spellEnd"/>
+      <w:r>
+        <w:t>-választásra kell koncentrálniuk.</w:t>
+      </w:r>
+    </w:p>
+    <w:p>
+      <w:r>
+        <w:t xml:space="preserve">A mérés azt is megmutatja, hogy a rendszerben alkalmazott többpróbás stratégia hasznos. A különböző forgatások, küszöbölési módszerek, </w:t>
+      </w:r>
+      <w:proofErr w:type="spellStart"/>
+      <w:r>
+        <w:t>scanline</w:t>
+      </w:r>
+      <w:proofErr w:type="spellEnd"/>
+      <w:r>
+        <w:t xml:space="preserve">-magasságok kombinációja sok esetben erős konszenzust eredményez. A helyes találatokra jellemző, hogy több módszer és sok </w:t>
+      </w:r>
+      <w:proofErr w:type="spellStart"/>
+      <w:r>
+        <w:t>scanline</w:t>
+      </w:r>
+      <w:proofErr w:type="spellEnd"/>
+      <w:r>
+        <w:t xml:space="preserve"> ugyanazt az EAN-kódot erősíti meg. Ez a konszenzus-alapú működés a projekt egyik legfontosabb megbízhatósági eleme.</w:t>
+      </w:r>
+    </w:p>
+    <w:p>
+      <w:r>
+        <w:t xml:space="preserve">Összességében az eredmények alapján a rendszer fejlesztési irány egyértelműen meghatározható. A hibás pozitívok további csökkentése mellett a legnagyobb javulás a sikertelen olvasások csökkentéséből várható. Ehhez a vonalkód pontosabb geometriai illesztése, a zajos </w:t>
+      </w:r>
+      <w:proofErr w:type="spellStart"/>
+      <w:r>
+        <w:t>scanline</w:t>
+      </w:r>
+      <w:proofErr w:type="spellEnd"/>
+      <w:r>
+        <w:t>-ok kiszűrése és a perspektíva vagy görbületi kompenzálás szükséges.</w:t>
+      </w:r>
+    </w:p>
+    <w:p>
       <w:pPr>
         <w:pStyle w:val="Cmsor1"/>
       </w:pPr>
-      <w:bookmarkStart w:id="31" w:name="_Toc229670094"/>
+      <w:bookmarkStart w:id="31" w:name="_Toc229745854"/>
       <w:r>
         <w:t>Fejlesztési lehetőségek</w:t>
       </w:r>
       <w:bookmarkEnd w:id="31"/>
     </w:p>
     <w:p>
+      <w:r>
+        <w:t>A statisztikák alapján az alábbi fejlesztési irányok javasolhatóak:</w:t>
+      </w:r>
+    </w:p>
+    <w:p>
+      <w:pPr>
+        <w:pStyle w:val="Listaszerbekezds"/>
+        <w:numPr>
+          <w:ilvl w:val="0"/>
+          <w:numId w:val="5"/>
+        </w:numPr>
+      </w:pPr>
+      <w:r>
+        <w:rPr>
+          <w:b/>
+          <w:bCs/>
+        </w:rPr>
+        <w:t>Perspektíva- és görbekorrekció javítása:</w:t>
+      </w:r>
+      <w:r>
+        <w:t xml:space="preserve"> a csomagolás görbülete miatt a vonalak nem mindig párhuzamosak, ezért jelenlegi téglalap-alapú kivágás nem minden esetben </w:t>
+      </w:r>
+      <w:proofErr w:type="spellStart"/>
+      <w:r>
+        <w:t>elegendő.</w:t>
+      </w:r>
+      <w:proofErr w:type="spellEnd"/>
+    </w:p>
+    <w:p>
+      <w:pPr>
+        <w:pStyle w:val="Listaszerbekezds"/>
+        <w:numPr>
+          <w:ilvl w:val="0"/>
+          <w:numId w:val="5"/>
+        </w:numPr>
+      </w:pPr>
+      <w:r>
+        <w:rPr>
+          <w:b/>
+          <w:bCs/>
+        </w:rPr>
+        <w:t>ROI-n belüli vonalkód-tengely pontosítása:</w:t>
+      </w:r>
+      <w:r>
+        <w:t xml:space="preserve"> a kivágott ROI-n belül külön meg lehetne keresni a tényleges vonalkód sávjainak irányát és középvonalát.</w:t>
+      </w:r>
+    </w:p>
+    <w:p>
+      <w:pPr>
+        <w:pStyle w:val="Listaszerbekezds"/>
+        <w:numPr>
+          <w:ilvl w:val="0"/>
+          <w:numId w:val="5"/>
+        </w:numPr>
+      </w:pPr>
+      <w:r>
+        <w:rPr>
+          <w:b/>
+          <w:bCs/>
+        </w:rPr>
+        <w:lastRenderedPageBreak/>
+        <w:t xml:space="preserve">Dinamikusabb </w:t>
+      </w:r>
+      <w:proofErr w:type="spellStart"/>
+      <w:r>
+        <w:rPr>
+          <w:b/>
+          <w:bCs/>
+        </w:rPr>
+        <w:t>scanline</w:t>
+      </w:r>
+      <w:proofErr w:type="spellEnd"/>
+      <w:r>
+        <w:rPr>
+          <w:b/>
+          <w:bCs/>
+        </w:rPr>
+        <w:t>-választás:</w:t>
+      </w:r>
+      <w:r>
+        <w:t xml:space="preserve"> a jelenlegi egyenletes mintavételezés helyett előnybe lehetne részesíteni azokat a sorokat, ahol sok szabályos fekete-fehér váltás található.</w:t>
+      </w:r>
+    </w:p>
+    <w:p>
+      <w:pPr>
+        <w:pStyle w:val="Listaszerbekezds"/>
+        <w:numPr>
+          <w:ilvl w:val="0"/>
+          <w:numId w:val="5"/>
+        </w:numPr>
+      </w:pPr>
+      <w:r>
+        <w:rPr>
+          <w:b/>
+          <w:bCs/>
+        </w:rPr>
+        <w:t>Hamis pozitívok további szűrése:</w:t>
+      </w:r>
+      <w:r>
+        <w:t xml:space="preserve"> az invertált</w:t>
+      </w:r>
+      <w:r>
+        <w:t>,</w:t>
+      </w:r>
+      <w:r>
+        <w:t xml:space="preserve"> vagy csak egy módszercsalád által támogatott találatoknál még szigorúbb szabályok alkalmazhatóak.</w:t>
+      </w:r>
+    </w:p>
+    <w:p>
+      <w:pPr>
+        <w:pStyle w:val="Listaszerbekezds"/>
+        <w:numPr>
+          <w:ilvl w:val="0"/>
+          <w:numId w:val="5"/>
+        </w:numPr>
+      </w:pPr>
+      <w:r>
+        <w:rPr>
+          <w:b/>
+          <w:bCs/>
+        </w:rPr>
+        <w:t>Kézi vagy automatikus finom ROI vágás:</w:t>
+      </w:r>
+      <w:r>
+        <w:t xml:space="preserve"> dokumentációs és tesztelési célra hasznos lenne összehasonlítani a teljes képes és kézzel kivágott vonalkódos eredményeket.</w:t>
+      </w:r>
+    </w:p>
+    <w:p>
+      <w:pPr>
+        <w:pStyle w:val="Listaszerbekezds"/>
+        <w:numPr>
+          <w:ilvl w:val="0"/>
+          <w:numId w:val="5"/>
+        </w:numPr>
+      </w:pPr>
+      <w:r>
+        <w:rPr>
+          <w:b/>
+          <w:bCs/>
+        </w:rPr>
+        <w:t xml:space="preserve">Külső </w:t>
+      </w:r>
+      <w:proofErr w:type="spellStart"/>
+      <w:r>
+        <w:rPr>
+          <w:b/>
+          <w:bCs/>
+        </w:rPr>
+        <w:t>barcode</w:t>
+      </w:r>
+      <w:proofErr w:type="spellEnd"/>
+      <w:r>
+        <w:rPr>
+          <w:b/>
+          <w:bCs/>
+        </w:rPr>
+        <w:t xml:space="preserve"> könyvtárral való összehasonlítás</w:t>
+      </w:r>
+      <w:r>
+        <w:rPr>
+          <w:b/>
+          <w:bCs/>
+        </w:rPr>
+        <w:t>:</w:t>
+      </w:r>
+      <w:r>
+        <w:t xml:space="preserve"> a saját fejlesztésű rendszer eredményei összevetése egy ipari, nyílt forrású olvasóval.</w:t>
+      </w:r>
+    </w:p>
+    <w:p>
       <w:pPr>
         <w:pStyle w:val="Cmsor1"/>
       </w:pPr>
-      <w:bookmarkStart w:id="32" w:name="_Toc229670095"/>
+      <w:bookmarkStart w:id="32" w:name="_Toc229745855"/>
       <w:r>
         <w:t>Használati leírás</w:t>
       </w:r>
@@ -5039,7 +6659,18 @@
         <w:t>ásként használható.</w:t>
       </w:r>
       <w:r>
-        <w:t xml:space="preserve"> A futtatás előtt aktiválni kell a virtuális környezetet, majd a main.py fájlnak kell átadni egy kép vagy egy teljes mappa helyét.</w:t>
+        <w:t xml:space="preserve"> A futtatás előtt aktiválni kell a virtuális környezetet, majd a </w:t>
+      </w:r>
+      <w:r>
+        <w:rPr>
+          <w:rFonts w:ascii="Consolas" w:hAnsi="Consolas" w:cs="Consolas"/>
+          <w:i/>
+          <w:iCs/>
+        </w:rPr>
+        <w:t>main.py</w:t>
+      </w:r>
+      <w:r>
+        <w:t xml:space="preserve"> fájlnak kell átadni egy kép vagy egy teljes mappa helyét.</w:t>
       </w:r>
       <w:r>
         <w:t xml:space="preserve"> Egyetlen kép feldolgozásakor a program az adott képre próbál EAN-13 kódot olvasni, mappa megadásakor pedig a mappában található képeket dolgozza fel egymás után [8].</w:t>
@@ -5684,8 +7315,18 @@
     <w:p/>
     <w:p>
       <w:r>
-        <w:lastRenderedPageBreak/>
-        <w:t xml:space="preserve">A statisztikai riport külön fájllal készíthető el. A stat_report.py nem módosítja a </w:t>
+        <w:t xml:space="preserve">A statisztikai riport külön fájllal készíthető el. A </w:t>
+      </w:r>
+      <w:r>
+        <w:rPr>
+          <w:rFonts w:ascii="Consolas" w:hAnsi="Consolas" w:cs="Consolas"/>
+          <w:i/>
+          <w:iCs/>
+        </w:rPr>
+        <w:t>stat_report.py</w:t>
+      </w:r>
+      <w:r>
+        <w:t xml:space="preserve"> nem módosítja a </w:t>
       </w:r>
       <w:proofErr w:type="spellStart"/>
       <w:r>
@@ -6908,18 +8549,95 @@
       <w:pPr>
         <w:pStyle w:val="Cmsor1"/>
       </w:pPr>
-      <w:bookmarkStart w:id="33" w:name="_Toc229670096"/>
-      <w:r>
+      <w:bookmarkStart w:id="33" w:name="_Toc229745856"/>
+      <w:r>
+        <w:lastRenderedPageBreak/>
         <w:t>Összegzés</w:t>
       </w:r>
       <w:bookmarkEnd w:id="33"/>
     </w:p>
     <w:p>
+      <w:r>
+        <w:t>A fejlesztett EAN-13 vonalkódolvasó képes nem ideális termékfotókon ROI-</w:t>
+      </w:r>
+      <w:proofErr w:type="spellStart"/>
+      <w:r>
+        <w:t>kat</w:t>
+      </w:r>
+      <w:proofErr w:type="spellEnd"/>
+      <w:r>
+        <w:t xml:space="preserve"> keresni, többféle </w:t>
+      </w:r>
+      <w:proofErr w:type="spellStart"/>
+      <w:r>
+        <w:t>binarizálási</w:t>
+      </w:r>
+      <w:proofErr w:type="spellEnd"/>
+      <w:r>
+        <w:t xml:space="preserve"> módszert kipróbálni, több </w:t>
+      </w:r>
+      <w:proofErr w:type="spellStart"/>
+      <w:r>
+        <w:t>scanline</w:t>
+      </w:r>
+      <w:proofErr w:type="spellEnd"/>
+      <w:r>
+        <w:t xml:space="preserve"> alapján dekódolni, majd a találatokat </w:t>
+      </w:r>
+      <w:proofErr w:type="spellStart"/>
+      <w:r>
+        <w:t>statisztikailag</w:t>
+      </w:r>
+      <w:proofErr w:type="spellEnd"/>
+      <w:r>
+        <w:t xml:space="preserve"> értékelni [8], [9].</w:t>
+      </w:r>
+      <w:r>
+        <w:t xml:space="preserve"> A rendszer nemcsak eredményt ad, hanem részletes </w:t>
+      </w:r>
+      <w:proofErr w:type="spellStart"/>
+      <w:r>
+        <w:t>hibamagyarázatokat</w:t>
+      </w:r>
+      <w:proofErr w:type="spellEnd"/>
+      <w:r>
+        <w:t xml:space="preserve"> és összesített statisztikát is készít.</w:t>
+      </w:r>
+    </w:p>
+    <w:p>
+      <w:r>
+        <w:t>Az 1200 képes teszt alapján a rendszer jelenlegi állapotában 59,42%-os helyes olvasási arányt és 0,83%-os hibás olvasási arányt ért el. A legnagyobb további fejlesztési lehetőség a HIBA kategória csökkentése lehet, különösen a túl kevés fekete-fehér váltás és bizonytalan olvasás kategóriákban.</w:t>
+      </w:r>
+    </w:p>
+    <w:p>
+      <w:pPr>
+        <w:jc w:val="left"/>
+        <w:rPr>
+          <w:rFonts w:asciiTheme="majorHAnsi" w:eastAsiaTheme="majorEastAsia" w:hAnsiTheme="majorHAnsi" w:cstheme="majorBidi"/>
+          <w:color w:val="000000" w:themeColor="text1"/>
+          <w:sz w:val="40"/>
+          <w:szCs w:val="40"/>
+          <w:highlight w:val="lightGray"/>
+        </w:rPr>
+      </w:pPr>
+      <w:r>
+        <w:rPr>
+          <w:highlight w:val="lightGray"/>
+        </w:rPr>
+        <w:br w:type="page"/>
+      </w:r>
+    </w:p>
+    <w:p>
       <w:pPr>
         <w:pStyle w:val="Cmsor1"/>
-      </w:pPr>
-      <w:bookmarkStart w:id="34" w:name="_Toc229670097"/>
-      <w:r>
+        <w:numPr>
+          <w:ilvl w:val="0"/>
+          <w:numId w:val="0"/>
+        </w:numPr>
+      </w:pPr>
+      <w:bookmarkStart w:id="34" w:name="_Toc229745857"/>
+      <w:r>
+        <w:lastRenderedPageBreak/>
         <w:t>Források</w:t>
       </w:r>
       <w:bookmarkEnd w:id="34"/>
@@ -7137,11 +8855,7 @@
       </w:r>
       <w:proofErr w:type="spellEnd"/>
       <w:r>
-        <w:t>. [Online]. Elérhető: https://opencv24-python-</w:t>
-      </w:r>
-      <w:r>
-        <w:lastRenderedPageBreak/>
-        <w:t>tutorials.readthedocs.io/en/latest/py_tutorials/py_imgproc/py_morphological_ops/py_morphological_ops.html. [Hozzáférés: 2026. május 14.]</w:t>
+        <w:t>. [Online]. Elérhető: https://opencv24-python-tutorials.readthedocs.io/en/latest/py_tutorials/py_imgproc/py_morphological_ops/py_morphological_ops.html. [Hozzáférés: 2026. május 14.]</w:t>
       </w:r>
     </w:p>
     <w:p>
@@ -7393,6 +9107,95 @@
 <file path=word/numbering.xml><?xml version="1.0" encoding="utf-8"?>
 <w:numbering xmlns:wpc="http://schemas.microsoft.com/office/word/2010/wordprocessingCanvas" xmlns:cx="http://schemas.microsoft.com/office/drawing/2014/chartex" xmlns:cx1="http://schemas.microsoft.com/office/drawing/2015/9/8/chartex" xmlns:cx2="http://schemas.microsoft.com/office/drawing/2015/10/21/chartex" xmlns:cx3="http://schemas.microsoft.com/office/drawing/2016/5/9/chartex" xmlns:cx4="http://schemas.microsoft.com/office/drawing/2016/5/10/chartex" xmlns:cx5="http://schemas.microsoft.com/office/drawing/2016/5/11/chartex" xmlns:cx6="http://schemas.microsoft.com/office/drawing/2016/5/12/chartex" xmlns:cx7="http://schemas.microsoft.com/office/drawing/2016/5/13/chartex" xmlns:cx8="http://schemas.microsoft.com/office/drawing/2016/5/14/chartex" xmlns:mc="http://schemas.openxmlformats.org/markup-compatibility/2006" xmlns:aink="http://schemas.microsoft.com/office/drawing/2016/ink" xmlns:am3d="http://schemas.microsoft.com/office/drawing/2017/model3d" xmlns:o="urn:schemas-microsoft-com:office:office" xmlns:oel="http://schemas.microsoft.com/office/2019/extlst" xmlns:r="http://schemas.openxmlformats.org/officeDocument/2006/relationships" xmlns:m="http://schemas.openxmlformats.org/officeDocument/2006/math" xmlns:v="urn:schemas-microsoft-com:vml" xmlns:wp14="http://schemas.microsoft.com/office/word/2010/wordprocessingDrawing" xmlns:wp="http://schemas.openxmlformats.org/drawingml/2006/wordprocessingDrawing" xmlns:w10="urn:schemas-microsoft-com:office:word" xmlns:w="http://schemas.openxmlformats.org/wordprocessingml/2006/main" xmlns:w14="http://schemas.microsoft.com/office/word/2010/wordml" xmlns:w15="http://schemas.microsoft.com/office/word/2012/wordml" xmlns:w16cex="http://schemas.microsoft.com/office/word/2018/wordml/cex" xmlns:w16cid="http://schemas.microsoft.com/office/word/2016/wordml/cid" xmlns:w16="http://schemas.microsoft.com/office/word/2018/wordml" xmlns:w16du="http://schemas.microsoft.com/office/word/2023/wordml/word16du" xmlns:w16sdtdh="http://schemas.microsoft.com/office/word/2020/wordml/sdtdatahash" xmlns:w16sdtfl="http://schemas.microsoft.com/office/word/2024/wordml/sdtformatlock" xmlns:w16se="http://schemas.microsoft.com/office/word/2015/wordml/symex" xmlns:wpg="http://schemas.microsoft.com/office/word/2010/wordprocessingGroup" xmlns:wpi="http://schemas.microsoft.com/office/word/2010/wordprocessingInk" xmlns:wne="http://schemas.microsoft.com/office/word/2006/wordml" xmlns:wps="http://schemas.microsoft.com/office/word/2010/wordprocessingShape" mc:Ignorable="w14 w15 w16se w16cid w16 w16cex w16sdtdh w16sdtfl w16du wp14">
   <w:abstractNum w:abstractNumId="0" w15:restartNumberingAfterBreak="0">
+    <w:nsid w:val="01E72B7E"/>
+    <w:multiLevelType w:val="hybridMultilevel"/>
+    <w:tmpl w:val="5922D232"/>
+    <w:lvl w:ilvl="0" w:tplc="040E000F">
+      <w:start w:val="1"/>
+      <w:numFmt w:val="decimal"/>
+      <w:lvlText w:val="%1."/>
+      <w:lvlJc w:val="left"/>
+      <w:pPr>
+        <w:ind w:left="720" w:hanging="360"/>
+      </w:pPr>
+      <w:rPr>
+        <w:rFonts w:hint="default"/>
+      </w:rPr>
+    </w:lvl>
+    <w:lvl w:ilvl="1" w:tplc="040E0019" w:tentative="1">
+      <w:start w:val="1"/>
+      <w:numFmt w:val="lowerLetter"/>
+      <w:lvlText w:val="%2."/>
+      <w:lvlJc w:val="left"/>
+      <w:pPr>
+        <w:ind w:left="1440" w:hanging="360"/>
+      </w:pPr>
+    </w:lvl>
+    <w:lvl w:ilvl="2" w:tplc="040E001B" w:tentative="1">
+      <w:start w:val="1"/>
+      <w:numFmt w:val="lowerRoman"/>
+      <w:lvlText w:val="%3."/>
+      <w:lvlJc w:val="right"/>
+      <w:pPr>
+        <w:ind w:left="2160" w:hanging="180"/>
+      </w:pPr>
+    </w:lvl>
+    <w:lvl w:ilvl="3" w:tplc="040E000F" w:tentative="1">
+      <w:start w:val="1"/>
+      <w:numFmt w:val="decimal"/>
+      <w:lvlText w:val="%4."/>
+      <w:lvlJc w:val="left"/>
+      <w:pPr>
+        <w:ind w:left="2880" w:hanging="360"/>
+      </w:pPr>
+    </w:lvl>
+    <w:lvl w:ilvl="4" w:tplc="040E0019" w:tentative="1">
+      <w:start w:val="1"/>
+      <w:numFmt w:val="lowerLetter"/>
+      <w:lvlText w:val="%5."/>
+      <w:lvlJc w:val="left"/>
+      <w:pPr>
+        <w:ind w:left="3600" w:hanging="360"/>
+      </w:pPr>
+    </w:lvl>
+    <w:lvl w:ilvl="5" w:tplc="040E001B" w:tentative="1">
+      <w:start w:val="1"/>
+      <w:numFmt w:val="lowerRoman"/>
+      <w:lvlText w:val="%6."/>
+      <w:lvlJc w:val="right"/>
+      <w:pPr>
+        <w:ind w:left="4320" w:hanging="180"/>
+      </w:pPr>
+    </w:lvl>
+    <w:lvl w:ilvl="6" w:tplc="040E000F" w:tentative="1">
+      <w:start w:val="1"/>
+      <w:numFmt w:val="decimal"/>
+      <w:lvlText w:val="%7."/>
+      <w:lvlJc w:val="left"/>
+      <w:pPr>
+        <w:ind w:left="5040" w:hanging="360"/>
+      </w:pPr>
+    </w:lvl>
+    <w:lvl w:ilvl="7" w:tplc="040E0019" w:tentative="1">
+      <w:start w:val="1"/>
+      <w:numFmt w:val="lowerLetter"/>
+      <w:lvlText w:val="%8."/>
+      <w:lvlJc w:val="left"/>
+      <w:pPr>
+        <w:ind w:left="5760" w:hanging="360"/>
+      </w:pPr>
+    </w:lvl>
+    <w:lvl w:ilvl="8" w:tplc="040E001B" w:tentative="1">
+      <w:start w:val="1"/>
+      <w:numFmt w:val="lowerRoman"/>
+      <w:lvlText w:val="%9."/>
+      <w:lvlJc w:val="right"/>
+      <w:pPr>
+        <w:ind w:left="6480" w:hanging="180"/>
+      </w:pPr>
+    </w:lvl>
+  </w:abstractNum>
+  <w:abstractNum w:abstractNumId="1" w15:restartNumberingAfterBreak="0">
     <w:nsid w:val="0DD96BF3"/>
     <w:multiLevelType w:val="multilevel"/>
     <w:tmpl w:val="BF9E93B8"/>
@@ -7487,7 +9290,7 @@
       </w:pPr>
     </w:lvl>
   </w:abstractNum>
-  <w:abstractNum w:abstractNumId="1" w15:restartNumberingAfterBreak="0">
+  <w:abstractNum w:abstractNumId="2" w15:restartNumberingAfterBreak="0">
     <w:nsid w:val="2B2E2EA2"/>
     <w:multiLevelType w:val="hybridMultilevel"/>
     <w:tmpl w:val="430A59F8"/>
@@ -7576,7 +9379,7 @@
       </w:pPr>
     </w:lvl>
   </w:abstractNum>
-  <w:abstractNum w:abstractNumId="2" w15:restartNumberingAfterBreak="0">
+  <w:abstractNum w:abstractNumId="3" w15:restartNumberingAfterBreak="0">
     <w:nsid w:val="2B4108A3"/>
     <w:multiLevelType w:val="hybridMultilevel"/>
     <w:tmpl w:val="BBB0FC3E"/>
@@ -7688,7 +9491,7 @@
       </w:rPr>
     </w:lvl>
   </w:abstractNum>
-  <w:abstractNum w:abstractNumId="3" w15:restartNumberingAfterBreak="0">
+  <w:abstractNum w:abstractNumId="4" w15:restartNumberingAfterBreak="0">
     <w:nsid w:val="52EF643F"/>
     <w:multiLevelType w:val="multilevel"/>
     <w:tmpl w:val="040E001D"/>
@@ -7776,16 +9579,19 @@
     </w:lvl>
   </w:abstractNum>
   <w:num w:numId="1" w16cid:durableId="167452213">
-    <w:abstractNumId w:val="0"/>
+    <w:abstractNumId w:val="1"/>
   </w:num>
   <w:num w:numId="2" w16cid:durableId="623315349">
+    <w:abstractNumId w:val="4"/>
+  </w:num>
+  <w:num w:numId="3" w16cid:durableId="522669631">
     <w:abstractNumId w:val="3"/>
   </w:num>
-  <w:num w:numId="3" w16cid:durableId="522669631">
+  <w:num w:numId="4" w16cid:durableId="517891229">
     <w:abstractNumId w:val="2"/>
   </w:num>
-  <w:num w:numId="4" w16cid:durableId="517891229">
-    <w:abstractNumId w:val="1"/>
+  <w:num w:numId="5" w16cid:durableId="465779733">
+    <w:abstractNumId w:val="0"/>
   </w:num>
 </w:numbering>
 </file>
@@ -8987,6 +10793,25 @@
     <w:unhideWhenUsed/>
     <w:rsid w:val="001502D7"/>
   </w:style>
+  <w:style w:type="table" w:styleId="Rcsostblzat">
+    <w:name w:val="Table Grid"/>
+    <w:basedOn w:val="Normltblzat"/>
+    <w:uiPriority w:val="39"/>
+    <w:rsid w:val="003D06F8"/>
+    <w:pPr>
+      <w:spacing w:after="0" w:line="240" w:lineRule="auto"/>
+    </w:pPr>
+    <w:tblPr>
+      <w:tblBorders>
+        <w:top w:val="single" w:sz="4" w:space="0" w:color="auto"/>
+        <w:left w:val="single" w:sz="4" w:space="0" w:color="auto"/>
+        <w:bottom w:val="single" w:sz="4" w:space="0" w:color="auto"/>
+        <w:right w:val="single" w:sz="4" w:space="0" w:color="auto"/>
+        <w:insideH w:val="single" w:sz="4" w:space="0" w:color="auto"/>
+        <w:insideV w:val="single" w:sz="4" w:space="0" w:color="auto"/>
+      </w:tblBorders>
+    </w:tblPr>
+  </w:style>
 </w:styles>
 </file>
 
@@ -9290,7 +11115,7 @@
 </file>
 
 <file path=customXml/itemProps1.xml><?xml version="1.0" encoding="utf-8"?>
-<ds:datastoreItem xmlns:ds="http://schemas.openxmlformats.org/officeDocument/2006/customXml" ds:itemID="{5151E254-5E18-0F4F-AD5D-C3DBEFF84D53}">
+<ds:datastoreItem xmlns:ds="http://schemas.openxmlformats.org/officeDocument/2006/customXml" ds:itemID="{EAEB3E3A-22B7-BA4D-89E6-89AABF299323}">
   <ds:schemaRefs>
     <ds:schemaRef ds:uri="http://schemas.openxmlformats.org/officeDocument/2006/bibliography"/>
   </ds:schemaRefs>

</xml_diff>